<commit_message>
Upload files of the exercise 2.5
</commit_message>
<xml_diff>
--- a/handover/doing/RA1/DCC-IABD_M04_ACT_OBL_02-DOING.docx
+++ b/handover/doing/RA1/DCC-IABD_M04_ACT_OBL_02-DOING.docx
@@ -276,7 +276,7 @@
           <w:noProof/>
         </w:rPr>
         <w:drawing>
-          <wp:anchor distT="0" distB="0" distL="114300" distR="114300" simplePos="0" relativeHeight="251653120" behindDoc="1" locked="0" layoutInCell="1" allowOverlap="1" wp14:anchorId="66831038" wp14:editId="4DF29DE1">
+          <wp:anchor distT="0" distB="0" distL="114300" distR="114300" simplePos="0" relativeHeight="251653120" behindDoc="1" locked="0" layoutInCell="1" allowOverlap="1" wp14:anchorId="66831038" wp14:editId="2D7A3982">
             <wp:simplePos x="0" y="0"/>
             <wp:positionH relativeFrom="column">
               <wp:posOffset>-1076325</wp:posOffset>
@@ -1517,25 +1517,7 @@
         <w:rPr>
           <w:rStyle w:val="Hipervnculo2"/>
         </w:rPr>
-        <w:t>Ver fig</w:t>
-      </w:r>
-      <w:r>
-        <w:rPr>
-          <w:rStyle w:val="Hipervnculo2"/>
-        </w:rPr>
-        <w:t>u</w:t>
-      </w:r>
-      <w:r>
-        <w:rPr>
-          <w:rStyle w:val="Hipervnculo2"/>
-        </w:rPr>
-        <w:t>r</w:t>
-      </w:r>
-      <w:r>
-        <w:rPr>
-          <w:rStyle w:val="Hipervnculo2"/>
-        </w:rPr>
-        <w:t xml:space="preserve">a </w:t>
+        <w:t xml:space="preserve">Ver figura </w:t>
       </w:r>
       <w:r>
         <w:rPr>
@@ -4792,7 +4774,15 @@
         </w:numPr>
       </w:pPr>
       <w:r>
-        <w:t>El cliente interactúa con la plataforma generando órdenes de VENTA. Cada venta representa un flujo salida que impacta directamente en el inventario a través de una relación de detalle (1:N con STOCK), permitiendo auditar qué unidades físicas exactas de qué productos salieron del sistema para atender un pedido.</w:t>
+        <w:t>El cliente interactúa con la plataforma generando órdenes de VENTA. Cada venta representa un flujo salida que impacta directamente en el inventario a través de una relación de detalle (</w:t>
+      </w:r>
+      <w:proofErr w:type="gramStart"/>
+      <w:r>
+        <w:t>1:N</w:t>
+      </w:r>
+      <w:proofErr w:type="gramEnd"/>
+      <w:r>
+        <w:t xml:space="preserve"> con STOCK), permitiendo auditar qué unidades físicas exactas de qué productos salieron del sistema para atender un pedido.</w:t>
       </w:r>
     </w:p>
     <w:p>
@@ -5322,10 +5312,18 @@
         <w:t xml:space="preserve">Se han aplicado los siguientes convenios </w:t>
       </w:r>
       <w:r>
-        <w:t xml:space="preserve">para la </w:t>
-      </w:r>
-      <w:r>
-        <w:t xml:space="preserve"> ingeniería:</w:t>
+        <w:t xml:space="preserve">para </w:t>
+      </w:r>
+      <w:proofErr w:type="gramStart"/>
+      <w:r>
+        <w:t xml:space="preserve">la </w:t>
+      </w:r>
+      <w:r>
+        <w:t xml:space="preserve"> ingeniería</w:t>
+      </w:r>
+      <w:proofErr w:type="gramEnd"/>
+      <w:r>
+        <w:t>:</w:t>
       </w:r>
     </w:p>
     <w:p/>
@@ -5655,7 +5653,15 @@
       </w:r>
       <w:proofErr w:type="spellEnd"/>
       <w:r>
-        <w:t xml:space="preserve"> (VARCHAR(64), NOT NULL)</w:t>
+        <w:t xml:space="preserve"> (</w:t>
+      </w:r>
+      <w:proofErr w:type="gramStart"/>
+      <w:r>
+        <w:t>VARCHAR(</w:t>
+      </w:r>
+      <w:proofErr w:type="gramEnd"/>
+      <w:r>
+        <w:t>64), NOT NULL)</w:t>
       </w:r>
     </w:p>
     <w:p>
@@ -5673,7 +5679,15 @@
         <w:t>slug</w:t>
       </w:r>
       <w:r>
-        <w:t xml:space="preserve"> (VARCHAR(32), UNIQUE, NOT NULL)</w:t>
+        <w:t xml:space="preserve"> (</w:t>
+      </w:r>
+      <w:proofErr w:type="gramStart"/>
+      <w:r>
+        <w:t>VARCHAR(</w:t>
+      </w:r>
+      <w:proofErr w:type="gramEnd"/>
+      <w:r>
+        <w:t>32), UNIQUE, NOT NULL)</w:t>
       </w:r>
     </w:p>
     <w:p>
@@ -5759,7 +5773,15 @@
       </w:r>
       <w:proofErr w:type="spellEnd"/>
       <w:r>
-        <w:t xml:space="preserve"> (VARCHAR(32), UNIQUE, NOT NULL)</w:t>
+        <w:t xml:space="preserve"> (</w:t>
+      </w:r>
+      <w:proofErr w:type="gramStart"/>
+      <w:r>
+        <w:t>VARCHAR(</w:t>
+      </w:r>
+      <w:proofErr w:type="gramEnd"/>
+      <w:r>
+        <w:t>32), UNIQUE, NOT NULL)</w:t>
       </w:r>
     </w:p>
     <w:p>
@@ -5775,7 +5797,15 @@
       </w:r>
       <w:proofErr w:type="spellEnd"/>
       <w:r>
-        <w:t xml:space="preserve"> (VARCHAR(128), NOT NULL)</w:t>
+        <w:t xml:space="preserve"> (</w:t>
+      </w:r>
+      <w:proofErr w:type="gramStart"/>
+      <w:r>
+        <w:t>VARCHAR(</w:t>
+      </w:r>
+      <w:proofErr w:type="gramEnd"/>
+      <w:r>
+        <w:t>128), NOT NULL)</w:t>
       </w:r>
     </w:p>
     <w:p>
@@ -5807,7 +5837,15 @@
       </w:r>
       <w:proofErr w:type="spellEnd"/>
       <w:r>
-        <w:t xml:space="preserve"> (DECIMAL(10,2), NOT NULL)</w:t>
+        <w:t xml:space="preserve"> (</w:t>
+      </w:r>
+      <w:proofErr w:type="gramStart"/>
+      <w:r>
+        <w:t>DECIMAL(</w:t>
+      </w:r>
+      <w:proofErr w:type="gramEnd"/>
+      <w:r>
+        <w:t>10,2), NOT NULL)</w:t>
       </w:r>
     </w:p>
     <w:p/>
@@ -6060,7 +6098,15 @@
       </w:r>
       <w:proofErr w:type="spellEnd"/>
       <w:r>
-        <w:t xml:space="preserve"> (VARCHAR(128), NOT NULL)</w:t>
+        <w:t xml:space="preserve"> (</w:t>
+      </w:r>
+      <w:proofErr w:type="gramStart"/>
+      <w:r>
+        <w:t>VARCHAR(</w:t>
+      </w:r>
+      <w:proofErr w:type="gramEnd"/>
+      <w:r>
+        <w:t>128), NOT NULL)</w:t>
       </w:r>
     </w:p>
     <w:p>
@@ -6076,7 +6122,15 @@
       </w:r>
       <w:proofErr w:type="spellEnd"/>
       <w:r>
-        <w:t xml:space="preserve"> (VARCHAR(32), UNIQUE, NOT NULL)</w:t>
+        <w:t xml:space="preserve"> (</w:t>
+      </w:r>
+      <w:proofErr w:type="gramStart"/>
+      <w:r>
+        <w:t>VARCHAR(</w:t>
+      </w:r>
+      <w:proofErr w:type="gramEnd"/>
+      <w:r>
+        <w:t>32), UNIQUE, NOT NULL)</w:t>
       </w:r>
     </w:p>
     <w:p>
@@ -6092,7 +6146,15 @@
       </w:r>
       <w:proofErr w:type="spellEnd"/>
       <w:r>
-        <w:t xml:space="preserve"> (VARCHAR(64), NULL)</w:t>
+        <w:t xml:space="preserve"> (</w:t>
+      </w:r>
+      <w:proofErr w:type="gramStart"/>
+      <w:r>
+        <w:t>VARCHAR(</w:t>
+      </w:r>
+      <w:proofErr w:type="gramEnd"/>
+      <w:r>
+        <w:t>64), NULL)</w:t>
       </w:r>
     </w:p>
     <w:p>
@@ -6103,7 +6165,15 @@
         </w:numPr>
       </w:pPr>
       <w:r>
-        <w:t>email (VARCHAR(64), NULL)</w:t>
+        <w:t>email (</w:t>
+      </w:r>
+      <w:proofErr w:type="gramStart"/>
+      <w:r>
+        <w:t>VARCHAR(</w:t>
+      </w:r>
+      <w:proofErr w:type="gramEnd"/>
+      <w:r>
+        <w:t>64), NULL)</w:t>
       </w:r>
     </w:p>
     <w:p/>
@@ -6266,7 +6336,15 @@
         </w:numPr>
       </w:pPr>
       <w:r>
-        <w:t>status (VARCHAR(32), NOT NULL)</w:t>
+        <w:t>status (</w:t>
+      </w:r>
+      <w:proofErr w:type="gramStart"/>
+      <w:r>
+        <w:t>VARCHAR(</w:t>
+      </w:r>
+      <w:proofErr w:type="gramEnd"/>
+      <w:r>
+        <w:t>32), NOT NULL)</w:t>
       </w:r>
     </w:p>
     <w:p>
@@ -6394,7 +6472,15 @@
       </w:r>
       <w:proofErr w:type="spellEnd"/>
       <w:r>
-        <w:t xml:space="preserve"> (VARCHAR(64), NOT NULL)</w:t>
+        <w:t xml:space="preserve"> (</w:t>
+      </w:r>
+      <w:proofErr w:type="gramStart"/>
+      <w:r>
+        <w:t>VARCHAR(</w:t>
+      </w:r>
+      <w:proofErr w:type="gramEnd"/>
+      <w:r>
+        <w:t>64), NOT NULL)</w:t>
       </w:r>
     </w:p>
     <w:p>
@@ -6410,7 +6496,15 @@
       </w:r>
       <w:proofErr w:type="spellEnd"/>
       <w:r>
-        <w:t xml:space="preserve"> (VARCHAR(64), NOT NULL)</w:t>
+        <w:t xml:space="preserve"> (</w:t>
+      </w:r>
+      <w:proofErr w:type="gramStart"/>
+      <w:r>
+        <w:t>VARCHAR(</w:t>
+      </w:r>
+      <w:proofErr w:type="gramEnd"/>
+      <w:r>
+        <w:t>64), NOT NULL)</w:t>
       </w:r>
     </w:p>
     <w:p>
@@ -6428,7 +6522,15 @@
         <w:t>email</w:t>
       </w:r>
       <w:r>
-        <w:t xml:space="preserve"> (VARCHAR(64), UNIQUE, NOT NULL)</w:t>
+        <w:t xml:space="preserve"> (</w:t>
+      </w:r>
+      <w:proofErr w:type="gramStart"/>
+      <w:r>
+        <w:t>VARCHAR(</w:t>
+      </w:r>
+      <w:proofErr w:type="gramEnd"/>
+      <w:r>
+        <w:t>64), UNIQUE, NOT NULL)</w:t>
       </w:r>
     </w:p>
     <w:p>
@@ -6444,7 +6546,15 @@
       </w:r>
       <w:proofErr w:type="spellEnd"/>
       <w:r>
-        <w:t xml:space="preserve"> (VARCHAR(32), NULL)</w:t>
+        <w:t xml:space="preserve"> (</w:t>
+      </w:r>
+      <w:proofErr w:type="gramStart"/>
+      <w:r>
+        <w:t>VARCHAR(</w:t>
+      </w:r>
+      <w:proofErr w:type="gramEnd"/>
+      <w:r>
+        <w:t>32), NULL)</w:t>
       </w:r>
     </w:p>
     <w:p/>
@@ -6569,7 +6679,15 @@
         </w:numPr>
       </w:pPr>
       <w:r>
-        <w:t>status (VARCHAR(32), NOT NULL)</w:t>
+        <w:t>status (</w:t>
+      </w:r>
+      <w:proofErr w:type="gramStart"/>
+      <w:r>
+        <w:t>VARCHAR(</w:t>
+      </w:r>
+      <w:proofErr w:type="gramEnd"/>
+      <w:r>
+        <w:t>32), NOT NULL)</w:t>
       </w:r>
     </w:p>
     <w:p>
@@ -6649,8 +6767,13 @@
       </w:r>
     </w:p>
     <w:p>
-      <w:r>
-        <w:t xml:space="preserve">Además los movimientos entre almacenes </w:t>
+      <w:proofErr w:type="gramStart"/>
+      <w:r>
+        <w:t>Además</w:t>
+      </w:r>
+      <w:proofErr w:type="gramEnd"/>
+      <w:r>
+        <w:t xml:space="preserve"> los movimientos entre almacenes </w:t>
       </w:r>
       <w:r>
         <w:t>(</w:t>
@@ -6792,7 +6915,15 @@
       </w:r>
       <w:proofErr w:type="spellEnd"/>
       <w:r>
-        <w:t xml:space="preserve"> (VARCHAR(64), NOT NULL)</w:t>
+        <w:t xml:space="preserve"> (</w:t>
+      </w:r>
+      <w:proofErr w:type="gramStart"/>
+      <w:r>
+        <w:t>VARCHAR(</w:t>
+      </w:r>
+      <w:proofErr w:type="gramEnd"/>
+      <w:r>
+        <w:t>64), NOT NULL)</w:t>
       </w:r>
     </w:p>
     <w:p>
@@ -6808,7 +6939,15 @@
       </w:r>
       <w:proofErr w:type="spellEnd"/>
       <w:r>
-        <w:t xml:space="preserve"> (VARCHAR(128), NOT NULL)</w:t>
+        <w:t xml:space="preserve"> (</w:t>
+      </w:r>
+      <w:proofErr w:type="gramStart"/>
+      <w:r>
+        <w:t>VARCHAR(</w:t>
+      </w:r>
+      <w:proofErr w:type="gramEnd"/>
+      <w:r>
+        <w:t>128), NOT NULL)</w:t>
       </w:r>
     </w:p>
     <w:p>
@@ -7525,7 +7664,15 @@
       </w:r>
       <w:proofErr w:type="spellEnd"/>
       <w:r>
-        <w:t xml:space="preserve"> (VARCHAR(32), NOT NULL)</w:t>
+        <w:t xml:space="preserve"> (</w:t>
+      </w:r>
+      <w:proofErr w:type="gramStart"/>
+      <w:r>
+        <w:t>VARCHAR(</w:t>
+      </w:r>
+      <w:proofErr w:type="gramEnd"/>
+      <w:r>
+        <w:t>32), NOT NULL)</w:t>
       </w:r>
     </w:p>
     <w:p>
@@ -7666,19 +7813,7 @@
           <w:rPr>
             <w:rStyle w:val="Hipervnculo2"/>
           </w:rPr>
-          <w:t>Figur</w:t>
-        </w:r>
-        <w:r>
-          <w:rPr>
-            <w:rStyle w:val="Hipervnculo2"/>
-          </w:rPr>
-          <w:t>a</w:t>
-        </w:r>
-        <w:r>
-          <w:rPr>
-            <w:rStyle w:val="Hipervnculo2"/>
-          </w:rPr>
-          <w:t xml:space="preserve"> 3</w:t>
+          <w:t>Figura 3</w:t>
         </w:r>
       </w:hyperlink>
       <w:r>
@@ -7691,6 +7826,9 @@
       </w:pPr>
       <w:bookmarkStart w:id="2" w:name="fig_3"/>
       <w:r>
+        <w:rPr>
+          <w:noProof/>
+        </w:rPr>
         <w:lastRenderedPageBreak/>
         <w:drawing>
           <wp:inline distT="0" distB="0" distL="0" distR="0" wp14:anchorId="45FF6261" wp14:editId="793D3927">
@@ -7755,13 +7893,7 @@
         <w:contextualSpacing w:val="0"/>
       </w:pPr>
       <w:r>
-        <w:t xml:space="preserve">Figura </w:t>
-      </w:r>
-      <w:r>
-        <w:t>3</w:t>
-      </w:r>
-      <w:r>
-        <w:t>.</w:t>
+        <w:t>Figura 3.</w:t>
       </w:r>
     </w:p>
     <w:p>
@@ -7880,9 +8012,9 @@
           <w:noProof/>
         </w:rPr>
         <w:drawing>
-          <wp:inline distT="0" distB="0" distL="0" distR="0" wp14:anchorId="6F531740" wp14:editId="224CD968">
-            <wp:extent cx="5756831" cy="2789987"/>
-            <wp:effectExtent l="19050" t="19050" r="15875" b="10795"/>
+          <wp:inline distT="0" distB="0" distL="0" distR="0" wp14:anchorId="6F531740" wp14:editId="2118E6BC">
+            <wp:extent cx="5755940" cy="2482749"/>
+            <wp:effectExtent l="19050" t="19050" r="16510" b="13335"/>
             <wp:docPr id="1" name="Imagen 1"/>
             <wp:cNvGraphicFramePr>
               <a:graphicFrameLocks xmlns:a="http://schemas.openxmlformats.org/drawingml/2006/main" noChangeAspect="1"/>
@@ -7903,7 +8035,7 @@
                   <pic:spPr>
                     <a:xfrm>
                       <a:off x="0" y="0"/>
-                      <a:ext cx="5815102" cy="2818227"/>
+                      <a:ext cx="5825353" cy="2512689"/>
                     </a:xfrm>
                     <a:prstGeom prst="rect">
                       <a:avLst/>
@@ -7924,6 +8056,23 @@
       </w:r>
     </w:p>
     <w:p>
+      <w:pPr>
+        <w:pStyle w:val="Citas"/>
+        <w:spacing w:before="120"/>
+        <w:ind w:left="0" w:right="1134"/>
+        <w:contextualSpacing w:val="0"/>
+      </w:pPr>
+      <w:r>
+        <w:t xml:space="preserve">Figura </w:t>
+      </w:r>
+      <w:r>
+        <w:t>4</w:t>
+      </w:r>
+      <w:r>
+        <w:t>.</w:t>
+      </w:r>
+    </w:p>
+    <w:p>
       <w:r>
         <w:lastRenderedPageBreak/>
         <w:t>Igualmente h</w:t>
@@ -7956,9 +8105,9 @@
           <w:noProof/>
         </w:rPr>
         <w:drawing>
-          <wp:inline distT="0" distB="0" distL="0" distR="0" wp14:anchorId="54A5C54C" wp14:editId="490E78AC">
-            <wp:extent cx="5758724" cy="2746096"/>
-            <wp:effectExtent l="19050" t="19050" r="13970" b="16510"/>
+          <wp:inline distT="0" distB="0" distL="0" distR="0" wp14:anchorId="54A5C54C" wp14:editId="694DDFFB">
+            <wp:extent cx="5757978" cy="2387650"/>
+            <wp:effectExtent l="19050" t="19050" r="14605" b="12700"/>
             <wp:docPr id="4" name="Imagen 4"/>
             <wp:cNvGraphicFramePr>
               <a:graphicFrameLocks xmlns:a="http://schemas.openxmlformats.org/drawingml/2006/main" noChangeAspect="1"/>
@@ -7972,13 +8121,13 @@
                   </pic:nvPicPr>
                   <pic:blipFill rotWithShape="1">
                     <a:blip r:embed="rId19"/>
-                    <a:srcRect b="5359"/>
+                    <a:srcRect b="17701"/>
                     <a:stretch/>
                   </pic:blipFill>
                   <pic:spPr bwMode="auto">
                     <a:xfrm>
                       <a:off x="0" y="0"/>
-                      <a:ext cx="5759450" cy="2746442"/>
+                      <a:ext cx="5759450" cy="2388260"/>
                     </a:xfrm>
                     <a:prstGeom prst="rect">
                       <a:avLst/>
@@ -8024,6 +8173,23 @@
     </w:p>
     <w:p>
       <w:pPr>
+        <w:pStyle w:val="Citas"/>
+        <w:spacing w:before="240"/>
+        <w:ind w:left="0" w:right="1134"/>
+        <w:contextualSpacing w:val="0"/>
+      </w:pPr>
+      <w:r>
+        <w:t xml:space="preserve">Figura </w:t>
+      </w:r>
+      <w:r>
+        <w:t>5</w:t>
+      </w:r>
+      <w:r>
+        <w:t>.</w:t>
+      </w:r>
+    </w:p>
+    <w:p>
+      <w:pPr>
         <w:rPr>
           <w:b/>
           <w:bCs/>
@@ -8465,12 +8631,14 @@
       <w:r>
         <w:t xml:space="preserve"> </w:t>
       </w:r>
+      <w:proofErr w:type="gramStart"/>
       <w:r>
         <w:rPr>
           <w:color w:val="FFC000"/>
         </w:rPr>
         <w:t>VARCHAR(</w:t>
       </w:r>
+      <w:proofErr w:type="gramEnd"/>
       <w:r>
         <w:rPr>
           <w:color w:val="92D050"/>
@@ -8504,12 +8672,14 @@
       <w:r>
         <w:t xml:space="preserve">  slug </w:t>
       </w:r>
+      <w:proofErr w:type="gramStart"/>
       <w:r>
         <w:rPr>
           <w:color w:val="FFC000"/>
         </w:rPr>
         <w:t>VARCHAR(</w:t>
       </w:r>
+      <w:proofErr w:type="gramEnd"/>
       <w:r>
         <w:rPr>
           <w:color w:val="92D050"/>
@@ -8681,12 +8851,14 @@
       <w:r>
         <w:t xml:space="preserve"> </w:t>
       </w:r>
+      <w:proofErr w:type="gramStart"/>
       <w:r>
         <w:rPr>
           <w:color w:val="FFC000"/>
         </w:rPr>
         <w:t>VARCHAR(</w:t>
       </w:r>
+      <w:proofErr w:type="gramEnd"/>
       <w:r>
         <w:rPr>
           <w:color w:val="92D050"/>
@@ -8728,12 +8900,14 @@
       <w:r>
         <w:t xml:space="preserve"> </w:t>
       </w:r>
+      <w:proofErr w:type="gramStart"/>
       <w:r>
         <w:rPr>
           <w:color w:val="FFC000"/>
         </w:rPr>
         <w:t>VARCHAR(</w:t>
       </w:r>
+      <w:proofErr w:type="gramEnd"/>
       <w:r>
         <w:rPr>
           <w:color w:val="92D050"/>
@@ -8810,12 +8984,14 @@
       <w:r>
         <w:t xml:space="preserve"> </w:t>
       </w:r>
+      <w:proofErr w:type="gramStart"/>
       <w:r>
         <w:rPr>
           <w:color w:val="FFC000"/>
         </w:rPr>
         <w:t>DECIMAL(</w:t>
       </w:r>
+      <w:proofErr w:type="gramEnd"/>
       <w:r>
         <w:rPr>
           <w:color w:val="92D050"/>
@@ -9319,6 +9495,25 @@
     </w:p>
     <w:p>
       <w:pPr>
+        <w:spacing w:after="300" w:line="276" w:lineRule="auto"/>
+        <w:contextualSpacing w:val="0"/>
+        <w:rPr>
+          <w:rFonts w:ascii="Consolas" w:eastAsia="Times New Roman" w:hAnsi="Consolas" w:cs="Times New Roman"/>
+          <w:color w:val="7F7F7F" w:themeColor="text1" w:themeTint="80"/>
+          <w:sz w:val="18"/>
+          <w:szCs w:val="16"/>
+          <w:lang w:eastAsia="es-ES"/>
+        </w:rPr>
+      </w:pPr>
+      <w:r>
+        <w:rPr>
+          <w:color w:val="7F7F7F" w:themeColor="text1" w:themeTint="80"/>
+        </w:rPr>
+        <w:br w:type="page"/>
+      </w:r>
+    </w:p>
+    <w:p>
+      <w:pPr>
         <w:pStyle w:val="Prrafocdigo"/>
         <w:ind w:firstLine="142"/>
         <w:rPr>
@@ -9462,12 +9657,14 @@
       <w:r>
         <w:t xml:space="preserve"> </w:t>
       </w:r>
+      <w:proofErr w:type="gramStart"/>
       <w:r>
         <w:rPr>
           <w:color w:val="FFC000"/>
         </w:rPr>
         <w:t>VARCHAR(</w:t>
       </w:r>
+      <w:proofErr w:type="gramEnd"/>
       <w:r>
         <w:rPr>
           <w:color w:val="92D050"/>
@@ -9509,12 +9706,14 @@
       <w:r>
         <w:t xml:space="preserve"> </w:t>
       </w:r>
+      <w:proofErr w:type="gramStart"/>
       <w:r>
         <w:rPr>
           <w:color w:val="FFC000"/>
         </w:rPr>
         <w:t>VARCHAR(</w:t>
       </w:r>
+      <w:proofErr w:type="gramEnd"/>
       <w:r>
         <w:rPr>
           <w:color w:val="92D050"/>
@@ -9556,12 +9755,14 @@
       <w:r>
         <w:t xml:space="preserve"> </w:t>
       </w:r>
+      <w:proofErr w:type="gramStart"/>
       <w:r>
         <w:rPr>
           <w:color w:val="FFC000"/>
         </w:rPr>
         <w:t>VARCHAR(</w:t>
       </w:r>
+      <w:proofErr w:type="gramEnd"/>
       <w:r>
         <w:rPr>
           <w:color w:val="92D050"/>
@@ -9595,12 +9796,14 @@
       <w:r>
         <w:t xml:space="preserve">  email </w:t>
       </w:r>
+      <w:proofErr w:type="gramStart"/>
       <w:r>
         <w:rPr>
           <w:color w:val="FFC000"/>
         </w:rPr>
         <w:t>VARCHAR(</w:t>
       </w:r>
+      <w:proofErr w:type="gramEnd"/>
       <w:r>
         <w:rPr>
           <w:color w:val="92D050"/>
@@ -9779,12 +9982,14 @@
       <w:r>
         <w:t xml:space="preserve"> </w:t>
       </w:r>
+      <w:proofErr w:type="gramStart"/>
       <w:r>
         <w:rPr>
           <w:color w:val="FFC000"/>
         </w:rPr>
         <w:t>VARCHAR(</w:t>
       </w:r>
+      <w:proofErr w:type="gramEnd"/>
       <w:r>
         <w:rPr>
           <w:color w:val="92D050"/>
@@ -9826,12 +10031,14 @@
       <w:r>
         <w:t xml:space="preserve"> </w:t>
       </w:r>
+      <w:proofErr w:type="gramStart"/>
       <w:r>
         <w:rPr>
           <w:color w:val="FFC000"/>
         </w:rPr>
         <w:t>VARCHAR(</w:t>
       </w:r>
+      <w:proofErr w:type="gramEnd"/>
       <w:r>
         <w:rPr>
           <w:color w:val="92D050"/>
@@ -9865,12 +10072,14 @@
       <w:r>
         <w:t xml:space="preserve">  email </w:t>
       </w:r>
+      <w:proofErr w:type="gramStart"/>
       <w:r>
         <w:rPr>
           <w:color w:val="FFC000"/>
         </w:rPr>
         <w:t>VARCHAR(</w:t>
       </w:r>
+      <w:proofErr w:type="gramEnd"/>
       <w:r>
         <w:rPr>
           <w:color w:val="92D050"/>
@@ -9912,12 +10121,14 @@
       <w:r>
         <w:t xml:space="preserve"> </w:t>
       </w:r>
+      <w:proofErr w:type="gramStart"/>
       <w:r>
         <w:rPr>
           <w:color w:val="FFC000"/>
         </w:rPr>
         <w:t>VARCHAR(</w:t>
       </w:r>
+      <w:proofErr w:type="gramEnd"/>
       <w:r>
         <w:rPr>
           <w:color w:val="92D050"/>
@@ -10126,12 +10337,14 @@
       <w:r>
         <w:t xml:space="preserve">  status </w:t>
       </w:r>
+      <w:proofErr w:type="gramStart"/>
       <w:r>
         <w:rPr>
           <w:color w:val="FFC000"/>
         </w:rPr>
         <w:t>VARCHAR(</w:t>
       </w:r>
+      <w:proofErr w:type="gramEnd"/>
       <w:r>
         <w:rPr>
           <w:color w:val="92D050"/>
@@ -10448,8 +10661,13 @@
       </w:r>
       <w:proofErr w:type="spellEnd"/>
       <w:r>
-        <w:t xml:space="preserve"> VARCHAR(</w:t>
-      </w:r>
+        <w:t xml:space="preserve"> </w:t>
+      </w:r>
+      <w:proofErr w:type="gramStart"/>
+      <w:r>
+        <w:t>VARCHAR(</w:t>
+      </w:r>
+      <w:proofErr w:type="gramEnd"/>
       <w:r>
         <w:rPr>
           <w:color w:val="92D050"/>
@@ -10483,8 +10701,13 @@
       </w:r>
       <w:proofErr w:type="spellEnd"/>
       <w:r>
-        <w:t xml:space="preserve"> VARCHAR(</w:t>
-      </w:r>
+        <w:t xml:space="preserve"> </w:t>
+      </w:r>
+      <w:proofErr w:type="gramStart"/>
+      <w:r>
+        <w:t>VARCHAR(</w:t>
+      </w:r>
+      <w:proofErr w:type="gramEnd"/>
       <w:r>
         <w:rPr>
           <w:color w:val="92D050"/>
@@ -10722,12 +10945,14 @@
       <w:r>
         <w:t xml:space="preserve">  status </w:t>
       </w:r>
+      <w:proofErr w:type="gramStart"/>
       <w:r>
         <w:rPr>
           <w:color w:val="FFC000"/>
         </w:rPr>
         <w:t>VARCHAR(</w:t>
       </w:r>
+      <w:proofErr w:type="gramEnd"/>
       <w:r>
         <w:rPr>
           <w:color w:val="92D050"/>
@@ -12180,12 +12405,14 @@
       <w:r>
         <w:t xml:space="preserve"> </w:t>
       </w:r>
+      <w:proofErr w:type="gramStart"/>
       <w:r>
         <w:rPr>
           <w:color w:val="FFC000"/>
         </w:rPr>
         <w:t>VARCHAR(</w:t>
       </w:r>
+      <w:proofErr w:type="gramEnd"/>
       <w:r>
         <w:rPr>
           <w:color w:val="92D050"/>
@@ -13100,6 +13327,7 @@
         <w:t xml:space="preserve">EJERCICIO 5:  Una empresa de comercio electrónico está implementando un sistema de análisis de ventas en tiempo real. Como parte de este proyecto, necesitan asegurar la calidad de los datos que alimentarán su sistema. Se te ha proporcionado un archivo CSV llamado 'ventas_con_problemas.csv' que contiene datos de ventas de los últimos 30 días. Este archivo contiene varios problemas de calidad de datos que deben ser identificados y </w:t>
       </w:r>
       <w:proofErr w:type="spellStart"/>
+      <w:proofErr w:type="gramStart"/>
       <w:r>
         <w:rPr>
           <w:b/>
@@ -13118,6 +13346,7 @@
         <w:t>corregidos.Tu</w:t>
       </w:r>
       <w:proofErr w:type="spellEnd"/>
+      <w:proofErr w:type="gramEnd"/>
       <w:r>
         <w:rPr>
           <w:b/>
@@ -14049,6 +14278,592 @@
         </w:r>
       </w:hyperlink>
     </w:p>
+    <w:p/>
+    <w:p/>
+    <w:p>
+      <w:r>
+        <w:t>Bueno, como soy de la vieja escuela, he abierto el CSV con Excel, formateado y por supuesto creando el filtro. Una vez hecho esto, le he echado una visual, y se observa lo primero que e</w:t>
+      </w:r>
+      <w:r>
+        <w:t>l</w:t>
+      </w:r>
+      <w:r>
+        <w:t xml:space="preserve"> </w:t>
+      </w:r>
+      <w:r>
+        <w:t xml:space="preserve">archivo contiene </w:t>
+      </w:r>
+      <w:r>
+        <w:rPr>
+          <w:b/>
+          <w:bCs/>
+        </w:rPr>
+        <w:t>31</w:t>
+      </w:r>
+      <w:r>
+        <w:rPr>
+          <w:b/>
+          <w:bCs/>
+        </w:rPr>
+        <w:t>5</w:t>
+      </w:r>
+      <w:r>
+        <w:rPr>
+          <w:b/>
+          <w:bCs/>
+        </w:rPr>
+        <w:t xml:space="preserve"> registros</w:t>
+      </w:r>
+      <w:r>
+        <w:t xml:space="preserve"> más la primera </w:t>
+      </w:r>
+      <w:r>
+        <w:t xml:space="preserve">como </w:t>
+      </w:r>
+      <w:r>
+        <w:t>cabecera</w:t>
+      </w:r>
+      <w:r>
+        <w:t xml:space="preserve"> </w:t>
+      </w:r>
+      <w:r>
+        <w:t>de las</w:t>
+      </w:r>
+      <w:r>
+        <w:t xml:space="preserve"> 5 columnas: </w:t>
+      </w:r>
+      <w:r>
+        <w:rPr>
+          <w:i/>
+          <w:iCs/>
+        </w:rPr>
+        <w:t>fecha</w:t>
+      </w:r>
+      <w:r>
+        <w:t xml:space="preserve">, </w:t>
+      </w:r>
+      <w:r>
+        <w:rPr>
+          <w:i/>
+          <w:iCs/>
+        </w:rPr>
+        <w:t>producto</w:t>
+      </w:r>
+      <w:r>
+        <w:t xml:space="preserve">, </w:t>
+      </w:r>
+      <w:r>
+        <w:rPr>
+          <w:i/>
+          <w:iCs/>
+        </w:rPr>
+        <w:t>cantidad</w:t>
+      </w:r>
+      <w:r>
+        <w:t xml:space="preserve">, </w:t>
+      </w:r>
+      <w:proofErr w:type="spellStart"/>
+      <w:r>
+        <w:rPr>
+          <w:i/>
+          <w:iCs/>
+        </w:rPr>
+        <w:t>precio_unitario</w:t>
+      </w:r>
+      <w:proofErr w:type="spellEnd"/>
+      <w:r>
+        <w:t xml:space="preserve"> y </w:t>
+      </w:r>
+      <w:r>
+        <w:rPr>
+          <w:i/>
+          <w:iCs/>
+        </w:rPr>
+        <w:t>total</w:t>
+      </w:r>
+      <w:r>
+        <w:t xml:space="preserve">; y como no podía ser de otro modo del mi primer </w:t>
+      </w:r>
+      <w:r>
+        <w:t xml:space="preserve">análisis exploratorio </w:t>
+      </w:r>
+      <w:r>
+        <w:t xml:space="preserve">mediante juicio experto, </w:t>
+      </w:r>
+      <w:r>
+        <w:t xml:space="preserve">se desprende que el </w:t>
+      </w:r>
+      <w:proofErr w:type="spellStart"/>
+      <w:r>
+        <w:t>dataset</w:t>
+      </w:r>
+      <w:proofErr w:type="spellEnd"/>
+      <w:r>
+        <w:t xml:space="preserve"> presenta múltiples fallos sintácticos, semánticos y de integridad estructural</w:t>
+      </w:r>
+      <w:r>
+        <w:t>, a mi entender bastante</w:t>
+      </w:r>
+      <w:r>
+        <w:t xml:space="preserve"> severos</w:t>
+      </w:r>
+      <w:r>
+        <w:t xml:space="preserve">, como son: </w:t>
+      </w:r>
+      <w:r>
+        <w:rPr>
+          <w:i/>
+          <w:iCs/>
+        </w:rPr>
+        <w:t>v</w:t>
+      </w:r>
+      <w:r>
+        <w:rPr>
+          <w:i/>
+          <w:iCs/>
+        </w:rPr>
+        <w:t xml:space="preserve">alores nulos </w:t>
+      </w:r>
+      <w:r>
+        <w:rPr>
+          <w:i/>
+          <w:iCs/>
+        </w:rPr>
+        <w:t>o</w:t>
+      </w:r>
+      <w:r>
+        <w:rPr>
+          <w:i/>
+          <w:iCs/>
+        </w:rPr>
+        <w:t xml:space="preserve"> faltantes</w:t>
+      </w:r>
+      <w:r>
+        <w:t xml:space="preserve">, </w:t>
+      </w:r>
+      <w:r>
+        <w:rPr>
+          <w:i/>
+          <w:iCs/>
+        </w:rPr>
+        <w:t xml:space="preserve">fechas inválidas </w:t>
+      </w:r>
+      <w:r>
+        <w:rPr>
+          <w:i/>
+          <w:iCs/>
+        </w:rPr>
+        <w:t>y/o erróneas</w:t>
+      </w:r>
+      <w:r>
+        <w:t>,</w:t>
+      </w:r>
+      <w:r>
+        <w:t xml:space="preserve"> </w:t>
+      </w:r>
+      <w:r>
+        <w:rPr>
+          <w:i/>
+          <w:iCs/>
+        </w:rPr>
+        <w:t>valores negativos o cero</w:t>
+      </w:r>
+      <w:r>
+        <w:t xml:space="preserve"> en las columnas numéricas, </w:t>
+      </w:r>
+      <w:proofErr w:type="spellStart"/>
+      <w:r>
+        <w:rPr>
+          <w:i/>
+          <w:iCs/>
+        </w:rPr>
+        <w:t>outliers</w:t>
+      </w:r>
+      <w:proofErr w:type="spellEnd"/>
+      <w:r>
+        <w:rPr>
+          <w:i/>
+          <w:iCs/>
+        </w:rPr>
+        <w:t xml:space="preserve"> o valores atípicos</w:t>
+      </w:r>
+      <w:r>
+        <w:t>, y más casos cuando le haga una auditoría automatizada.</w:t>
+      </w:r>
+      <w:r>
+        <w:br/>
+      </w:r>
+      <w:r>
+        <w:br/>
+        <w:t xml:space="preserve">Lo primero será </w:t>
+      </w:r>
+      <w:r>
+        <w:t xml:space="preserve">ejecutar </w:t>
+      </w:r>
+      <w:r>
+        <w:t>un</w:t>
+      </w:r>
+      <w:r>
+        <w:t xml:space="preserve"> análisis completo</w:t>
+      </w:r>
+      <w:r>
+        <w:t xml:space="preserve"> y ya que </w:t>
+      </w:r>
+      <w:r>
+        <w:t xml:space="preserve">me gusta </w:t>
+      </w:r>
+      <w:r>
+        <w:t>compara</w:t>
+      </w:r>
+      <w:r>
+        <w:t>r</w:t>
+      </w:r>
+      <w:r>
+        <w:t xml:space="preserve"> las distintas herramientas </w:t>
+      </w:r>
+      <w:r>
+        <w:t>sugeridas:</w:t>
+      </w:r>
+      <w:r>
+        <w:t xml:space="preserve"> </w:t>
+      </w:r>
+      <w:r>
+        <w:rPr>
+          <w:i/>
+          <w:iCs/>
+        </w:rPr>
+        <w:t>pandas</w:t>
+      </w:r>
+      <w:r>
+        <w:t xml:space="preserve">, </w:t>
+      </w:r>
+      <w:proofErr w:type="spellStart"/>
+      <w:r>
+        <w:rPr>
+          <w:i/>
+          <w:iCs/>
+        </w:rPr>
+        <w:t>numpy</w:t>
+      </w:r>
+      <w:proofErr w:type="spellEnd"/>
+      <w:r>
+        <w:t xml:space="preserve">, </w:t>
+      </w:r>
+      <w:proofErr w:type="spellStart"/>
+      <w:r>
+        <w:rPr>
+          <w:i/>
+          <w:iCs/>
+        </w:rPr>
+        <w:t>matplotlib</w:t>
+      </w:r>
+      <w:proofErr w:type="spellEnd"/>
+      <w:r>
+        <w:t xml:space="preserve">, </w:t>
+      </w:r>
+      <w:proofErr w:type="spellStart"/>
+      <w:r>
+        <w:rPr>
+          <w:i/>
+          <w:iCs/>
+        </w:rPr>
+        <w:t>seaborn</w:t>
+      </w:r>
+      <w:proofErr w:type="spellEnd"/>
+      <w:r>
+        <w:t>, vamos a instalarlas,</w:t>
+      </w:r>
+      <w:r>
+        <w:t xml:space="preserve"> </w:t>
+      </w:r>
+      <w:r>
+        <w:t>a</w:t>
+      </w:r>
+      <w:r>
+        <w:t xml:space="preserve">sí podremos </w:t>
+      </w:r>
+      <w:r>
+        <w:t>manipula</w:t>
+      </w:r>
+      <w:r>
+        <w:t>r</w:t>
+      </w:r>
+      <w:r>
+        <w:t>, valida</w:t>
+      </w:r>
+      <w:r>
+        <w:t>r</w:t>
+      </w:r>
+      <w:r>
+        <w:t xml:space="preserve"> y visualiza</w:t>
+      </w:r>
+      <w:r>
+        <w:t>r los diferentes resultados</w:t>
+      </w:r>
+      <w:r>
+        <w:t xml:space="preserve"> además de </w:t>
+      </w:r>
+      <w:r>
+        <w:t xml:space="preserve">comprobar </w:t>
+      </w:r>
+      <w:r>
+        <w:t xml:space="preserve">las </w:t>
+      </w:r>
+      <w:r>
+        <w:t xml:space="preserve">diferencias </w:t>
+      </w:r>
+      <w:r>
+        <w:t xml:space="preserve">entre cada módulo </w:t>
+      </w:r>
+      <w:r>
+        <w:t>y decidir en qué caso ser</w:t>
+      </w:r>
+      <w:r>
+        <w:t>á</w:t>
+      </w:r>
+      <w:r>
+        <w:t xml:space="preserve"> más óptimo usar un</w:t>
+      </w:r>
+      <w:r>
+        <w:t>o</w:t>
+      </w:r>
+      <w:r>
+        <w:t xml:space="preserve"> u otro</w:t>
+      </w:r>
+      <w:r>
+        <w:t>.</w:t>
+      </w:r>
+      <w:r>
+        <w:t xml:space="preserve"> </w:t>
+      </w:r>
+    </w:p>
+    <w:p>
+      <w:r>
+        <w:br/>
+      </w:r>
+    </w:p>
+    <w:p>
+      <w:pPr>
+        <w:spacing w:after="300" w:line="276" w:lineRule="auto"/>
+        <w:contextualSpacing w:val="0"/>
+      </w:pPr>
+      <w:r>
+        <w:br w:type="page"/>
+      </w:r>
+    </w:p>
+    <w:p>
+      <w:r>
+        <w:lastRenderedPageBreak/>
+        <w:t>El entorno de desarrollo es Debian v. bajo en WSL bajo Windows 11 Pro 25H2</w:t>
+      </w:r>
+    </w:p>
+    <w:p/>
+    <w:p>
+      <w:pPr>
+        <w:jc w:val="center"/>
+      </w:pPr>
+      <w:r>
+        <w:drawing>
+          <wp:inline distT="0" distB="0" distL="0" distR="0" wp14:anchorId="17745138" wp14:editId="2684CAC5">
+            <wp:extent cx="5749747" cy="2106295"/>
+            <wp:effectExtent l="0" t="0" r="3810" b="8255"/>
+            <wp:docPr id="5" name="Imagen 5"/>
+            <wp:cNvGraphicFramePr>
+              <a:graphicFrameLocks xmlns:a="http://schemas.openxmlformats.org/drawingml/2006/main" noChangeAspect="1"/>
+            </wp:cNvGraphicFramePr>
+            <a:graphic xmlns:a="http://schemas.openxmlformats.org/drawingml/2006/main">
+              <a:graphicData uri="http://schemas.openxmlformats.org/drawingml/2006/picture">
+                <pic:pic xmlns:pic="http://schemas.openxmlformats.org/drawingml/2006/picture">
+                  <pic:nvPicPr>
+                    <pic:cNvPr id="1" name=""/>
+                    <pic:cNvPicPr/>
+                  </pic:nvPicPr>
+                  <pic:blipFill rotWithShape="1">
+                    <a:blip r:embed="rId21"/>
+                    <a:srcRect b="77227"/>
+                    <a:stretch/>
+                  </pic:blipFill>
+                  <pic:spPr bwMode="auto">
+                    <a:xfrm>
+                      <a:off x="0" y="0"/>
+                      <a:ext cx="5761155" cy="2110474"/>
+                    </a:xfrm>
+                    <a:prstGeom prst="rect">
+                      <a:avLst/>
+                    </a:prstGeom>
+                    <a:ln>
+                      <a:noFill/>
+                    </a:ln>
+                    <a:extLst>
+                      <a:ext uri="{53640926-AAD7-44D8-BBD7-CCE9431645EC}">
+                        <a14:shadowObscured xmlns:a14="http://schemas.microsoft.com/office/drawing/2010/main"/>
+                      </a:ext>
+                    </a:extLst>
+                  </pic:spPr>
+                </pic:pic>
+              </a:graphicData>
+            </a:graphic>
+          </wp:inline>
+        </w:drawing>
+      </w:r>
+    </w:p>
+    <w:p>
+      <w:pPr>
+        <w:pStyle w:val="Citas"/>
+        <w:spacing w:before="120"/>
+        <w:ind w:left="0" w:right="1134"/>
+        <w:contextualSpacing w:val="0"/>
+      </w:pPr>
+      <w:r>
+        <w:t xml:space="preserve">Figura </w:t>
+      </w:r>
+      <w:r>
+        <w:t>1</w:t>
+      </w:r>
+      <w:r>
+        <w:t>.</w:t>
+      </w:r>
+    </w:p>
+    <w:p>
+      <w:pPr>
+        <w:jc w:val="center"/>
+      </w:pPr>
+    </w:p>
+    <w:p>
+      <w:pPr>
+        <w:jc w:val="center"/>
+      </w:pPr>
+    </w:p>
+    <w:p>
+      <w:r>
+        <w:t xml:space="preserve">Instalamos las bibliotecas </w:t>
+      </w:r>
+      <w:r>
+        <w:rPr>
+          <w:i/>
+          <w:iCs/>
+        </w:rPr>
+        <w:t>P</w:t>
+      </w:r>
+      <w:r>
+        <w:rPr>
+          <w:i/>
+          <w:iCs/>
+        </w:rPr>
+        <w:t>andas</w:t>
+      </w:r>
+      <w:r>
+        <w:t xml:space="preserve">, </w:t>
+      </w:r>
+      <w:proofErr w:type="spellStart"/>
+      <w:r>
+        <w:rPr>
+          <w:i/>
+          <w:iCs/>
+        </w:rPr>
+        <w:t>N</w:t>
+      </w:r>
+      <w:r>
+        <w:rPr>
+          <w:i/>
+          <w:iCs/>
+        </w:rPr>
+        <w:t>umpy</w:t>
+      </w:r>
+      <w:proofErr w:type="spellEnd"/>
+      <w:r>
+        <w:t xml:space="preserve">, </w:t>
+      </w:r>
+      <w:proofErr w:type="spellStart"/>
+      <w:r>
+        <w:rPr>
+          <w:i/>
+          <w:iCs/>
+        </w:rPr>
+        <w:t>M</w:t>
+      </w:r>
+      <w:r>
+        <w:rPr>
+          <w:i/>
+          <w:iCs/>
+        </w:rPr>
+        <w:t>atplotlib</w:t>
+      </w:r>
+      <w:proofErr w:type="spellEnd"/>
+      <w:r>
+        <w:t xml:space="preserve"> y </w:t>
+      </w:r>
+      <w:proofErr w:type="spellStart"/>
+      <w:r>
+        <w:rPr>
+          <w:i/>
+          <w:iCs/>
+        </w:rPr>
+        <w:t>S</w:t>
+      </w:r>
+      <w:r>
+        <w:rPr>
+          <w:i/>
+          <w:iCs/>
+        </w:rPr>
+        <w:t>eaborn</w:t>
+      </w:r>
+      <w:proofErr w:type="spellEnd"/>
+      <w:r>
+        <w:t>.</w:t>
+      </w:r>
+    </w:p>
+    <w:p>
+      <w:pPr>
+        <w:jc w:val="center"/>
+      </w:pPr>
+    </w:p>
+    <w:p>
+      <w:pPr>
+        <w:pStyle w:val="Prrafocdigo"/>
+        <w:ind w:firstLine="284"/>
+      </w:pPr>
+      <w:proofErr w:type="spellStart"/>
+      <w:r>
+        <w:t>pip</w:t>
+      </w:r>
+      <w:proofErr w:type="spellEnd"/>
+      <w:r>
+        <w:t xml:space="preserve"> </w:t>
+      </w:r>
+      <w:proofErr w:type="spellStart"/>
+      <w:r>
+        <w:t>install</w:t>
+      </w:r>
+      <w:proofErr w:type="spellEnd"/>
+      <w:r>
+        <w:t xml:space="preserve"> pandas </w:t>
+      </w:r>
+      <w:proofErr w:type="spellStart"/>
+      <w:r>
+        <w:t>numpy</w:t>
+      </w:r>
+      <w:proofErr w:type="spellEnd"/>
+      <w:r>
+        <w:t xml:space="preserve"> </w:t>
+      </w:r>
+      <w:proofErr w:type="spellStart"/>
+      <w:r>
+        <w:t>matplotlib</w:t>
+      </w:r>
+      <w:proofErr w:type="spellEnd"/>
+      <w:r>
+        <w:t xml:space="preserve"> </w:t>
+      </w:r>
+      <w:proofErr w:type="spellStart"/>
+      <w:r>
+        <w:t>seaborn</w:t>
+      </w:r>
+      <w:proofErr w:type="spellEnd"/>
+    </w:p>
+    <w:p/>
+    <w:p/>
+    <w:p/>
     <w:p/>
     <w:p>
       <w:r>
@@ -14071,7 +14886,7 @@
                     <pic:cNvPicPr/>
                   </pic:nvPicPr>
                   <pic:blipFill>
-                    <a:blip r:embed="rId21"/>
+                    <a:blip r:embed="rId22"/>
                     <a:stretch>
                       <a:fillRect/>
                     </a:stretch>
@@ -14297,6 +15112,7 @@
         </w:rPr>
         <w:t xml:space="preserve">    SELECT </w:t>
       </w:r>
+      <w:proofErr w:type="gramStart"/>
       <w:r>
         <w:rPr>
           <w:color w:val="FFC000"/>
@@ -14310,6 +15126,7 @@
         <w:t>(</w:t>
       </w:r>
       <w:proofErr w:type="spellStart"/>
+      <w:proofErr w:type="gramEnd"/>
       <w:r>
         <w:t>price</w:t>
       </w:r>
@@ -14330,7 +15147,6 @@
         <w:rPr>
           <w:color w:val="9A57CD"/>
         </w:rPr>
-        <w:lastRenderedPageBreak/>
         <w:t xml:space="preserve">    FROM </w:t>
       </w:r>
       <w:r>
@@ -14502,6 +15318,7 @@
         </w:rPr>
         <w:t xml:space="preserve">    SELECT </w:t>
       </w:r>
+      <w:proofErr w:type="gramStart"/>
       <w:r>
         <w:rPr>
           <w:color w:val="FFC000"/>
@@ -14515,6 +15332,7 @@
         <w:t>(</w:t>
       </w:r>
       <w:proofErr w:type="spellStart"/>
+      <w:proofErr w:type="gramEnd"/>
       <w:r>
         <w:t>price</w:t>
       </w:r>
@@ -14608,6 +15426,7 @@
         <w:t xml:space="preserve">-&gt; </w:t>
       </w:r>
       <w:proofErr w:type="spellStart"/>
+      <w:proofErr w:type="gramStart"/>
       <w:r>
         <w:rPr>
           <w:spacing w:val="-8"/>
@@ -14624,6 +15443,7 @@
         <w:t xml:space="preserve">  (</w:t>
       </w:r>
       <w:proofErr w:type="spellStart"/>
+      <w:proofErr w:type="gramEnd"/>
       <w:r>
         <w:rPr>
           <w:spacing w:val="-8"/>
@@ -14721,6 +15541,7 @@
         <w:t xml:space="preserve"> </w:t>
       </w:r>
       <w:proofErr w:type="spellStart"/>
+      <w:proofErr w:type="gramStart"/>
       <w:r>
         <w:rPr>
           <w:spacing w:val="-8"/>
@@ -14737,6 +15558,7 @@
         <w:t xml:space="preserve">  (</w:t>
       </w:r>
       <w:proofErr w:type="spellStart"/>
+      <w:proofErr w:type="gramEnd"/>
       <w:r>
         <w:rPr>
           <w:spacing w:val="-8"/>
@@ -14878,9 +15700,9 @@
           <w:sz w:val="16"/>
           <w:highlight w:val="yellow"/>
         </w:rPr>
-        <w:t>(s)  (</w:t>
-      </w:r>
-      <w:proofErr w:type="spellStart"/>
+        <w:t>(</w:t>
+      </w:r>
+      <w:proofErr w:type="gramStart"/>
       <w:r>
         <w:rPr>
           <w:b/>
@@ -14890,9 +15712,10 @@
           <w:sz w:val="16"/>
           <w:highlight w:val="yellow"/>
         </w:rPr>
-        <w:t>cost</w:t>
-      </w:r>
-      <w:proofErr w:type="spellEnd"/>
+        <w:t>s)  (</w:t>
+      </w:r>
+      <w:proofErr w:type="spellStart"/>
+      <w:proofErr w:type="gramEnd"/>
       <w:r>
         <w:rPr>
           <w:b/>
@@ -14902,9 +15725,9 @@
           <w:sz w:val="16"/>
           <w:highlight w:val="yellow"/>
         </w:rPr>
-        <w:t xml:space="preserve">=2.25 </w:t>
-      </w:r>
-      <w:proofErr w:type="spellStart"/>
+        <w:t>cost</w:t>
+      </w:r>
+      <w:proofErr w:type="spellEnd"/>
       <w:r>
         <w:rPr>
           <w:b/>
@@ -14914,9 +15737,9 @@
           <w:sz w:val="16"/>
           <w:highlight w:val="yellow"/>
         </w:rPr>
-        <w:t>rows</w:t>
-      </w:r>
-      <w:proofErr w:type="spellEnd"/>
+        <w:t xml:space="preserve">=2.25 </w:t>
+      </w:r>
+      <w:proofErr w:type="spellStart"/>
       <w:r>
         <w:rPr>
           <w:b/>
@@ -14926,9 +15749,9 @@
           <w:sz w:val="16"/>
           <w:highlight w:val="yellow"/>
         </w:rPr>
-        <w:t xml:space="preserve">=1) (actual time=0.105..0.106 </w:t>
-      </w:r>
-      <w:proofErr w:type="spellStart"/>
+        <w:t>rows</w:t>
+      </w:r>
+      <w:proofErr w:type="spellEnd"/>
       <w:r>
         <w:rPr>
           <w:b/>
@@ -14938,9 +15761,9 @@
           <w:sz w:val="16"/>
           <w:highlight w:val="yellow"/>
         </w:rPr>
-        <w:t>rows</w:t>
-      </w:r>
-      <w:proofErr w:type="spellEnd"/>
+        <w:t xml:space="preserve">=1) (actual time=0.105..0.106 </w:t>
+      </w:r>
+      <w:proofErr w:type="spellStart"/>
       <w:r>
         <w:rPr>
           <w:b/>
@@ -14950,9 +15773,9 @@
           <w:sz w:val="16"/>
           <w:highlight w:val="yellow"/>
         </w:rPr>
-        <w:t xml:space="preserve">=1 </w:t>
-      </w:r>
-      <w:proofErr w:type="spellStart"/>
+        <w:t>rows</w:t>
+      </w:r>
+      <w:proofErr w:type="spellEnd"/>
       <w:r>
         <w:rPr>
           <w:b/>
@@ -14962,9 +15785,9 @@
           <w:sz w:val="16"/>
           <w:highlight w:val="yellow"/>
         </w:rPr>
-        <w:t>loops</w:t>
-      </w:r>
-      <w:proofErr w:type="spellEnd"/>
+        <w:t xml:space="preserve">=1 </w:t>
+      </w:r>
+      <w:proofErr w:type="spellStart"/>
       <w:r>
         <w:rPr>
           <w:b/>
@@ -14974,419 +15797,9 @@
           <w:sz w:val="16"/>
           <w:highlight w:val="yellow"/>
         </w:rPr>
-        <w:t>=1)</w:t>
-      </w:r>
-    </w:p>
-    <w:p>
-      <w:pPr>
-        <w:pStyle w:val="Prrafocdigo"/>
-        <w:ind w:firstLine="142"/>
-        <w:rPr>
-          <w:spacing w:val="-8"/>
-          <w:sz w:val="16"/>
-        </w:rPr>
-      </w:pPr>
-      <w:r>
-        <w:rPr>
-          <w:spacing w:val="-8"/>
-          <w:sz w:val="16"/>
-        </w:rPr>
-        <w:t xml:space="preserve">      -&gt; </w:t>
-      </w:r>
-      <w:proofErr w:type="spellStart"/>
-      <w:r>
-        <w:rPr>
-          <w:spacing w:val="-8"/>
-          <w:sz w:val="16"/>
-        </w:rPr>
-        <w:t>Sort</w:t>
+        <w:t>loops</w:t>
       </w:r>
       <w:proofErr w:type="spellEnd"/>
-      <w:r>
-        <w:rPr>
-          <w:spacing w:val="-8"/>
-          <w:sz w:val="16"/>
-        </w:rPr>
-        <w:t xml:space="preserve">: ra_1_5_books.price DESC, </w:t>
-      </w:r>
-      <w:proofErr w:type="spellStart"/>
-      <w:r>
-        <w:rPr>
-          <w:spacing w:val="-8"/>
-          <w:sz w:val="16"/>
-        </w:rPr>
-        <w:t>limit</w:t>
-      </w:r>
-      <w:proofErr w:type="spellEnd"/>
-      <w:r>
-        <w:rPr>
-          <w:spacing w:val="-8"/>
-          <w:sz w:val="16"/>
-        </w:rPr>
-        <w:t xml:space="preserve"> input </w:t>
-      </w:r>
-      <w:proofErr w:type="spellStart"/>
-      <w:r>
-        <w:rPr>
-          <w:spacing w:val="-8"/>
-          <w:sz w:val="16"/>
-        </w:rPr>
-        <w:t>to</w:t>
-      </w:r>
-      <w:proofErr w:type="spellEnd"/>
-      <w:r>
-        <w:rPr>
-          <w:spacing w:val="-8"/>
-          <w:sz w:val="16"/>
-        </w:rPr>
-        <w:t xml:space="preserve"> 1 </w:t>
-      </w:r>
-      <w:proofErr w:type="spellStart"/>
-      <w:r>
-        <w:rPr>
-          <w:spacing w:val="-8"/>
-          <w:sz w:val="16"/>
-        </w:rPr>
-        <w:t>row</w:t>
-      </w:r>
-      <w:proofErr w:type="spellEnd"/>
-      <w:r>
-        <w:rPr>
-          <w:spacing w:val="-8"/>
-          <w:sz w:val="16"/>
-        </w:rPr>
-        <w:t xml:space="preserve">(s) per </w:t>
-      </w:r>
-      <w:proofErr w:type="spellStart"/>
-      <w:r>
-        <w:rPr>
-          <w:spacing w:val="-8"/>
-          <w:sz w:val="16"/>
-        </w:rPr>
-        <w:t>chunk</w:t>
-      </w:r>
-      <w:proofErr w:type="spellEnd"/>
-      <w:r>
-        <w:rPr>
-          <w:spacing w:val="-8"/>
-          <w:sz w:val="16"/>
-        </w:rPr>
-        <w:t xml:space="preserve">  (</w:t>
-      </w:r>
-      <w:proofErr w:type="spellStart"/>
-      <w:r>
-        <w:rPr>
-          <w:spacing w:val="-8"/>
-          <w:sz w:val="16"/>
-        </w:rPr>
-        <w:t>cost</w:t>
-      </w:r>
-      <w:proofErr w:type="spellEnd"/>
-      <w:r>
-        <w:rPr>
-          <w:spacing w:val="-8"/>
-          <w:sz w:val="16"/>
-        </w:rPr>
-        <w:t xml:space="preserve">=2.25 </w:t>
-      </w:r>
-      <w:proofErr w:type="spellStart"/>
-      <w:r>
-        <w:rPr>
-          <w:spacing w:val="-8"/>
-          <w:sz w:val="16"/>
-        </w:rPr>
-        <w:t>rows</w:t>
-      </w:r>
-      <w:proofErr w:type="spellEnd"/>
-      <w:r>
-        <w:rPr>
-          <w:spacing w:val="-8"/>
-          <w:sz w:val="16"/>
-        </w:rPr>
-        <w:t xml:space="preserve">=20) (actual </w:t>
-      </w:r>
-    </w:p>
-    <w:p>
-      <w:pPr>
-        <w:pStyle w:val="Prrafocdigo"/>
-        <w:ind w:firstLine="851"/>
-        <w:rPr>
-          <w:spacing w:val="-8"/>
-          <w:sz w:val="16"/>
-        </w:rPr>
-      </w:pPr>
-      <w:r>
-        <w:rPr>
-          <w:spacing w:val="-8"/>
-          <w:sz w:val="16"/>
-        </w:rPr>
-        <w:t xml:space="preserve">time=0.105..0.105 </w:t>
-      </w:r>
-      <w:proofErr w:type="spellStart"/>
-      <w:r>
-        <w:rPr>
-          <w:spacing w:val="-8"/>
-          <w:sz w:val="16"/>
-        </w:rPr>
-        <w:t>rows</w:t>
-      </w:r>
-      <w:proofErr w:type="spellEnd"/>
-      <w:r>
-        <w:rPr>
-          <w:spacing w:val="-8"/>
-          <w:sz w:val="16"/>
-        </w:rPr>
-        <w:t xml:space="preserve">=1 </w:t>
-      </w:r>
-      <w:proofErr w:type="spellStart"/>
-      <w:r>
-        <w:rPr>
-          <w:spacing w:val="-8"/>
-          <w:sz w:val="16"/>
-        </w:rPr>
-        <w:t>loops</w:t>
-      </w:r>
-      <w:proofErr w:type="spellEnd"/>
-      <w:r>
-        <w:rPr>
-          <w:spacing w:val="-8"/>
-          <w:sz w:val="16"/>
-        </w:rPr>
-        <w:t>=1)</w:t>
-      </w:r>
-    </w:p>
-    <w:p>
-      <w:pPr>
-        <w:pStyle w:val="Prrafocdigo"/>
-        <w:ind w:firstLine="284"/>
-        <w:rPr>
-          <w:spacing w:val="-8"/>
-          <w:sz w:val="16"/>
-        </w:rPr>
-      </w:pPr>
-      <w:r>
-        <w:rPr>
-          <w:spacing w:val="-8"/>
-          <w:sz w:val="16"/>
-        </w:rPr>
-        <w:t xml:space="preserve">        -&gt; Table </w:t>
-      </w:r>
-      <w:proofErr w:type="spellStart"/>
-      <w:r>
-        <w:rPr>
-          <w:spacing w:val="-8"/>
-          <w:sz w:val="16"/>
-        </w:rPr>
-        <w:t>scan</w:t>
-      </w:r>
-      <w:proofErr w:type="spellEnd"/>
-      <w:r>
-        <w:rPr>
-          <w:spacing w:val="-8"/>
-          <w:sz w:val="16"/>
-        </w:rPr>
-        <w:t xml:space="preserve"> on ra_1_5_books  (</w:t>
-      </w:r>
-      <w:proofErr w:type="spellStart"/>
-      <w:r>
-        <w:rPr>
-          <w:spacing w:val="-8"/>
-          <w:sz w:val="16"/>
-        </w:rPr>
-        <w:t>cost</w:t>
-      </w:r>
-      <w:proofErr w:type="spellEnd"/>
-      <w:r>
-        <w:rPr>
-          <w:spacing w:val="-8"/>
-          <w:sz w:val="16"/>
-        </w:rPr>
-        <w:t xml:space="preserve">=2.25 </w:t>
-      </w:r>
-      <w:proofErr w:type="spellStart"/>
-      <w:r>
-        <w:rPr>
-          <w:spacing w:val="-8"/>
-          <w:sz w:val="16"/>
-        </w:rPr>
-        <w:t>rows</w:t>
-      </w:r>
-      <w:proofErr w:type="spellEnd"/>
-      <w:r>
-        <w:rPr>
-          <w:spacing w:val="-8"/>
-          <w:sz w:val="16"/>
-        </w:rPr>
-        <w:t xml:space="preserve">=20) (actual time=0.0498..0.0646 </w:t>
-      </w:r>
-      <w:proofErr w:type="spellStart"/>
-      <w:r>
-        <w:rPr>
-          <w:spacing w:val="-8"/>
-          <w:sz w:val="16"/>
-        </w:rPr>
-        <w:t>rows</w:t>
-      </w:r>
-      <w:proofErr w:type="spellEnd"/>
-      <w:r>
-        <w:rPr>
-          <w:spacing w:val="-8"/>
-          <w:sz w:val="16"/>
-        </w:rPr>
-        <w:t xml:space="preserve">=20 </w:t>
-      </w:r>
-      <w:proofErr w:type="spellStart"/>
-      <w:r>
-        <w:rPr>
-          <w:spacing w:val="-8"/>
-          <w:sz w:val="16"/>
-        </w:rPr>
-        <w:t>loops</w:t>
-      </w:r>
-      <w:proofErr w:type="spellEnd"/>
-      <w:r>
-        <w:rPr>
-          <w:spacing w:val="-8"/>
-          <w:sz w:val="16"/>
-        </w:rPr>
-        <w:t>=1)</w:t>
-      </w:r>
-    </w:p>
-    <w:p>
-      <w:pPr>
-        <w:pStyle w:val="Prrafocdigo"/>
-        <w:ind w:firstLine="284"/>
-        <w:rPr>
-          <w:spacing w:val="-8"/>
-          <w:sz w:val="16"/>
-        </w:rPr>
-      </w:pPr>
-      <w:r>
-        <w:rPr>
-          <w:spacing w:val="-8"/>
-          <w:sz w:val="16"/>
-        </w:rPr>
-        <w:t xml:space="preserve">  -&gt; </w:t>
-      </w:r>
-      <w:proofErr w:type="spellStart"/>
-      <w:r>
-        <w:rPr>
-          <w:spacing w:val="-8"/>
-          <w:sz w:val="16"/>
-        </w:rPr>
-        <w:t>Stream</w:t>
-      </w:r>
-      <w:proofErr w:type="spellEnd"/>
-      <w:r>
-        <w:rPr>
-          <w:spacing w:val="-8"/>
-          <w:sz w:val="16"/>
-        </w:rPr>
-        <w:t xml:space="preserve"> </w:t>
-      </w:r>
-      <w:proofErr w:type="spellStart"/>
-      <w:r>
-        <w:rPr>
-          <w:spacing w:val="-8"/>
-          <w:sz w:val="16"/>
-        </w:rPr>
-        <w:t>results</w:t>
-      </w:r>
-      <w:proofErr w:type="spellEnd"/>
-      <w:r>
-        <w:rPr>
-          <w:spacing w:val="-8"/>
-          <w:sz w:val="16"/>
-        </w:rPr>
-        <w:t xml:space="preserve">  (</w:t>
-      </w:r>
-      <w:proofErr w:type="spellStart"/>
-      <w:r>
-        <w:rPr>
-          <w:spacing w:val="-8"/>
-          <w:sz w:val="16"/>
-        </w:rPr>
-        <w:t>cost</w:t>
-      </w:r>
-      <w:proofErr w:type="spellEnd"/>
-      <w:r>
-        <w:rPr>
-          <w:spacing w:val="-8"/>
-          <w:sz w:val="16"/>
-        </w:rPr>
-        <w:t xml:space="preserve">=2.25 </w:t>
-      </w:r>
-      <w:proofErr w:type="spellStart"/>
-      <w:r>
-        <w:rPr>
-          <w:spacing w:val="-8"/>
-          <w:sz w:val="16"/>
-        </w:rPr>
-        <w:t>rows</w:t>
-      </w:r>
-      <w:proofErr w:type="spellEnd"/>
-      <w:r>
-        <w:rPr>
-          <w:spacing w:val="-8"/>
-          <w:sz w:val="16"/>
-        </w:rPr>
-        <w:t xml:space="preserve">=1) (actual time=0.0294..0.0295 </w:t>
-      </w:r>
-      <w:proofErr w:type="spellStart"/>
-      <w:r>
-        <w:rPr>
-          <w:spacing w:val="-8"/>
-          <w:sz w:val="16"/>
-        </w:rPr>
-        <w:t>rows</w:t>
-      </w:r>
-      <w:proofErr w:type="spellEnd"/>
-      <w:r>
-        <w:rPr>
-          <w:spacing w:val="-8"/>
-          <w:sz w:val="16"/>
-        </w:rPr>
-        <w:t xml:space="preserve">=1 </w:t>
-      </w:r>
-      <w:proofErr w:type="spellStart"/>
-      <w:r>
-        <w:rPr>
-          <w:spacing w:val="-8"/>
-          <w:sz w:val="16"/>
-        </w:rPr>
-        <w:t>loops</w:t>
-      </w:r>
-      <w:proofErr w:type="spellEnd"/>
-      <w:r>
-        <w:rPr>
-          <w:spacing w:val="-8"/>
-          <w:sz w:val="16"/>
-        </w:rPr>
-        <w:t>=1)</w:t>
-      </w:r>
-    </w:p>
-    <w:p>
-      <w:pPr>
-        <w:pStyle w:val="Prrafocdigo"/>
-        <w:ind w:firstLine="284"/>
-        <w:rPr>
-          <w:b/>
-          <w:bCs/>
-          <w:color w:val="0D0D0D" w:themeColor="text1" w:themeTint="F2"/>
-          <w:spacing w:val="-8"/>
-          <w:sz w:val="16"/>
-        </w:rPr>
-      </w:pPr>
-      <w:r>
-        <w:rPr>
-          <w:b/>
-          <w:bCs/>
-          <w:color w:val="0D0D0D" w:themeColor="text1" w:themeTint="F2"/>
-          <w:spacing w:val="-8"/>
-          <w:sz w:val="16"/>
-        </w:rPr>
-        <w:t xml:space="preserve">    -</w:t>
-      </w:r>
       <w:r>
         <w:rPr>
           <w:b/>
@@ -15396,9 +15809,462 @@
           <w:sz w:val="16"/>
           <w:highlight w:val="yellow"/>
         </w:rPr>
-        <w:t xml:space="preserve">&gt; </w:t>
+        <w:t>=1)</w:t>
+      </w:r>
+    </w:p>
+    <w:p>
+      <w:pPr>
+        <w:pStyle w:val="Prrafocdigo"/>
+        <w:ind w:firstLine="142"/>
+        <w:rPr>
+          <w:spacing w:val="-8"/>
+          <w:sz w:val="16"/>
+        </w:rPr>
+      </w:pPr>
+      <w:r>
+        <w:rPr>
+          <w:spacing w:val="-8"/>
+          <w:sz w:val="16"/>
+        </w:rPr>
+        <w:t xml:space="preserve">      -&gt; </w:t>
       </w:r>
       <w:proofErr w:type="spellStart"/>
+      <w:r>
+        <w:rPr>
+          <w:spacing w:val="-8"/>
+          <w:sz w:val="16"/>
+        </w:rPr>
+        <w:t>Sort</w:t>
+      </w:r>
+      <w:proofErr w:type="spellEnd"/>
+      <w:r>
+        <w:rPr>
+          <w:spacing w:val="-8"/>
+          <w:sz w:val="16"/>
+        </w:rPr>
+        <w:t>: ra_1_5_</w:t>
+      </w:r>
+      <w:proofErr w:type="gramStart"/>
+      <w:r>
+        <w:rPr>
+          <w:spacing w:val="-8"/>
+          <w:sz w:val="16"/>
+        </w:rPr>
+        <w:t>books.price</w:t>
+      </w:r>
+      <w:proofErr w:type="gramEnd"/>
+      <w:r>
+        <w:rPr>
+          <w:spacing w:val="-8"/>
+          <w:sz w:val="16"/>
+        </w:rPr>
+        <w:t xml:space="preserve"> DESC, </w:t>
+      </w:r>
+      <w:proofErr w:type="spellStart"/>
+      <w:r>
+        <w:rPr>
+          <w:spacing w:val="-8"/>
+          <w:sz w:val="16"/>
+        </w:rPr>
+        <w:t>limit</w:t>
+      </w:r>
+      <w:proofErr w:type="spellEnd"/>
+      <w:r>
+        <w:rPr>
+          <w:spacing w:val="-8"/>
+          <w:sz w:val="16"/>
+        </w:rPr>
+        <w:t xml:space="preserve"> input </w:t>
+      </w:r>
+      <w:proofErr w:type="spellStart"/>
+      <w:r>
+        <w:rPr>
+          <w:spacing w:val="-8"/>
+          <w:sz w:val="16"/>
+        </w:rPr>
+        <w:t>to</w:t>
+      </w:r>
+      <w:proofErr w:type="spellEnd"/>
+      <w:r>
+        <w:rPr>
+          <w:spacing w:val="-8"/>
+          <w:sz w:val="16"/>
+        </w:rPr>
+        <w:t xml:space="preserve"> 1 </w:t>
+      </w:r>
+      <w:proofErr w:type="spellStart"/>
+      <w:r>
+        <w:rPr>
+          <w:spacing w:val="-8"/>
+          <w:sz w:val="16"/>
+        </w:rPr>
+        <w:t>row</w:t>
+      </w:r>
+      <w:proofErr w:type="spellEnd"/>
+      <w:r>
+        <w:rPr>
+          <w:spacing w:val="-8"/>
+          <w:sz w:val="16"/>
+        </w:rPr>
+        <w:t xml:space="preserve">(s) per </w:t>
+      </w:r>
+      <w:proofErr w:type="spellStart"/>
+      <w:r>
+        <w:rPr>
+          <w:spacing w:val="-8"/>
+          <w:sz w:val="16"/>
+        </w:rPr>
+        <w:t>chunk</w:t>
+      </w:r>
+      <w:proofErr w:type="spellEnd"/>
+      <w:r>
+        <w:rPr>
+          <w:spacing w:val="-8"/>
+          <w:sz w:val="16"/>
+        </w:rPr>
+        <w:t xml:space="preserve">  (</w:t>
+      </w:r>
+      <w:proofErr w:type="spellStart"/>
+      <w:r>
+        <w:rPr>
+          <w:spacing w:val="-8"/>
+          <w:sz w:val="16"/>
+        </w:rPr>
+        <w:t>cost</w:t>
+      </w:r>
+      <w:proofErr w:type="spellEnd"/>
+      <w:r>
+        <w:rPr>
+          <w:spacing w:val="-8"/>
+          <w:sz w:val="16"/>
+        </w:rPr>
+        <w:t xml:space="preserve">=2.25 </w:t>
+      </w:r>
+      <w:proofErr w:type="spellStart"/>
+      <w:r>
+        <w:rPr>
+          <w:spacing w:val="-8"/>
+          <w:sz w:val="16"/>
+        </w:rPr>
+        <w:t>rows</w:t>
+      </w:r>
+      <w:proofErr w:type="spellEnd"/>
+      <w:r>
+        <w:rPr>
+          <w:spacing w:val="-8"/>
+          <w:sz w:val="16"/>
+        </w:rPr>
+        <w:t xml:space="preserve">=20) (actual </w:t>
+      </w:r>
+    </w:p>
+    <w:p>
+      <w:pPr>
+        <w:pStyle w:val="Prrafocdigo"/>
+        <w:ind w:firstLine="851"/>
+        <w:rPr>
+          <w:spacing w:val="-8"/>
+          <w:sz w:val="16"/>
+        </w:rPr>
+      </w:pPr>
+      <w:r>
+        <w:rPr>
+          <w:spacing w:val="-8"/>
+          <w:sz w:val="16"/>
+        </w:rPr>
+        <w:t>time=</w:t>
+      </w:r>
+      <w:proofErr w:type="gramStart"/>
+      <w:r>
+        <w:rPr>
+          <w:spacing w:val="-8"/>
+          <w:sz w:val="16"/>
+        </w:rPr>
+        <w:t>0.105..</w:t>
+      </w:r>
+      <w:proofErr w:type="gramEnd"/>
+      <w:r>
+        <w:rPr>
+          <w:spacing w:val="-8"/>
+          <w:sz w:val="16"/>
+        </w:rPr>
+        <w:t xml:space="preserve">0.105 </w:t>
+      </w:r>
+      <w:proofErr w:type="spellStart"/>
+      <w:r>
+        <w:rPr>
+          <w:spacing w:val="-8"/>
+          <w:sz w:val="16"/>
+        </w:rPr>
+        <w:t>rows</w:t>
+      </w:r>
+      <w:proofErr w:type="spellEnd"/>
+      <w:r>
+        <w:rPr>
+          <w:spacing w:val="-8"/>
+          <w:sz w:val="16"/>
+        </w:rPr>
+        <w:t xml:space="preserve">=1 </w:t>
+      </w:r>
+      <w:proofErr w:type="spellStart"/>
+      <w:r>
+        <w:rPr>
+          <w:spacing w:val="-8"/>
+          <w:sz w:val="16"/>
+        </w:rPr>
+        <w:t>loops</w:t>
+      </w:r>
+      <w:proofErr w:type="spellEnd"/>
+      <w:r>
+        <w:rPr>
+          <w:spacing w:val="-8"/>
+          <w:sz w:val="16"/>
+        </w:rPr>
+        <w:t>=1)</w:t>
+      </w:r>
+    </w:p>
+    <w:p>
+      <w:pPr>
+        <w:pStyle w:val="Prrafocdigo"/>
+        <w:ind w:firstLine="284"/>
+        <w:rPr>
+          <w:spacing w:val="-8"/>
+          <w:sz w:val="16"/>
+        </w:rPr>
+      </w:pPr>
+      <w:r>
+        <w:rPr>
+          <w:spacing w:val="-8"/>
+          <w:sz w:val="16"/>
+        </w:rPr>
+        <w:t xml:space="preserve">        -&gt; Table </w:t>
+      </w:r>
+      <w:proofErr w:type="spellStart"/>
+      <w:r>
+        <w:rPr>
+          <w:spacing w:val="-8"/>
+          <w:sz w:val="16"/>
+        </w:rPr>
+        <w:t>scan</w:t>
+      </w:r>
+      <w:proofErr w:type="spellEnd"/>
+      <w:r>
+        <w:rPr>
+          <w:spacing w:val="-8"/>
+          <w:sz w:val="16"/>
+        </w:rPr>
+        <w:t xml:space="preserve"> on ra_1_5_</w:t>
+      </w:r>
+      <w:proofErr w:type="gramStart"/>
+      <w:r>
+        <w:rPr>
+          <w:spacing w:val="-8"/>
+          <w:sz w:val="16"/>
+        </w:rPr>
+        <w:t>books  (</w:t>
+      </w:r>
+      <w:proofErr w:type="spellStart"/>
+      <w:proofErr w:type="gramEnd"/>
+      <w:r>
+        <w:rPr>
+          <w:spacing w:val="-8"/>
+          <w:sz w:val="16"/>
+        </w:rPr>
+        <w:t>cost</w:t>
+      </w:r>
+      <w:proofErr w:type="spellEnd"/>
+      <w:r>
+        <w:rPr>
+          <w:spacing w:val="-8"/>
+          <w:sz w:val="16"/>
+        </w:rPr>
+        <w:t xml:space="preserve">=2.25 </w:t>
+      </w:r>
+      <w:proofErr w:type="spellStart"/>
+      <w:r>
+        <w:rPr>
+          <w:spacing w:val="-8"/>
+          <w:sz w:val="16"/>
+        </w:rPr>
+        <w:t>rows</w:t>
+      </w:r>
+      <w:proofErr w:type="spellEnd"/>
+      <w:r>
+        <w:rPr>
+          <w:spacing w:val="-8"/>
+          <w:sz w:val="16"/>
+        </w:rPr>
+        <w:t xml:space="preserve">=20) (actual time=0.0498..0.0646 </w:t>
+      </w:r>
+      <w:proofErr w:type="spellStart"/>
+      <w:r>
+        <w:rPr>
+          <w:spacing w:val="-8"/>
+          <w:sz w:val="16"/>
+        </w:rPr>
+        <w:t>rows</w:t>
+      </w:r>
+      <w:proofErr w:type="spellEnd"/>
+      <w:r>
+        <w:rPr>
+          <w:spacing w:val="-8"/>
+          <w:sz w:val="16"/>
+        </w:rPr>
+        <w:t xml:space="preserve">=20 </w:t>
+      </w:r>
+      <w:proofErr w:type="spellStart"/>
+      <w:r>
+        <w:rPr>
+          <w:spacing w:val="-8"/>
+          <w:sz w:val="16"/>
+        </w:rPr>
+        <w:t>loops</w:t>
+      </w:r>
+      <w:proofErr w:type="spellEnd"/>
+      <w:r>
+        <w:rPr>
+          <w:spacing w:val="-8"/>
+          <w:sz w:val="16"/>
+        </w:rPr>
+        <w:t>=1)</w:t>
+      </w:r>
+    </w:p>
+    <w:p>
+      <w:pPr>
+        <w:pStyle w:val="Prrafocdigo"/>
+        <w:ind w:firstLine="284"/>
+        <w:rPr>
+          <w:spacing w:val="-8"/>
+          <w:sz w:val="16"/>
+        </w:rPr>
+      </w:pPr>
+      <w:r>
+        <w:rPr>
+          <w:spacing w:val="-8"/>
+          <w:sz w:val="16"/>
+        </w:rPr>
+        <w:t xml:space="preserve">  -&gt; </w:t>
+      </w:r>
+      <w:proofErr w:type="spellStart"/>
+      <w:r>
+        <w:rPr>
+          <w:spacing w:val="-8"/>
+          <w:sz w:val="16"/>
+        </w:rPr>
+        <w:t>Stream</w:t>
+      </w:r>
+      <w:proofErr w:type="spellEnd"/>
+      <w:r>
+        <w:rPr>
+          <w:spacing w:val="-8"/>
+          <w:sz w:val="16"/>
+        </w:rPr>
+        <w:t xml:space="preserve"> </w:t>
+      </w:r>
+      <w:proofErr w:type="spellStart"/>
+      <w:proofErr w:type="gramStart"/>
+      <w:r>
+        <w:rPr>
+          <w:spacing w:val="-8"/>
+          <w:sz w:val="16"/>
+        </w:rPr>
+        <w:t>results</w:t>
+      </w:r>
+      <w:proofErr w:type="spellEnd"/>
+      <w:r>
+        <w:rPr>
+          <w:spacing w:val="-8"/>
+          <w:sz w:val="16"/>
+        </w:rPr>
+        <w:t xml:space="preserve">  (</w:t>
+      </w:r>
+      <w:proofErr w:type="spellStart"/>
+      <w:proofErr w:type="gramEnd"/>
+      <w:r>
+        <w:rPr>
+          <w:spacing w:val="-8"/>
+          <w:sz w:val="16"/>
+        </w:rPr>
+        <w:t>cost</w:t>
+      </w:r>
+      <w:proofErr w:type="spellEnd"/>
+      <w:r>
+        <w:rPr>
+          <w:spacing w:val="-8"/>
+          <w:sz w:val="16"/>
+        </w:rPr>
+        <w:t xml:space="preserve">=2.25 </w:t>
+      </w:r>
+      <w:proofErr w:type="spellStart"/>
+      <w:r>
+        <w:rPr>
+          <w:spacing w:val="-8"/>
+          <w:sz w:val="16"/>
+        </w:rPr>
+        <w:t>rows</w:t>
+      </w:r>
+      <w:proofErr w:type="spellEnd"/>
+      <w:r>
+        <w:rPr>
+          <w:spacing w:val="-8"/>
+          <w:sz w:val="16"/>
+        </w:rPr>
+        <w:t xml:space="preserve">=1) (actual time=0.0294..0.0295 </w:t>
+      </w:r>
+      <w:proofErr w:type="spellStart"/>
+      <w:r>
+        <w:rPr>
+          <w:spacing w:val="-8"/>
+          <w:sz w:val="16"/>
+        </w:rPr>
+        <w:t>rows</w:t>
+      </w:r>
+      <w:proofErr w:type="spellEnd"/>
+      <w:r>
+        <w:rPr>
+          <w:spacing w:val="-8"/>
+          <w:sz w:val="16"/>
+        </w:rPr>
+        <w:t xml:space="preserve">=1 </w:t>
+      </w:r>
+      <w:proofErr w:type="spellStart"/>
+      <w:r>
+        <w:rPr>
+          <w:spacing w:val="-8"/>
+          <w:sz w:val="16"/>
+        </w:rPr>
+        <w:t>loops</w:t>
+      </w:r>
+      <w:proofErr w:type="spellEnd"/>
+      <w:r>
+        <w:rPr>
+          <w:spacing w:val="-8"/>
+          <w:sz w:val="16"/>
+        </w:rPr>
+        <w:t>=1)</w:t>
+      </w:r>
+    </w:p>
+    <w:p>
+      <w:pPr>
+        <w:pStyle w:val="Prrafocdigo"/>
+        <w:ind w:firstLine="284"/>
+        <w:rPr>
+          <w:b/>
+          <w:bCs/>
+          <w:color w:val="0D0D0D" w:themeColor="text1" w:themeTint="F2"/>
+          <w:spacing w:val="-8"/>
+          <w:sz w:val="16"/>
+        </w:rPr>
+      </w:pPr>
+      <w:r>
+        <w:rPr>
+          <w:b/>
+          <w:bCs/>
+          <w:color w:val="0D0D0D" w:themeColor="text1" w:themeTint="F2"/>
+          <w:spacing w:val="-8"/>
+          <w:sz w:val="16"/>
+        </w:rPr>
+        <w:t xml:space="preserve">    -</w:t>
+      </w:r>
       <w:r>
         <w:rPr>
           <w:b/>
@@ -15408,9 +16274,9 @@
           <w:sz w:val="16"/>
           <w:highlight w:val="yellow"/>
         </w:rPr>
-        <w:t>Limit</w:t>
-      </w:r>
-      <w:proofErr w:type="spellEnd"/>
+        <w:t xml:space="preserve">&gt; </w:t>
+      </w:r>
+      <w:proofErr w:type="spellStart"/>
       <w:r>
         <w:rPr>
           <w:b/>
@@ -15420,9 +16286,9 @@
           <w:sz w:val="16"/>
           <w:highlight w:val="yellow"/>
         </w:rPr>
-        <w:t xml:space="preserve">: 1 </w:t>
-      </w:r>
-      <w:proofErr w:type="spellStart"/>
+        <w:t>Limit</w:t>
+      </w:r>
+      <w:proofErr w:type="spellEnd"/>
       <w:r>
         <w:rPr>
           <w:b/>
@@ -15432,9 +16298,9 @@
           <w:sz w:val="16"/>
           <w:highlight w:val="yellow"/>
         </w:rPr>
-        <w:t>row</w:t>
-      </w:r>
-      <w:proofErr w:type="spellEnd"/>
+        <w:t xml:space="preserve">: 1 </w:t>
+      </w:r>
+      <w:proofErr w:type="spellStart"/>
       <w:r>
         <w:rPr>
           <w:b/>
@@ -15444,9 +16310,9 @@
           <w:sz w:val="16"/>
           <w:highlight w:val="yellow"/>
         </w:rPr>
-        <w:t>(s)  (</w:t>
-      </w:r>
-      <w:proofErr w:type="spellStart"/>
+        <w:t>row</w:t>
+      </w:r>
+      <w:proofErr w:type="spellEnd"/>
       <w:r>
         <w:rPr>
           <w:b/>
@@ -15456,9 +16322,9 @@
           <w:sz w:val="16"/>
           <w:highlight w:val="yellow"/>
         </w:rPr>
-        <w:t>cost</w:t>
-      </w:r>
-      <w:proofErr w:type="spellEnd"/>
+        <w:t>(</w:t>
+      </w:r>
+      <w:proofErr w:type="gramStart"/>
       <w:r>
         <w:rPr>
           <w:b/>
@@ -15468,9 +16334,10 @@
           <w:sz w:val="16"/>
           <w:highlight w:val="yellow"/>
         </w:rPr>
-        <w:t xml:space="preserve">=2.25 </w:t>
+        <w:t>s)  (</w:t>
       </w:r>
       <w:proofErr w:type="spellStart"/>
+      <w:proofErr w:type="gramEnd"/>
       <w:r>
         <w:rPr>
           <w:b/>
@@ -15480,7 +16347,7 @@
           <w:sz w:val="16"/>
           <w:highlight w:val="yellow"/>
         </w:rPr>
-        <w:t>rows</w:t>
+        <w:t>cost</w:t>
       </w:r>
       <w:proofErr w:type="spellEnd"/>
       <w:r>
@@ -15492,7 +16359,7 @@
           <w:sz w:val="16"/>
           <w:highlight w:val="yellow"/>
         </w:rPr>
-        <w:t xml:space="preserve">=1) (actual time=0.0281..0.0281 </w:t>
+        <w:t xml:space="preserve">=2.25 </w:t>
       </w:r>
       <w:proofErr w:type="spellStart"/>
       <w:r>
@@ -15516,7 +16383,7 @@
           <w:sz w:val="16"/>
           <w:highlight w:val="yellow"/>
         </w:rPr>
-        <w:t xml:space="preserve">=1 </w:t>
+        <w:t xml:space="preserve">=1) (actual time=0.0281..0.0281 </w:t>
       </w:r>
       <w:proofErr w:type="spellStart"/>
       <w:r>
@@ -15528,7 +16395,7 @@
           <w:sz w:val="16"/>
           <w:highlight w:val="yellow"/>
         </w:rPr>
-        <w:t>loops</w:t>
+        <w:t>rows</w:t>
       </w:r>
       <w:proofErr w:type="spellEnd"/>
       <w:r>
@@ -15540,6 +16407,30 @@
           <w:sz w:val="16"/>
           <w:highlight w:val="yellow"/>
         </w:rPr>
+        <w:t xml:space="preserve">=1 </w:t>
+      </w:r>
+      <w:proofErr w:type="spellStart"/>
+      <w:r>
+        <w:rPr>
+          <w:b/>
+          <w:bCs/>
+          <w:color w:val="0D0D0D" w:themeColor="text1" w:themeTint="F2"/>
+          <w:spacing w:val="-8"/>
+          <w:sz w:val="16"/>
+          <w:highlight w:val="yellow"/>
+        </w:rPr>
+        <w:t>loops</w:t>
+      </w:r>
+      <w:proofErr w:type="spellEnd"/>
+      <w:r>
+        <w:rPr>
+          <w:b/>
+          <w:bCs/>
+          <w:color w:val="0D0D0D" w:themeColor="text1" w:themeTint="F2"/>
+          <w:spacing w:val="-8"/>
+          <w:sz w:val="16"/>
+          <w:highlight w:val="yellow"/>
+        </w:rPr>
         <w:t>=1)</w:t>
       </w:r>
     </w:p>
@@ -15573,23 +16464,23 @@
           <w:spacing w:val="-8"/>
           <w:sz w:val="16"/>
         </w:rPr>
-        <w:t xml:space="preserve">: ra_1_5_books.price, </w:t>
-      </w:r>
-      <w:proofErr w:type="spellStart"/>
+        <w:t>: ra_1_5_</w:t>
+      </w:r>
+      <w:proofErr w:type="gramStart"/>
       <w:r>
         <w:rPr>
           <w:spacing w:val="-8"/>
           <w:sz w:val="16"/>
         </w:rPr>
-        <w:t>limit</w:t>
-      </w:r>
-      <w:proofErr w:type="spellEnd"/>
+        <w:t>books.price</w:t>
+      </w:r>
+      <w:proofErr w:type="gramEnd"/>
       <w:r>
         <w:rPr>
           <w:spacing w:val="-8"/>
           <w:sz w:val="16"/>
         </w:rPr>
-        <w:t xml:space="preserve"> input </w:t>
+        <w:t xml:space="preserve">, </w:t>
       </w:r>
       <w:proofErr w:type="spellStart"/>
       <w:r>
@@ -15597,7 +16488,7 @@
           <w:spacing w:val="-8"/>
           <w:sz w:val="16"/>
         </w:rPr>
-        <w:t>to</w:t>
+        <w:t>limit</w:t>
       </w:r>
       <w:proofErr w:type="spellEnd"/>
       <w:r>
@@ -15605,7 +16496,7 @@
           <w:spacing w:val="-8"/>
           <w:sz w:val="16"/>
         </w:rPr>
-        <w:t xml:space="preserve"> 1 </w:t>
+        <w:t xml:space="preserve"> input </w:t>
       </w:r>
       <w:proofErr w:type="spellStart"/>
       <w:r>
@@ -15613,7 +16504,7 @@
           <w:spacing w:val="-8"/>
           <w:sz w:val="16"/>
         </w:rPr>
-        <w:t>row</w:t>
+        <w:t>to</w:t>
       </w:r>
       <w:proofErr w:type="spellEnd"/>
       <w:r>
@@ -15621,7 +16512,7 @@
           <w:spacing w:val="-8"/>
           <w:sz w:val="16"/>
         </w:rPr>
-        <w:t xml:space="preserve">(s) per </w:t>
+        <w:t xml:space="preserve"> 1 </w:t>
       </w:r>
       <w:proofErr w:type="spellStart"/>
       <w:r>
@@ -15629,7 +16520,7 @@
           <w:spacing w:val="-8"/>
           <w:sz w:val="16"/>
         </w:rPr>
-        <w:t>chunk</w:t>
+        <w:t>row</w:t>
       </w:r>
       <w:proofErr w:type="spellEnd"/>
       <w:r>
@@ -15637,7 +16528,7 @@
           <w:spacing w:val="-8"/>
           <w:sz w:val="16"/>
         </w:rPr>
-        <w:t xml:space="preserve">  (</w:t>
+        <w:t xml:space="preserve">(s) per </w:t>
       </w:r>
       <w:proofErr w:type="spellStart"/>
       <w:r>
@@ -15645,7 +16536,7 @@
           <w:spacing w:val="-8"/>
           <w:sz w:val="16"/>
         </w:rPr>
-        <w:t>cost</w:t>
+        <w:t>chunk</w:t>
       </w:r>
       <w:proofErr w:type="spellEnd"/>
       <w:r>
@@ -15653,7 +16544,7 @@
           <w:spacing w:val="-8"/>
           <w:sz w:val="16"/>
         </w:rPr>
-        <w:t xml:space="preserve">=2.25 </w:t>
+        <w:t xml:space="preserve">  (</w:t>
       </w:r>
       <w:proofErr w:type="spellStart"/>
       <w:r>
@@ -15661,7 +16552,7 @@
           <w:spacing w:val="-8"/>
           <w:sz w:val="16"/>
         </w:rPr>
-        <w:t>rows</w:t>
+        <w:t>cost</w:t>
       </w:r>
       <w:proofErr w:type="spellEnd"/>
       <w:r>
@@ -15669,6 +16560,22 @@
           <w:spacing w:val="-8"/>
           <w:sz w:val="16"/>
         </w:rPr>
+        <w:t xml:space="preserve">=2.25 </w:t>
+      </w:r>
+      <w:proofErr w:type="spellStart"/>
+      <w:r>
+        <w:rPr>
+          <w:spacing w:val="-8"/>
+          <w:sz w:val="16"/>
+        </w:rPr>
+        <w:t>rows</w:t>
+      </w:r>
+      <w:proofErr w:type="spellEnd"/>
+      <w:r>
+        <w:rPr>
+          <w:spacing w:val="-8"/>
+          <w:sz w:val="16"/>
+        </w:rPr>
         <w:t xml:space="preserve">=20) (actual </w:t>
       </w:r>
     </w:p>
@@ -15686,23 +16593,23 @@
           <w:spacing w:val="-8"/>
           <w:sz w:val="16"/>
         </w:rPr>
-        <w:t xml:space="preserve">time=0.0279..0.0279 </w:t>
-      </w:r>
-      <w:proofErr w:type="spellStart"/>
+        <w:t>time=</w:t>
+      </w:r>
+      <w:proofErr w:type="gramStart"/>
       <w:r>
         <w:rPr>
           <w:spacing w:val="-8"/>
           <w:sz w:val="16"/>
         </w:rPr>
-        <w:t>rows</w:t>
-      </w:r>
-      <w:proofErr w:type="spellEnd"/>
+        <w:t>0.0279..</w:t>
+      </w:r>
+      <w:proofErr w:type="gramEnd"/>
       <w:r>
         <w:rPr>
           <w:spacing w:val="-8"/>
           <w:sz w:val="16"/>
         </w:rPr>
-        <w:t xml:space="preserve">=1 </w:t>
+        <w:t xml:space="preserve">0.0279 </w:t>
       </w:r>
       <w:proofErr w:type="spellStart"/>
       <w:r>
@@ -15710,7 +16617,7 @@
           <w:spacing w:val="-8"/>
           <w:sz w:val="16"/>
         </w:rPr>
-        <w:t>loops</w:t>
+        <w:t>rows</w:t>
       </w:r>
       <w:proofErr w:type="spellEnd"/>
       <w:r>
@@ -15718,6 +16625,22 @@
           <w:spacing w:val="-8"/>
           <w:sz w:val="16"/>
         </w:rPr>
+        <w:t xml:space="preserve">=1 </w:t>
+      </w:r>
+      <w:proofErr w:type="spellStart"/>
+      <w:r>
+        <w:rPr>
+          <w:spacing w:val="-8"/>
+          <w:sz w:val="16"/>
+        </w:rPr>
+        <w:t>loops</w:t>
+      </w:r>
+      <w:proofErr w:type="spellEnd"/>
+      <w:r>
+        <w:rPr>
+          <w:spacing w:val="-8"/>
+          <w:sz w:val="16"/>
+        </w:rPr>
         <w:t>=1)</w:t>
       </w:r>
     </w:p>
@@ -15751,9 +16674,18 @@
           <w:spacing w:val="-8"/>
           <w:sz w:val="16"/>
         </w:rPr>
-        <w:t xml:space="preserve"> on ra_1_5_books  (</w:t>
+        <w:t xml:space="preserve"> on ra_1_5_</w:t>
+      </w:r>
+      <w:proofErr w:type="gramStart"/>
+      <w:r>
+        <w:rPr>
+          <w:spacing w:val="-8"/>
+          <w:sz w:val="16"/>
+        </w:rPr>
+        <w:t>books  (</w:t>
       </w:r>
       <w:proofErr w:type="spellStart"/>
+      <w:proofErr w:type="gramEnd"/>
       <w:r>
         <w:rPr>
           <w:spacing w:val="-8"/>
@@ -16183,8 +17115,8 @@
     </w:tbl>
     <w:p/>
     <w:sectPr>
-      <w:headerReference w:type="default" r:id="rId22"/>
-      <w:footerReference w:type="default" r:id="rId23"/>
+      <w:headerReference w:type="default" r:id="rId23"/>
+      <w:footerReference w:type="default" r:id="rId24"/>
       <w:pgSz w:w="11906" w:h="16838" w:code="9"/>
       <w:pgMar w:top="1134" w:right="1276" w:bottom="1134" w:left="1560" w:header="851" w:footer="0" w:gutter="0"/>
       <w:cols w:space="720"/>
@@ -46310,6 +47242,26 @@
 </file>
 
 <file path=customXml/item1.xml><?xml version="1.0" encoding="utf-8"?>
+<p:properties xmlns:p="http://schemas.microsoft.com/office/2006/metadata/properties" xmlns:xsi="http://www.w3.org/2001/XMLSchema-instance" xmlns:pc="http://schemas.microsoft.com/office/infopath/2007/PartnerControls">
+  <documentManagement>
+    <TaxCatchAll xmlns="227adb0e-e145-4f8b-90ea-eb65e1a44c1e" xsi:nil="true"/>
+    <lcf76f155ced4ddcb4097134ff3c332f xmlns="2a79d030-2667-4256-92b7-3b6a91b9ad15">
+      <Terms xmlns="http://schemas.microsoft.com/office/infopath/2007/PartnerControls"/>
+    </lcf76f155ced4ddcb4097134ff3c332f>
+  </documentManagement>
+</p:properties>
+</file>
+
+<file path=customXml/item2.xml><?xml version="1.0" encoding="utf-8"?>
+<?mso-contentType ?>
+<FormTemplates xmlns="http://schemas.microsoft.com/sharepoint/v3/contenttype/forms">
+  <Display>DocumentLibraryForm</Display>
+  <Edit>DocumentLibraryForm</Edit>
+  <New>DocumentLibraryForm</New>
+</FormTemplates>
+</file>
+
+<file path=customXml/item3.xml><?xml version="1.0" encoding="utf-8"?>
 <ct:contentTypeSchema xmlns:ct="http://schemas.microsoft.com/office/2006/metadata/contentType" xmlns:ma="http://schemas.microsoft.com/office/2006/metadata/properties/metaAttributes" ct:_="" ma:_="" ma:contentTypeName="Documento" ma:contentTypeID="0x01010019251492C0955F4D8B594C229DCC77C4" ma:contentTypeVersion="13" ma:contentTypeDescription="Crear nuevo documento." ma:contentTypeScope="" ma:versionID="727a4637a6c97d9119df4521e54c9509">
   <xsd:schema xmlns:xsd="http://www.w3.org/2001/XMLSchema" xmlns:xs="http://www.w3.org/2001/XMLSchema" xmlns:p="http://schemas.microsoft.com/office/2006/metadata/properties" xmlns:ns2="2a79d030-2667-4256-92b7-3b6a91b9ad15" xmlns:ns3="227adb0e-e145-4f8b-90ea-eb65e1a44c1e" targetNamespace="http://schemas.microsoft.com/office/2006/metadata/properties" ma:root="true" ma:fieldsID="bea3ee220e794811380c205cdba8a0a2" ns2:_="" ns3:_="">
     <xsd:import namespace="2a79d030-2667-4256-92b7-3b6a91b9ad15"/>
@@ -46510,31 +47462,30 @@
 </ct:contentTypeSchema>
 </file>
 
-<file path=customXml/item2.xml><?xml version="1.0" encoding="utf-8"?>
-<?mso-contentType ?>
-<FormTemplates xmlns="http://schemas.microsoft.com/sharepoint/v3/contenttype/forms">
-  <Display>DocumentLibraryForm</Display>
-  <Edit>DocumentLibraryForm</Edit>
-  <New>DocumentLibraryForm</New>
-</FormTemplates>
-</file>
-
-<file path=customXml/item3.xml><?xml version="1.0" encoding="utf-8"?>
-<p:properties xmlns:p="http://schemas.microsoft.com/office/2006/metadata/properties" xmlns:xsi="http://www.w3.org/2001/XMLSchema-instance" xmlns:pc="http://schemas.microsoft.com/office/infopath/2007/PartnerControls">
-  <documentManagement>
-    <TaxCatchAll xmlns="227adb0e-e145-4f8b-90ea-eb65e1a44c1e" xsi:nil="true"/>
-    <lcf76f155ced4ddcb4097134ff3c332f xmlns="2a79d030-2667-4256-92b7-3b6a91b9ad15">
-      <Terms xmlns="http://schemas.microsoft.com/office/infopath/2007/PartnerControls"/>
-    </lcf76f155ced4ddcb4097134ff3c332f>
-  </documentManagement>
-</p:properties>
-</file>
-
 <file path=customXml/item4.xml><?xml version="1.0" encoding="utf-8"?>
 <b:Sources xmlns:b="http://schemas.openxmlformats.org/officeDocument/2006/bibliography" xmlns="http://schemas.openxmlformats.org/officeDocument/2006/bibliography" SelectedStyle="/APASixthEditionOfficeOnline.xsl" StyleName="APA" Version="6"/>
 </file>
 
 <file path=customXml/itemProps1.xml><?xml version="1.0" encoding="utf-8"?>
+<ds:datastoreItem xmlns:ds="http://schemas.openxmlformats.org/officeDocument/2006/customXml" ds:itemID="{7852C20D-51FC-4930-9898-055FC3A1E1C2}">
+  <ds:schemaRefs>
+    <ds:schemaRef ds:uri="http://schemas.microsoft.com/office/2006/metadata/properties"/>
+    <ds:schemaRef ds:uri="http://schemas.microsoft.com/office/infopath/2007/PartnerControls"/>
+    <ds:schemaRef ds:uri="227adb0e-e145-4f8b-90ea-eb65e1a44c1e"/>
+    <ds:schemaRef ds:uri="2a79d030-2667-4256-92b7-3b6a91b9ad15"/>
+  </ds:schemaRefs>
+</ds:datastoreItem>
+</file>
+
+<file path=customXml/itemProps2.xml><?xml version="1.0" encoding="utf-8"?>
+<ds:datastoreItem xmlns:ds="http://schemas.openxmlformats.org/officeDocument/2006/customXml" ds:itemID="{B6BE38FB-EC05-4212-B7EC-321D23459051}">
+  <ds:schemaRefs>
+    <ds:schemaRef ds:uri="http://schemas.microsoft.com/sharepoint/v3/contenttype/forms"/>
+  </ds:schemaRefs>
+</ds:datastoreItem>
+</file>
+
+<file path=customXml/itemProps3.xml><?xml version="1.0" encoding="utf-8"?>
 <ds:datastoreItem xmlns:ds="http://schemas.openxmlformats.org/officeDocument/2006/customXml" ds:itemID="{3E8B727D-F80F-44EF-A1E2-F0CEF93CECDC}">
   <ds:schemaRefs>
     <ds:schemaRef ds:uri="http://schemas.microsoft.com/office/2006/metadata/contentType"/>
@@ -46553,25 +47504,6 @@
 </ds:datastoreItem>
 </file>
 
-<file path=customXml/itemProps2.xml><?xml version="1.0" encoding="utf-8"?>
-<ds:datastoreItem xmlns:ds="http://schemas.openxmlformats.org/officeDocument/2006/customXml" ds:itemID="{B6BE38FB-EC05-4212-B7EC-321D23459051}">
-  <ds:schemaRefs>
-    <ds:schemaRef ds:uri="http://schemas.microsoft.com/sharepoint/v3/contenttype/forms"/>
-  </ds:schemaRefs>
-</ds:datastoreItem>
-</file>
-
-<file path=customXml/itemProps3.xml><?xml version="1.0" encoding="utf-8"?>
-<ds:datastoreItem xmlns:ds="http://schemas.openxmlformats.org/officeDocument/2006/customXml" ds:itemID="{7852C20D-51FC-4930-9898-055FC3A1E1C2}">
-  <ds:schemaRefs>
-    <ds:schemaRef ds:uri="http://schemas.microsoft.com/office/2006/metadata/properties"/>
-    <ds:schemaRef ds:uri="http://schemas.microsoft.com/office/infopath/2007/PartnerControls"/>
-    <ds:schemaRef ds:uri="227adb0e-e145-4f8b-90ea-eb65e1a44c1e"/>
-    <ds:schemaRef ds:uri="2a79d030-2667-4256-92b7-3b6a91b9ad15"/>
-  </ds:schemaRefs>
-</ds:datastoreItem>
-</file>
-
 <file path=customXml/itemProps4.xml><?xml version="1.0" encoding="utf-8"?>
 <ds:datastoreItem xmlns:ds="http://schemas.openxmlformats.org/officeDocument/2006/customXml" ds:itemID="{379ED122-F39E-994E-A3E5-695406CF8956}">
   <ds:schemaRefs>

</xml_diff>

<commit_message>
Updating exercise 2.5, 'Implementa técnicas de limpieza de datos' is finished
</commit_message>
<xml_diff>
--- a/handover/doing/RA1/DCC-IABD_M04_ACT_OBL_02-DOING.docx
+++ b/handover/doing/RA1/DCC-IABD_M04_ACT_OBL_02-DOING.docx
@@ -276,7 +276,7 @@
           <w:noProof/>
         </w:rPr>
         <w:drawing>
-          <wp:anchor distT="0" distB="0" distL="114300" distR="114300" simplePos="0" relativeHeight="251653120" behindDoc="1" locked="0" layoutInCell="1" allowOverlap="1" wp14:anchorId="66831038" wp14:editId="2237C7D8">
+          <wp:anchor distT="0" distB="0" distL="114300" distR="114300" simplePos="0" relativeHeight="251653120" behindDoc="1" locked="0" layoutInCell="1" allowOverlap="1" wp14:anchorId="66831038" wp14:editId="07E8F3B4">
             <wp:simplePos x="0" y="0"/>
             <wp:positionH relativeFrom="column">
               <wp:posOffset>-1076325</wp:posOffset>
@@ -1725,7 +1725,23 @@
           <w:color w:val="auto"/>
           <w:u w:val="none"/>
         </w:rPr>
-        <w:t xml:space="preserve"> de valores atípicos (Outliers)</w:t>
+        <w:t xml:space="preserve"> de </w:t>
+      </w:r>
+      <w:r>
+        <w:rPr>
+          <w:rStyle w:val="Hipervnculo2"/>
+          <w:color w:val="auto"/>
+          <w:u w:val="none"/>
+        </w:rPr>
+        <w:t>v</w:t>
+      </w:r>
+      <w:r>
+        <w:rPr>
+          <w:rStyle w:val="Hipervnculo2"/>
+          <w:color w:val="auto"/>
+          <w:u w:val="none"/>
+        </w:rPr>
+        <w:t>alores atípicos (Outliers)</w:t>
       </w:r>
       <w:r>
         <w:rPr>
@@ -1761,27 +1777,7 @@
             <w:color w:val="auto"/>
             <w:u w:val="none"/>
           </w:rPr>
-          <w:t>Resultado</w:t>
-        </w:r>
-        <w:r>
-          <w:rPr>
-            <w:rStyle w:val="Hipervnculo2"/>
-            <w:i/>
-            <w:iCs w:val="0"/>
-            <w:color w:val="auto"/>
-            <w:u w:val="none"/>
-          </w:rPr>
-          <w:t>s</w:t>
-        </w:r>
-        <w:r>
-          <w:rPr>
-            <w:rStyle w:val="Hipervnculo2"/>
-            <w:i/>
-            <w:iCs w:val="0"/>
-            <w:color w:val="auto"/>
-            <w:u w:val="none"/>
-          </w:rPr>
-          <w:t xml:space="preserve"> del Análisis</w:t>
+          <w:t>Resultados del Análisis</w:t>
         </w:r>
       </w:hyperlink>
     </w:p>
@@ -1974,7 +1970,32 @@
             <w:color w:val="auto"/>
             <w:u w:val="none"/>
           </w:rPr>
-          <w:t>Corre</w:t>
+          <w:t>Corrección de Totales y Signos</w:t>
+        </w:r>
+      </w:hyperlink>
+    </w:p>
+    <w:p>
+      <w:pPr>
+        <w:pStyle w:val="Prrafodelista"/>
+        <w:numPr>
+          <w:ilvl w:val="2"/>
+          <w:numId w:val="34"/>
+        </w:numPr>
+        <w:ind w:left="1604" w:hanging="357"/>
+        <w:rPr>
+          <w:rStyle w:val="Hipervnculo2"/>
+          <w:color w:val="auto"/>
+          <w:u w:val="none"/>
+        </w:rPr>
+      </w:pPr>
+      <w:hyperlink w:anchor="_Tratamiento_de_Fechas" w:history="1">
+        <w:r>
+          <w:rPr>
+            <w:rStyle w:val="Hipervnculo2"/>
+            <w:color w:val="auto"/>
+            <w:u w:val="none"/>
+          </w:rPr>
+          <w:t>Tratam</w:t>
         </w:r>
         <w:r>
           <w:rPr>
@@ -1982,7 +2003,7 @@
             <w:color w:val="auto"/>
             <w:u w:val="none"/>
           </w:rPr>
-          <w:t>c</w:t>
+          <w:t>i</w:t>
         </w:r>
         <w:r>
           <w:rPr>
@@ -1990,32 +2011,7 @@
             <w:color w:val="auto"/>
             <w:u w:val="none"/>
           </w:rPr>
-          <w:t>ción de Totales y Signos</w:t>
-        </w:r>
-      </w:hyperlink>
-    </w:p>
-    <w:p>
-      <w:pPr>
-        <w:pStyle w:val="Prrafodelista"/>
-        <w:numPr>
-          <w:ilvl w:val="2"/>
-          <w:numId w:val="34"/>
-        </w:numPr>
-        <w:ind w:left="1604" w:hanging="357"/>
-        <w:rPr>
-          <w:rStyle w:val="Hipervnculo2"/>
-          <w:color w:val="auto"/>
-          <w:u w:val="none"/>
-        </w:rPr>
-      </w:pPr>
-      <w:hyperlink w:anchor="_Tratamiento_de_Fechas" w:history="1">
-        <w:r>
-          <w:rPr>
-            <w:rStyle w:val="Hipervnculo2"/>
-            <w:color w:val="auto"/>
-            <w:u w:val="none"/>
-          </w:rPr>
-          <w:t>Tratamiento de Fechas</w:t>
+          <w:t>ento de Fechas</w:t>
         </w:r>
       </w:hyperlink>
     </w:p>
@@ -2040,7 +2036,23 @@
             <w:color w:val="auto"/>
             <w:u w:val="none"/>
           </w:rPr>
-          <w:t>Filtrado de Outliers</w:t>
+          <w:t>Filtrad</w:t>
+        </w:r>
+        <w:r>
+          <w:rPr>
+            <w:rStyle w:val="Hipervnculo2"/>
+            <w:color w:val="auto"/>
+            <w:u w:val="none"/>
+          </w:rPr>
+          <w:t>o</w:t>
+        </w:r>
+        <w:r>
+          <w:rPr>
+            <w:rStyle w:val="Hipervnculo2"/>
+            <w:color w:val="auto"/>
+            <w:u w:val="none"/>
+          </w:rPr>
+          <w:t xml:space="preserve"> de Outliers</w:t>
         </w:r>
       </w:hyperlink>
     </w:p>
@@ -18000,6 +18012,7 @@
         <w:contextualSpacing w:val="0"/>
       </w:pPr>
       <w:r>
+        <w:lastRenderedPageBreak/>
         <w:t>Una vez que ejecuta</w:t>
       </w:r>
       <w:r>
@@ -18014,7 +18027,6 @@
         <w:rPr>
           <w:noProof/>
         </w:rPr>
-        <w:lastRenderedPageBreak/>
         <w:drawing>
           <wp:inline distT="0" distB="0" distL="0" distR="0" wp14:anchorId="6BB4F598" wp14:editId="57C75937">
             <wp:extent cx="5759450" cy="5962015"/>
@@ -18252,7 +18264,6 @@
           <w:b/>
           <w:bCs/>
         </w:rPr>
-        <w:lastRenderedPageBreak/>
         <w:t xml:space="preserve">Fallo de integridad en </w:t>
       </w:r>
       <w:r>
@@ -20024,40 +20035,7 @@
             <w:sz w:val="18"/>
             <w:szCs w:val="18"/>
           </w:rPr>
-          <w:t>[Ir al</w:t>
-        </w:r>
-        <w:r>
-          <w:rPr>
-            <w:rStyle w:val="Hipervnculo2"/>
-            <w:b w:val="0"/>
-            <w:bCs w:val="0"/>
-            <w:iCs w:val="0"/>
-            <w:sz w:val="18"/>
-            <w:szCs w:val="18"/>
-          </w:rPr>
-          <w:t xml:space="preserve"> </w:t>
-        </w:r>
-        <w:r>
-          <w:rPr>
-            <w:rStyle w:val="Hipervnculo2"/>
-            <w:b w:val="0"/>
-            <w:bCs w:val="0"/>
-            <w:iCs w:val="0"/>
-            <w:sz w:val="18"/>
-            <w:szCs w:val="18"/>
-          </w:rPr>
-          <w:t>í</w:t>
-        </w:r>
-        <w:r>
-          <w:rPr>
-            <w:rStyle w:val="Hipervnculo2"/>
-            <w:b w:val="0"/>
-            <w:bCs w:val="0"/>
-            <w:iCs w:val="0"/>
-            <w:sz w:val="18"/>
-            <w:szCs w:val="18"/>
-          </w:rPr>
-          <w:t>ndice]</w:t>
+          <w:t>[Ir al índice]</w:t>
         </w:r>
       </w:hyperlink>
     </w:p>
@@ -20663,31 +20641,7 @@
             <w:sz w:val="18"/>
             <w:szCs w:val="18"/>
           </w:rPr>
-          <w:t>[Ir al í</w:t>
-        </w:r>
-        <w:r>
-          <w:rPr>
-            <w:rStyle w:val="Hipervnculo2"/>
-            <w:b w:val="0"/>
-            <w:bCs w:val="0"/>
-            <w:i/>
-            <w:iCs w:val="0"/>
-            <w:sz w:val="18"/>
-            <w:szCs w:val="18"/>
-          </w:rPr>
-          <w:t>n</w:t>
-        </w:r>
-        <w:r>
-          <w:rPr>
-            <w:rStyle w:val="Hipervnculo2"/>
-            <w:b w:val="0"/>
-            <w:bCs w:val="0"/>
-            <w:i/>
-            <w:iCs w:val="0"/>
-            <w:sz w:val="18"/>
-            <w:szCs w:val="18"/>
-          </w:rPr>
-          <w:t>dice]</w:t>
+          <w:t>[Ir al índice]</w:t>
         </w:r>
       </w:hyperlink>
     </w:p>
@@ -21009,29 +20963,7 @@
             <w:sz w:val="18"/>
             <w:szCs w:val="18"/>
           </w:rPr>
-          <w:t>[Ir a</w:t>
-        </w:r>
-        <w:r>
-          <w:rPr>
-            <w:rStyle w:val="Hipervnculo2"/>
-            <w:b w:val="0"/>
-            <w:bCs w:val="0"/>
-            <w:iCs w:val="0"/>
-            <w:sz w:val="18"/>
-            <w:szCs w:val="18"/>
-          </w:rPr>
-          <w:t>l</w:t>
-        </w:r>
-        <w:r>
-          <w:rPr>
-            <w:rStyle w:val="Hipervnculo2"/>
-            <w:b w:val="0"/>
-            <w:bCs w:val="0"/>
-            <w:iCs w:val="0"/>
-            <w:sz w:val="18"/>
-            <w:szCs w:val="18"/>
-          </w:rPr>
-          <w:t xml:space="preserve"> índice]</w:t>
+          <w:t>[Ir al índice]</w:t>
         </w:r>
       </w:hyperlink>
     </w:p>
@@ -21067,7 +20999,13 @@
         <w:t xml:space="preserve">que </w:t>
       </w:r>
       <w:r>
-        <w:t>es cierto que en nuestro dataset p</w:t>
+        <w:t xml:space="preserve">es cierto que en </w:t>
+      </w:r>
+      <w:r>
+        <w:t>el</w:t>
+      </w:r>
+      <w:r>
+        <w:t xml:space="preserve"> dataset p</w:t>
       </w:r>
       <w:r>
         <w:t xml:space="preserve">odemos encontrar </w:t>
@@ -21131,7 +21069,16 @@
         <w:t>precios desorbitados</w:t>
       </w:r>
       <w:r>
-        <w:t xml:space="preserve">, ya que por el contexto, obtenido de forma general, de los datos, apuntan claramente a ventas minoristas además de poder deberse </w:t>
+        <w:t>, y p</w:t>
+      </w:r>
+      <w:r>
+        <w:t xml:space="preserve">or el contexto obtenido de forma general, los datos apuntan claramente a ventas minoristas </w:t>
+      </w:r>
+      <w:r>
+        <w:t>aunque, igualmente, puede</w:t>
+      </w:r>
+      <w:r>
+        <w:t xml:space="preserve"> deberse </w:t>
       </w:r>
       <w:r>
         <w:t>a un problema de registro</w:t>
@@ -21260,7 +21207,7 @@
         <w:t>on completamente irreales para productos de electrónica de consumo</w:t>
       </w:r>
       <w:r>
-        <w:t>, ni aunque fuesen de Apple.</w:t>
+        <w:t>, aunque fuesen de Apple.</w:t>
       </w:r>
     </w:p>
     <w:p/>
@@ -22143,7 +22090,19 @@
           <w:rPr>
             <w:rStyle w:val="Hipervnculo2"/>
           </w:rPr>
-          <w:t>Filtrado de Outliers</w:t>
+          <w:t xml:space="preserve">Filtrado </w:t>
+        </w:r>
+        <w:r>
+          <w:rPr>
+            <w:rStyle w:val="Hipervnculo2"/>
+          </w:rPr>
+          <w:t>d</w:t>
+        </w:r>
+        <w:r>
+          <w:rPr>
+            <w:rStyle w:val="Hipervnculo2"/>
+          </w:rPr>
+          <w:t>e Outliers</w:t>
         </w:r>
       </w:hyperlink>
     </w:p>
@@ -22457,7 +22416,11 @@
         <w:t>errors='coerce'</w:t>
       </w:r>
       <w:r>
-        <w:t>, esas 18 fechas inválidas se transformarán inmediatamente en nulos y se mezclarán con los 5 nulos originales que ya venían vacíos en el CSV. Es</w:t>
+        <w:t xml:space="preserve">, esas 18 fechas inválidas se </w:t>
+      </w:r>
+      <w:r>
+        <w:lastRenderedPageBreak/>
+        <w:t>transformarán inmediatamente en nulos y se mezclarán con los 5 nulos originales que ya venían vacíos en el CSV. Es</w:t>
       </w:r>
       <w:r>
         <w:t>t</w:t>
@@ -22545,6 +22508,9 @@
         <w:contextualSpacing w:val="0"/>
       </w:pPr>
       <w:r>
+        <w:rPr>
+          <w:noProof/>
+        </w:rPr>
         <w:drawing>
           <wp:inline distT="0" distB="0" distL="0" distR="0" wp14:anchorId="5C885598" wp14:editId="10971B35">
             <wp:extent cx="5759450" cy="2375535"/>
@@ -22598,7 +22564,6 @@
       <w:bookmarkStart w:id="59" w:name="_Gestión_de_Nulos"/>
       <w:bookmarkEnd w:id="59"/>
       <w:r>
-        <w:lastRenderedPageBreak/>
         <w:t>Gestión</w:t>
       </w:r>
       <w:r>
@@ -23245,6 +23210,9 @@
         <w:contextualSpacing w:val="0"/>
       </w:pPr>
       <w:r>
+        <w:rPr>
+          <w:noProof/>
+        </w:rPr>
         <w:drawing>
           <wp:inline distT="0" distB="0" distL="0" distR="0" wp14:anchorId="5EA316B2" wp14:editId="33C4487C">
             <wp:extent cx="5759450" cy="1902460"/>
@@ -23622,47 +23590,6 @@
     <w:p/>
     <w:p>
       <w:pPr>
-        <w:pStyle w:val="Prrafodelista"/>
-        <w:numPr>
-          <w:ilvl w:val="0"/>
-          <w:numId w:val="46"/>
-        </w:numPr>
-      </w:pPr>
-      <w:r>
-        <w:rPr>
-          <w:b/>
-          <w:bCs/>
-        </w:rPr>
-        <w:t>Conversión segura de cantidad (opcional pero recomendable tras limpiar nulos):</w:t>
-      </w:r>
-    </w:p>
-    <w:p>
-      <w:pPr>
-        <w:pStyle w:val="Prrafodelista"/>
-        <w:ind w:left="720" w:firstLine="0"/>
-      </w:pPr>
-      <w:r>
-        <w:t xml:space="preserve">No mezclaremos responsabilidades en esta celda, nos centraremos exclusivamente en auditar, registrar </w:t>
-      </w:r>
-      <w:r>
-        <w:t>los cambios</w:t>
-      </w:r>
-      <w:r>
-        <w:t xml:space="preserve"> y eliminar los 12 duplicados de </w:t>
-      </w:r>
-      <w:r>
-        <w:rPr>
-          <w:rStyle w:val="CdigoenPrrafo"/>
-        </w:rPr>
-        <w:t>dfCln</w:t>
-      </w:r>
-      <w:r>
-        <w:t xml:space="preserve">. </w:t>
-      </w:r>
-    </w:p>
-    <w:p/>
-    <w:p>
-      <w:pPr>
         <w:spacing w:after="60"/>
         <w:contextualSpacing w:val="0"/>
       </w:pPr>
@@ -23715,6 +23642,9 @@
         <w:contextualSpacing w:val="0"/>
       </w:pPr>
       <w:r>
+        <w:rPr>
+          <w:noProof/>
+        </w:rPr>
         <w:drawing>
           <wp:inline distT="0" distB="0" distL="0" distR="0" wp14:anchorId="45A68020" wp14:editId="09EC977B">
             <wp:extent cx="5759450" cy="1663700"/>
@@ -23864,7 +23794,7 @@
       <w:pPr>
         <w:numPr>
           <w:ilvl w:val="0"/>
-          <w:numId w:val="51"/>
+          <w:numId w:val="48"/>
         </w:numPr>
       </w:pPr>
       <w:r>
@@ -23899,7 +23829,7 @@
       <w:pPr>
         <w:numPr>
           <w:ilvl w:val="0"/>
-          <w:numId w:val="51"/>
+          <w:numId w:val="48"/>
         </w:numPr>
       </w:pPr>
       <w:r>
@@ -23948,7 +23878,7 @@
       <w:pPr>
         <w:numPr>
           <w:ilvl w:val="0"/>
-          <w:numId w:val="51"/>
+          <w:numId w:val="48"/>
         </w:numPr>
       </w:pPr>
       <w:r>
@@ -23997,7 +23927,7 @@
       <w:pPr>
         <w:numPr>
           <w:ilvl w:val="0"/>
-          <w:numId w:val="51"/>
+          <w:numId w:val="48"/>
         </w:numPr>
       </w:pPr>
       <w:r>
@@ -24310,7 +24240,7 @@
         <w:pStyle w:val="Prrafodelista"/>
         <w:numPr>
           <w:ilvl w:val="0"/>
-          <w:numId w:val="55"/>
+          <w:numId w:val="49"/>
         </w:numPr>
         <w:rPr>
           <w:lang w:eastAsia="es-ES"/>
@@ -24460,7 +24390,7 @@
         <w:pStyle w:val="Prrafodelista"/>
         <w:numPr>
           <w:ilvl w:val="0"/>
-          <w:numId w:val="55"/>
+          <w:numId w:val="49"/>
         </w:numPr>
         <w:rPr>
           <w:lang w:eastAsia="es-ES"/>
@@ -24780,7 +24710,6 @@
         <w:rPr>
           <w:lang w:eastAsia="es-ES"/>
         </w:rPr>
-        <w:lastRenderedPageBreak/>
         <w:t xml:space="preserve">En las </w:t>
       </w:r>
       <w:r>
@@ -24898,6 +24827,7 @@
         <w:rPr>
           <w:lang w:eastAsia="es-ES"/>
         </w:rPr>
+        <w:lastRenderedPageBreak/>
         <w:t>Ejecutamos entonces la celda:</w:t>
       </w:r>
     </w:p>
@@ -24937,13 +24867,7 @@
         <w:contextualSpacing w:val="0"/>
       </w:pPr>
       <w:r>
-        <w:t>Con</w:t>
-      </w:r>
-      <w:r>
-        <w:t>siguiendo</w:t>
-      </w:r>
-      <w:r>
-        <w:t>:</w:t>
+        <w:t>Consiguiendo:</w:t>
       </w:r>
     </w:p>
     <w:p>
@@ -24954,6 +24878,7 @@
       </w:pPr>
       <w:r>
         <w:rPr>
+          <w:noProof/>
           <w:lang w:eastAsia="es-ES"/>
         </w:rPr>
         <w:drawing>
@@ -25040,6 +24965,15 @@
     <w:p>
       <w:pPr>
         <w:pStyle w:val="Ttulo2"/>
+        <w:rPr>
+          <w:rStyle w:val="Hipervnculo2"/>
+          <w:b w:val="0"/>
+          <w:bCs w:val="0"/>
+          <w:i/>
+          <w:iCs w:val="0"/>
+          <w:sz w:val="18"/>
+          <w:szCs w:val="18"/>
+        </w:rPr>
       </w:pPr>
       <w:bookmarkStart w:id="63" w:name="_Tratamiento_de_Fechas"/>
       <w:bookmarkEnd w:id="63"/>
@@ -25069,8 +25003,840 @@
       </w:hyperlink>
     </w:p>
     <w:p>
+      <w:r>
+        <w:t>R</w:t>
+      </w:r>
+      <w:r>
+        <w:t xml:space="preserve">ecordando que el enunciado especifica que el dataset corresponde a las </w:t>
+      </w:r>
+      <w:r>
+        <w:t>“</w:t>
+      </w:r>
+      <w:r>
+        <w:rPr>
+          <w:i/>
+          <w:iCs/>
+        </w:rPr>
+        <w:t>ventas de los últimos 30 días</w:t>
+      </w:r>
+      <w:r>
+        <w:rPr>
+          <w:i/>
+          <w:iCs/>
+        </w:rPr>
+        <w:t>”,</w:t>
+      </w:r>
+      <w:r>
+        <w:t xml:space="preserve"> en el análisis previo</w:t>
+      </w:r>
+      <w:r>
+        <w:t xml:space="preserve"> </w:t>
+      </w:r>
+      <w:r>
+        <w:t xml:space="preserve">se descubren </w:t>
+      </w:r>
+      <w:r>
+        <w:rPr>
+          <w:b/>
+          <w:bCs/>
+        </w:rPr>
+        <w:t>18 registros con fechas corruptas o fuera de rango</w:t>
+      </w:r>
+      <w:r>
+        <w:t xml:space="preserve">, viendo </w:t>
+      </w:r>
+      <w:r>
+        <w:t>anomalías temporales que van desde texto sin formato fecha</w:t>
+      </w:r>
+      <w:r>
+        <w:t>;</w:t>
+      </w:r>
+      <w:r>
+        <w:t xml:space="preserve"> </w:t>
+      </w:r>
+      <w:r>
+        <w:rPr>
+          <w:b/>
+          <w:bCs/>
+          <w:color w:val="C00000"/>
+        </w:rPr>
+        <w:t>'no_es_fecha'</w:t>
+      </w:r>
+      <w:r>
+        <w:t xml:space="preserve">, </w:t>
+      </w:r>
+      <w:r>
+        <w:rPr>
+          <w:b/>
+          <w:bCs/>
+          <w:color w:val="C00000"/>
+        </w:rPr>
+        <w:t>'ayer'</w:t>
+      </w:r>
+      <w:r>
+        <w:t>;</w:t>
+      </w:r>
+      <w:r>
+        <w:t xml:space="preserve"> </w:t>
+      </w:r>
+      <w:r>
+        <w:t xml:space="preserve">fechas no válidas como </w:t>
+      </w:r>
+      <w:r>
+        <w:t xml:space="preserve">meses </w:t>
+      </w:r>
+      <w:r>
+        <w:t>fuera de rango:</w:t>
+      </w:r>
+      <w:r>
+        <w:t xml:space="preserve"> 2026-</w:t>
+      </w:r>
+      <w:r>
+        <w:rPr>
+          <w:b/>
+          <w:bCs/>
+          <w:color w:val="C00000"/>
+        </w:rPr>
+        <w:t>13</w:t>
+      </w:r>
+      <w:r>
+        <w:t>-10, 2026-</w:t>
+      </w:r>
+      <w:r>
+        <w:rPr>
+          <w:b/>
+          <w:bCs/>
+          <w:color w:val="C00000"/>
+        </w:rPr>
+        <w:t>00</w:t>
+      </w:r>
+      <w:r>
+        <w:t>-12, 2026-</w:t>
+      </w:r>
+      <w:r>
+        <w:rPr>
+          <w:b/>
+          <w:bCs/>
+          <w:color w:val="C00000"/>
+        </w:rPr>
+        <w:t>18</w:t>
+      </w:r>
+      <w:r>
+        <w:t xml:space="preserve">-10, días </w:t>
+      </w:r>
+      <w:r>
+        <w:t>fuera de rango:</w:t>
+      </w:r>
+      <w:r>
+        <w:t xml:space="preserve"> 2026-</w:t>
+      </w:r>
+      <w:r>
+        <w:rPr>
+          <w:b/>
+          <w:bCs/>
+          <w:color w:val="C00000"/>
+        </w:rPr>
+        <w:t>02</w:t>
+      </w:r>
+      <w:r>
+        <w:t>-</w:t>
+      </w:r>
+      <w:r>
+        <w:rPr>
+          <w:b/>
+          <w:bCs/>
+          <w:color w:val="C00000"/>
+        </w:rPr>
+        <w:t>30</w:t>
+      </w:r>
+      <w:r>
+        <w:t xml:space="preserve">, </w:t>
+      </w:r>
+      <w:r>
+        <w:rPr>
+          <w:b/>
+          <w:bCs/>
+          <w:color w:val="C00000"/>
+        </w:rPr>
+        <w:t>31</w:t>
+      </w:r>
+      <w:r>
+        <w:t>/</w:t>
+      </w:r>
+      <w:r>
+        <w:rPr>
+          <w:b/>
+          <w:bCs/>
+          <w:color w:val="C00000"/>
+        </w:rPr>
+        <w:t>02</w:t>
+      </w:r>
+      <w:r>
+        <w:t>/2026, 2026-</w:t>
+      </w:r>
+      <w:r>
+        <w:rPr>
+          <w:b/>
+          <w:bCs/>
+          <w:color w:val="C00000"/>
+        </w:rPr>
+        <w:t>09</w:t>
+      </w:r>
+      <w:r>
+        <w:t>-</w:t>
+      </w:r>
+      <w:r>
+        <w:rPr>
+          <w:b/>
+          <w:bCs/>
+          <w:color w:val="C00000"/>
+        </w:rPr>
+        <w:t>31</w:t>
+      </w:r>
+      <w:r>
+        <w:t>, 2026-10-</w:t>
+      </w:r>
+      <w:r>
+        <w:rPr>
+          <w:b/>
+          <w:bCs/>
+          <w:color w:val="C00000"/>
+        </w:rPr>
+        <w:t>45</w:t>
+      </w:r>
+      <w:r>
+        <w:t xml:space="preserve">, </w:t>
+      </w:r>
+      <w:r>
+        <w:t xml:space="preserve">etc; hasta </w:t>
+      </w:r>
+      <w:r>
+        <w:t xml:space="preserve">formatos invertidos </w:t>
+      </w:r>
+      <w:r>
+        <w:rPr>
+          <w:b/>
+          <w:bCs/>
+          <w:color w:val="C00000"/>
+        </w:rPr>
+        <w:t>2026/15/03</w:t>
+      </w:r>
+      <w:r>
+        <w:t>.</w:t>
+      </w:r>
+    </w:p>
+    <w:p/>
+    <w:p>
+      <w:r>
+        <w:t xml:space="preserve">Al igual que ocurría con los nulos en </w:t>
+      </w:r>
+      <w:r>
+        <w:rPr>
+          <w:rStyle w:val="HTML"/>
+        </w:rPr>
+        <w:t>fecha</w:t>
+      </w:r>
+      <w:r>
+        <w:t xml:space="preserve">, en una serie temporal de ventas en tiempo real no se puede inventar en qué día ocurrió una transacción cuya fecha es corrupta o ajena al periodo </w:t>
+      </w:r>
+      <w:r>
+        <w:t>anunciado</w:t>
+      </w:r>
+      <w:r>
+        <w:t xml:space="preserve">. Por tanto, </w:t>
+      </w:r>
+      <w:r>
+        <w:t xml:space="preserve">estas </w:t>
+      </w:r>
+      <w:r>
+        <w:t>se registra</w:t>
+      </w:r>
+      <w:r>
+        <w:t>rá</w:t>
+      </w:r>
+      <w:r>
+        <w:t xml:space="preserve">n bajo </w:t>
+      </w:r>
+      <w:r>
+        <w:rPr>
+          <w:b/>
+          <w:bCs/>
+          <w:i/>
+          <w:iCs/>
+        </w:rPr>
+        <w:t>'invalid_date'</w:t>
+      </w:r>
+      <w:r>
+        <w:t xml:space="preserve"> con la acción </w:t>
+      </w:r>
+      <w:r>
+        <w:rPr>
+          <w:b/>
+          <w:bCs/>
+          <w:i/>
+          <w:iCs/>
+        </w:rPr>
+        <w:t>'deleted'</w:t>
+      </w:r>
+      <w:r>
+        <w:t xml:space="preserve"> y se elimina</w:t>
+      </w:r>
+      <w:r>
+        <w:t>rá</w:t>
+      </w:r>
+      <w:r>
+        <w:t>n de</w:t>
+      </w:r>
+      <w:r>
+        <w:t>l conjunto destinado a los datos limpios y p</w:t>
+      </w:r>
+      <w:r>
+        <w:t>ara las filas válida</w:t>
+      </w:r>
+      <w:r>
+        <w:t>s</w:t>
+      </w:r>
+      <w:r>
+        <w:t>, actualiza</w:t>
+      </w:r>
+      <w:r>
+        <w:t>ndo</w:t>
+      </w:r>
+      <w:r>
+        <w:t xml:space="preserve"> el tipo a </w:t>
+      </w:r>
+      <w:r>
+        <w:rPr>
+          <w:rStyle w:val="HTML"/>
+        </w:rPr>
+        <w:t>datetime</w:t>
+      </w:r>
+      <w:r>
+        <w:t xml:space="preserve"> para el resto del conjunto.</w:t>
+      </w:r>
+    </w:p>
+    <w:p/>
+    <w:p>
+      <w:pPr>
+        <w:pStyle w:val="Ttulo3"/>
+      </w:pPr>
+      <w:r>
+        <w:t>Clasificación y acción</w:t>
+      </w:r>
+    </w:p>
+    <w:p/>
+    <w:p>
+      <w:pPr>
+        <w:numPr>
+          <w:ilvl w:val="0"/>
+          <w:numId w:val="50"/>
+        </w:numPr>
+      </w:pPr>
+      <w:r>
+        <w:rPr>
+          <w:b/>
+          <w:bCs/>
+        </w:rPr>
+        <w:t>F</w:t>
+      </w:r>
+      <w:r>
+        <w:rPr>
+          <w:b/>
+          <w:bCs/>
+        </w:rPr>
+        <w:t>echas sintácticamente corruptas (format='%Y-%m-%d', errors='coerce')</w:t>
+      </w:r>
+    </w:p>
+    <w:p>
+      <w:pPr>
+        <w:ind w:left="720"/>
+      </w:pPr>
+      <w:r>
+        <w:t xml:space="preserve">Al aplicar </w:t>
+      </w:r>
+      <w:r>
+        <w:t xml:space="preserve">la conversión de Pandas a formato </w:t>
+      </w:r>
+      <w:r>
+        <w:t>fecha</w:t>
+      </w:r>
+      <w:r>
+        <w:t>:</w:t>
+      </w:r>
+      <w:r>
+        <w:t xml:space="preserve"> </w:t>
+      </w:r>
+      <w:r>
+        <w:rPr>
+          <w:rStyle w:val="CdigoenPrrafo"/>
+        </w:rPr>
+        <w:t>format='%Y-%m-%d'</w:t>
+      </w:r>
+      <w:r>
+        <w:t xml:space="preserve">, todas las fechas válidas se convierten a objetos </w:t>
+      </w:r>
+      <w:r>
+        <w:rPr>
+          <w:rStyle w:val="HTML"/>
+        </w:rPr>
+        <w:t>datetime</w:t>
+      </w:r>
+      <w:r>
+        <w:t>, mientras que cualquier texto corrupto, fecha inexistente en el calendario</w:t>
+      </w:r>
+      <w:r>
+        <w:t xml:space="preserve">, </w:t>
+      </w:r>
+      <w:r>
+        <w:t>como el 30 de febrero</w:t>
+      </w:r>
+      <w:r>
+        <w:t xml:space="preserve">, </w:t>
+      </w:r>
+      <w:r>
+        <w:t>el 31 de septiembre</w:t>
+      </w:r>
+      <w:r>
+        <w:t>,</w:t>
+      </w:r>
+      <w:r>
+        <w:t xml:space="preserve"> o formato anómalo se transforma automáticamente en </w:t>
+      </w:r>
+      <w:r>
+        <w:rPr>
+          <w:rStyle w:val="HTML"/>
+        </w:rPr>
+        <w:t>Na</w:t>
+      </w:r>
+      <w:r>
+        <w:rPr>
+          <w:rStyle w:val="HTML"/>
+        </w:rPr>
+        <w:t>N</w:t>
+      </w:r>
+      <w:r>
+        <w:t>.</w:t>
+      </w:r>
+    </w:p>
+    <w:p>
+      <w:pPr>
+        <w:numPr>
+          <w:ilvl w:val="0"/>
+          <w:numId w:val="50"/>
+        </w:numPr>
+      </w:pPr>
+      <w:r>
+        <w:rPr>
+          <w:b/>
+          <w:bCs/>
+        </w:rPr>
+        <w:t>Comprobación de fechas fuera de rango (</w:t>
+      </w:r>
+      <w:r>
+        <w:rPr>
+          <w:b/>
+          <w:bCs/>
+        </w:rPr>
+        <w:t xml:space="preserve">según enunciado </w:t>
+      </w:r>
+      <w:r>
+        <w:rPr>
+          <w:b/>
+          <w:bCs/>
+          <w:i/>
+          <w:iCs/>
+        </w:rPr>
+        <w:t>los últimos 30 días</w:t>
+      </w:r>
+      <w:r>
+        <w:rPr>
+          <w:b/>
+          <w:bCs/>
+        </w:rPr>
+        <w:t>)</w:t>
+      </w:r>
+    </w:p>
+    <w:p>
+      <w:pPr>
+        <w:numPr>
+          <w:ilvl w:val="0"/>
+          <w:numId w:val="51"/>
+        </w:numPr>
+      </w:pPr>
+      <w:r>
+        <w:t xml:space="preserve">En las fechas válidas, la ventana temporal </w:t>
+      </w:r>
+      <w:r>
+        <w:t xml:space="preserve">del enunciado marca temporalmente </w:t>
+      </w:r>
+      <w:r>
+        <w:rPr>
+          <w:i/>
+          <w:iCs/>
+        </w:rPr>
+        <w:t xml:space="preserve">ventas de </w:t>
+      </w:r>
+      <w:r>
+        <w:rPr>
+          <w:i/>
+          <w:iCs/>
+        </w:rPr>
+        <w:t>los últimos 30 días</w:t>
+      </w:r>
+      <w:r>
+        <w:t>.</w:t>
+      </w:r>
+    </w:p>
+    <w:p>
+      <w:pPr>
+        <w:numPr>
+          <w:ilvl w:val="0"/>
+          <w:numId w:val="51"/>
+        </w:numPr>
+      </w:pPr>
+      <w:r>
+        <w:t xml:space="preserve">Si definimos el límite superior en la fecha máxima de corte del periodo </w:t>
+      </w:r>
+      <w:r>
+        <w:rPr>
+          <w:b/>
+          <w:bCs/>
+          <w:i/>
+          <w:iCs/>
+        </w:rPr>
+        <w:t>2026-10-18</w:t>
+      </w:r>
+      <w:r>
+        <w:t xml:space="preserve"> y el límite inferior 30 días antes </w:t>
+      </w:r>
+      <w:r>
+        <w:rPr>
+          <w:b/>
+          <w:bCs/>
+          <w:i/>
+          <w:iCs/>
+        </w:rPr>
+        <w:t>2026-09-19</w:t>
+      </w:r>
+      <w:r>
+        <w:t>, una única máscara combinada capturará tanto las fechas corruptas</w:t>
+      </w:r>
+      <w:r>
+        <w:t xml:space="preserve">, </w:t>
+      </w:r>
+      <w:r>
+        <w:t>como las fechas fuera de rango.</w:t>
+      </w:r>
+    </w:p>
+    <w:p>
+      <w:pPr>
+        <w:spacing w:after="300" w:line="276" w:lineRule="auto"/>
+        <w:contextualSpacing w:val="0"/>
+      </w:pPr>
+      <w:r>
+        <w:br w:type="page"/>
+      </w:r>
+    </w:p>
+    <w:p>
+      <w:r>
+        <w:lastRenderedPageBreak/>
+        <w:t>Ejecutamos la celda del cuaderno:</w:t>
+      </w:r>
+    </w:p>
+    <w:p>
+      <w:pPr>
+        <w:pStyle w:val="Prrafocdigo"/>
+        <w:ind w:firstLine="284"/>
+      </w:pPr>
+    </w:p>
+    <w:p>
+      <w:pPr>
+        <w:pStyle w:val="Prrafocdigo"/>
+        <w:ind w:firstLine="284"/>
+      </w:pPr>
+      <w:r>
+        <w:t># DATA CLEANING, 4. INVALID NUMERICS AND TOTALS CORRECTION</w:t>
+      </w:r>
+    </w:p>
+    <w:p>
+      <w:pPr>
+        <w:pStyle w:val="Prrafocdigo"/>
+        <w:ind w:firstLine="284"/>
+      </w:pPr>
+      <w:r>
+        <w:t># ========================================================</w:t>
+      </w:r>
+    </w:p>
+    <w:p>
+      <w:pPr>
+        <w:pStyle w:val="Prrafocdigo"/>
+      </w:pPr>
+    </w:p>
+    <w:p/>
+    <w:p>
+      <w:r>
+        <w:t>Quedando:</w:t>
+      </w:r>
+    </w:p>
+    <w:p>
+      <w:r>
+        <w:rPr>
+          <w:noProof/>
+        </w:rPr>
+        <w:drawing>
+          <wp:inline distT="0" distB="0" distL="0" distR="0" wp14:anchorId="5B5BEA7A" wp14:editId="60119D1E">
+            <wp:extent cx="5759450" cy="1630680"/>
+            <wp:effectExtent l="0" t="0" r="0" b="7620"/>
+            <wp:docPr id="22" name="Imagen 22"/>
+            <wp:cNvGraphicFramePr>
+              <a:graphicFrameLocks xmlns:a="http://schemas.openxmlformats.org/drawingml/2006/main" noChangeAspect="1"/>
+            </wp:cNvGraphicFramePr>
+            <a:graphic xmlns:a="http://schemas.openxmlformats.org/drawingml/2006/main">
+              <a:graphicData uri="http://schemas.openxmlformats.org/drawingml/2006/picture">
+                <pic:pic xmlns:pic="http://schemas.openxmlformats.org/drawingml/2006/picture">
+                  <pic:nvPicPr>
+                    <pic:cNvPr id="1" name=""/>
+                    <pic:cNvPicPr/>
+                  </pic:nvPicPr>
+                  <pic:blipFill>
+                    <a:blip r:embed="rId37"/>
+                    <a:stretch>
+                      <a:fillRect/>
+                    </a:stretch>
+                  </pic:blipFill>
+                  <pic:spPr>
+                    <a:xfrm>
+                      <a:off x="0" y="0"/>
+                      <a:ext cx="5759450" cy="1630680"/>
+                    </a:xfrm>
+                    <a:prstGeom prst="rect">
+                      <a:avLst/>
+                    </a:prstGeom>
+                  </pic:spPr>
+                </pic:pic>
+              </a:graphicData>
+            </a:graphic>
+          </wp:inline>
+        </w:drawing>
+      </w:r>
+    </w:p>
+    <w:p/>
+    <w:p>
+      <w:pPr>
+        <w:rPr>
+          <w:b/>
+          <w:bCs/>
+        </w:rPr>
+      </w:pPr>
+      <w:r>
+        <w:t xml:space="preserve">Es importante mencionar </w:t>
+      </w:r>
+      <w:r>
+        <w:t>un detalle clave</w:t>
+      </w:r>
+      <w:r>
+        <w:t>. ¿P</w:t>
+      </w:r>
+      <w:r>
+        <w:t xml:space="preserve">or qué salen </w:t>
+      </w:r>
+      <w:r>
+        <w:rPr>
+          <w:b/>
+          <w:bCs/>
+        </w:rPr>
+        <w:t>13 registros</w:t>
+      </w:r>
+      <w:r>
+        <w:t xml:space="preserve"> en lugar de los </w:t>
+      </w:r>
+      <w:r>
+        <w:rPr>
+          <w:b/>
+          <w:bCs/>
+        </w:rPr>
+        <w:t>18</w:t>
+      </w:r>
+      <w:r>
+        <w:t xml:space="preserve"> en el análisis </w:t>
+      </w:r>
+      <w:r>
+        <w:t xml:space="preserve">previo sobre </w:t>
+      </w:r>
+      <w:r>
+        <w:t>del conjunto de datos completo</w:t>
+      </w:r>
+      <w:r>
+        <w:t>?</w:t>
+      </w:r>
+      <w:r>
+        <w:t xml:space="preserve"> </w:t>
+      </w:r>
+      <w:r>
+        <w:rPr>
+          <w:b/>
+          <w:bCs/>
+        </w:rPr>
+        <w:t>¿Dónde están las otras 5 fechas inválidas?</w:t>
+      </w:r>
+    </w:p>
+    <w:p/>
+    <w:p>
+      <w:r>
+        <w:t xml:space="preserve">Como </w:t>
+      </w:r>
+      <w:r>
+        <w:t xml:space="preserve">la estrategia de limpieza </w:t>
+      </w:r>
+      <w:r>
+        <w:t>es secuencial y acumulativ</w:t>
+      </w:r>
+      <w:r>
+        <w:t>a</w:t>
+      </w:r>
+      <w:r>
+        <w:t xml:space="preserve">, esas </w:t>
+      </w:r>
+      <w:r>
+        <w:rPr>
+          <w:b/>
+          <w:bCs/>
+        </w:rPr>
+        <w:t>5 filas</w:t>
+      </w:r>
+      <w:r>
+        <w:t xml:space="preserve"> tenían </w:t>
+      </w:r>
+      <w:r>
+        <w:rPr>
+          <w:b/>
+          <w:bCs/>
+        </w:rPr>
+        <w:t>más de un problema simultá</w:t>
+      </w:r>
+      <w:r>
+        <w:rPr>
+          <w:b/>
+          <w:bCs/>
+        </w:rPr>
+        <w:t>ne</w:t>
+      </w:r>
+      <w:r>
+        <w:rPr>
+          <w:b/>
+          <w:bCs/>
+        </w:rPr>
+        <w:t>o</w:t>
+      </w:r>
+      <w:r>
+        <w:t xml:space="preserve">, </w:t>
+      </w:r>
+      <w:r>
+        <w:t>por ejemplo, una fecha inválida o nula combinada con un valor negativo</w:t>
+      </w:r>
+      <w:r>
+        <w:t>,</w:t>
+      </w:r>
+      <w:r>
+        <w:t xml:space="preserve"> pero</w:t>
+      </w:r>
+      <w:r>
+        <w:t xml:space="preserve"> </w:t>
+      </w:r>
+      <w:r>
+        <w:rPr>
+          <w:b/>
+          <w:bCs/>
+        </w:rPr>
+        <w:t>ya fueron eliminad</w:t>
+      </w:r>
+      <w:r>
+        <w:rPr>
+          <w:b/>
+          <w:bCs/>
+        </w:rPr>
+        <w:t>o</w:t>
+      </w:r>
+      <w:r>
+        <w:rPr>
+          <w:b/>
+          <w:bCs/>
+        </w:rPr>
+        <w:t>s en pasos anteriores</w:t>
+      </w:r>
+      <w:r>
+        <w:t>.</w:t>
+      </w:r>
+      <w:r>
+        <w:t xml:space="preserve"> </w:t>
+      </w:r>
+      <w:r>
+        <w:t>Así pues</w:t>
+      </w:r>
+      <w:r>
+        <w:t xml:space="preserve">, de las 18 filas con problemas de fecha que existían en </w:t>
+      </w:r>
+      <w:r>
+        <w:t>las</w:t>
+      </w:r>
+      <w:r>
+        <w:t xml:space="preserve"> originales, </w:t>
+      </w:r>
+      <w:r>
+        <w:rPr>
+          <w:b/>
+          <w:bCs/>
+        </w:rPr>
+        <w:t>5 ya habían caído</w:t>
+      </w:r>
+      <w:r>
+        <w:t xml:space="preserve"> antes de llegar </w:t>
+      </w:r>
+      <w:r>
+        <w:t>a este punto</w:t>
+      </w:r>
+      <w:r>
+        <w:t xml:space="preserve">, y aquí se detectan y eliminan las </w:t>
+      </w:r>
+      <w:r>
+        <w:rPr>
+          <w:b/>
+          <w:bCs/>
+        </w:rPr>
+        <w:t>13 restantes</w:t>
+      </w:r>
+      <w:r>
+        <w:t xml:space="preserve"> que quedaban vivas en las 268 </w:t>
+      </w:r>
+      <w:r>
+        <w:t xml:space="preserve">previas, </w:t>
+      </w:r>
+      <w:r>
+        <w:t xml:space="preserve">pasando de </w:t>
+      </w:r>
+      <w:r>
+        <w:rPr>
+          <w:b/>
+          <w:bCs/>
+        </w:rPr>
+        <w:t>268 a 255 filas</w:t>
+      </w:r>
+      <w:r>
+        <w:t>.</w:t>
+      </w:r>
+    </w:p>
+    <w:p>
       <w:pPr>
         <w:pStyle w:val="Ttulo2"/>
+        <w:rPr>
+          <w:rStyle w:val="Hipervnculo2"/>
+          <w:b w:val="0"/>
+          <w:bCs w:val="0"/>
+          <w:i/>
+          <w:iCs w:val="0"/>
+          <w:sz w:val="18"/>
+          <w:szCs w:val="18"/>
+        </w:rPr>
       </w:pPr>
       <w:bookmarkStart w:id="64" w:name="_Filtrado_de_Outliers"/>
       <w:bookmarkEnd w:id="64"/>
@@ -25095,9 +25861,1190 @@
             <w:sz w:val="18"/>
             <w:szCs w:val="18"/>
           </w:rPr>
-          <w:t>[Ir al índice]</w:t>
+          <w:t xml:space="preserve">[Ir al </w:t>
+        </w:r>
+        <w:r>
+          <w:rPr>
+            <w:rStyle w:val="Hipervnculo2"/>
+            <w:b w:val="0"/>
+            <w:bCs w:val="0"/>
+            <w:i/>
+            <w:iCs w:val="0"/>
+            <w:sz w:val="18"/>
+            <w:szCs w:val="18"/>
+          </w:rPr>
+          <w:t>í</w:t>
+        </w:r>
+        <w:r>
+          <w:rPr>
+            <w:rStyle w:val="Hipervnculo2"/>
+            <w:b w:val="0"/>
+            <w:bCs w:val="0"/>
+            <w:i/>
+            <w:iCs w:val="0"/>
+            <w:sz w:val="18"/>
+            <w:szCs w:val="18"/>
+          </w:rPr>
+          <w:t>n</w:t>
+        </w:r>
+        <w:r>
+          <w:rPr>
+            <w:rStyle w:val="Hipervnculo2"/>
+            <w:b w:val="0"/>
+            <w:bCs w:val="0"/>
+            <w:i/>
+            <w:iCs w:val="0"/>
+            <w:sz w:val="18"/>
+            <w:szCs w:val="18"/>
+          </w:rPr>
+          <w:t>dice]</w:t>
         </w:r>
       </w:hyperlink>
+    </w:p>
+    <w:p>
+      <w:r>
+        <w:t>En este punto, nos quedan</w:t>
+      </w:r>
+      <w:r>
+        <w:t xml:space="preserve"> </w:t>
+      </w:r>
+      <w:r>
+        <w:rPr>
+          <w:b/>
+          <w:bCs/>
+        </w:rPr>
+        <w:t>255 filas</w:t>
+      </w:r>
+      <w:r>
+        <w:t xml:space="preserve"> válidas en</w:t>
+      </w:r>
+      <w:r>
+        <w:t>tre</w:t>
+      </w:r>
+      <w:r>
+        <w:t xml:space="preserve"> fechas, sin nulos, sin duplicados y con importes positivos cuadrando </w:t>
+      </w:r>
+      <w:r>
+        <w:t>matemáticamente</w:t>
+      </w:r>
+      <w:r>
+        <w:t xml:space="preserve">. </w:t>
+      </w:r>
+      <w:r>
+        <w:t xml:space="preserve">Nos resta </w:t>
+      </w:r>
+      <w:r>
+        <w:t xml:space="preserve">tratar los valores </w:t>
+      </w:r>
+      <w:r>
+        <w:t xml:space="preserve">atípicos y sus </w:t>
+      </w:r>
+      <w:r>
+        <w:t>extremos desproporcionados</w:t>
+      </w:r>
+      <w:r>
+        <w:t xml:space="preserve">, o usando el anglicismo, </w:t>
+      </w:r>
+      <w:r>
+        <w:rPr>
+          <w:i/>
+          <w:iCs/>
+        </w:rPr>
+        <w:t>los</w:t>
+      </w:r>
+      <w:r>
+        <w:rPr>
+          <w:i/>
+          <w:iCs/>
+        </w:rPr>
+        <w:t xml:space="preserve"> outliers</w:t>
+      </w:r>
+      <w:r>
+        <w:t>.</w:t>
+      </w:r>
+    </w:p>
+    <w:p>
+      <w:pPr>
+        <w:pStyle w:val="Ttulo3"/>
+      </w:pPr>
+      <w:r>
+        <w:t xml:space="preserve">Naturaleza de los </w:t>
+      </w:r>
+      <w:r>
+        <w:rPr>
+          <w:iCs/>
+        </w:rPr>
+        <w:t>valores atípicos</w:t>
+      </w:r>
+    </w:p>
+    <w:p>
+      <w:r>
+        <w:t>Al inspeccionar los datos originale</w:t>
+      </w:r>
+      <w:r>
+        <w:t>s</w:t>
+      </w:r>
+      <w:r>
+        <w:t xml:space="preserve">, existen registros claramente corruptos o sintéticos fuera de la escala normal de </w:t>
+      </w:r>
+      <w:r>
+        <w:t>un comercio</w:t>
+      </w:r>
+      <w:r>
+        <w:t>:</w:t>
+      </w:r>
+    </w:p>
+    <w:p>
+      <w:pPr>
+        <w:ind w:left="720"/>
+      </w:pPr>
+      <w:r>
+        <w:rPr>
+          <w:b/>
+          <w:bCs/>
+        </w:rPr>
+        <w:t xml:space="preserve">En </w:t>
+      </w:r>
+      <w:r>
+        <w:rPr>
+          <w:b/>
+          <w:bCs/>
+        </w:rPr>
+        <w:t xml:space="preserve">la columna </w:t>
+      </w:r>
+      <w:r>
+        <w:rPr>
+          <w:rStyle w:val="HTML"/>
+          <w:b/>
+          <w:bCs/>
+          <w:i/>
+          <w:iCs/>
+        </w:rPr>
+        <w:t>cantidad</w:t>
+      </w:r>
+      <w:r>
+        <w:t xml:space="preserve">. </w:t>
+      </w:r>
+      <w:r>
+        <w:t>M</w:t>
+      </w:r>
+      <w:r>
+        <w:t xml:space="preserve">ientras que las ventas normales oscilan entre 1 y 10 unidades, hay filas con cantidades extremas </w:t>
+      </w:r>
+      <w:r>
+        <w:t xml:space="preserve">que van desde </w:t>
+      </w:r>
+      <w:r>
+        <w:t>150</w:t>
+      </w:r>
+      <w:r>
+        <w:t xml:space="preserve"> (que puede ser “normal”)</w:t>
+      </w:r>
+      <w:r>
+        <w:t xml:space="preserve">, </w:t>
+      </w:r>
+      <w:r>
+        <w:t xml:space="preserve">pasando por </w:t>
+      </w:r>
+      <w:r>
+        <w:t>500,</w:t>
+      </w:r>
+      <w:r>
+        <w:t xml:space="preserve"> a</w:t>
+      </w:r>
+      <w:r>
+        <w:t xml:space="preserve"> 888, 999 o 1000 unidades.</w:t>
+      </w:r>
+    </w:p>
+    <w:p>
+      <w:pPr>
+        <w:ind w:left="720"/>
+      </w:pPr>
+      <w:r>
+        <w:rPr>
+          <w:b/>
+          <w:bCs/>
+        </w:rPr>
+        <w:t xml:space="preserve">En </w:t>
+      </w:r>
+      <w:r>
+        <w:rPr>
+          <w:rStyle w:val="HTML"/>
+          <w:b/>
+          <w:bCs/>
+          <w:i/>
+          <w:iCs/>
+        </w:rPr>
+        <w:t>precio_unitario</w:t>
+      </w:r>
+      <w:r>
+        <w:t>.</w:t>
+      </w:r>
+      <w:r>
+        <w:t xml:space="preserve"> Mientras que los precios reales del catálogo oscilan entre ~15.00 y ~350.00, hay filas con precios desorbitados </w:t>
+      </w:r>
+      <w:r>
+        <w:t>desde</w:t>
+      </w:r>
+      <w:r>
+        <w:t xml:space="preserve"> 5000</w:t>
+      </w:r>
+      <w:r>
+        <w:t xml:space="preserve"> a más de</w:t>
+      </w:r>
+      <w:r>
+        <w:t xml:space="preserve"> 25000.</w:t>
+      </w:r>
+    </w:p>
+    <w:p/>
+    <w:p>
+      <w:r>
+        <w:t>En algunos registros</w:t>
+      </w:r>
+      <w:r>
+        <w:t>,</w:t>
+      </w:r>
+      <w:r>
+        <w:t xml:space="preserve"> el valor atípico está solo en </w:t>
+      </w:r>
+      <w:r>
+        <w:rPr>
+          <w:rStyle w:val="HTML"/>
+        </w:rPr>
+        <w:t>cantidad</w:t>
+      </w:r>
+      <w:r>
+        <w:t xml:space="preserve">, en otros solo en </w:t>
+      </w:r>
+      <w:r>
+        <w:rPr>
+          <w:rStyle w:val="HTML"/>
+        </w:rPr>
+        <w:t>precio_unitario</w:t>
+      </w:r>
+      <w:r>
+        <w:t xml:space="preserve">, </w:t>
+      </w:r>
+      <w:r>
+        <w:t>pero</w:t>
+      </w:r>
+      <w:r>
+        <w:t xml:space="preserve"> puede darse el caso de que coincida en ambos.</w:t>
+      </w:r>
+    </w:p>
+    <w:p>
+      <w:pPr>
+        <w:pStyle w:val="Ttulo3"/>
+      </w:pPr>
+      <w:r>
+        <w:t>Método estadístico de detección (Rango Intercuartílico):</w:t>
+      </w:r>
+    </w:p>
+    <w:p>
+      <w:r>
+        <w:t xml:space="preserve">Para no poner umbrales fijos </w:t>
+      </w:r>
+      <w:r>
+        <w:t>“</w:t>
+      </w:r>
+      <w:r>
+        <w:t>a</w:t>
+      </w:r>
+      <w:r>
+        <w:t>l vuelo”, que podríamos al ser muy pocas filas</w:t>
+      </w:r>
+      <w:r>
+        <w:t xml:space="preserve">, </w:t>
+      </w:r>
+      <w:r>
+        <w:t xml:space="preserve">voy a </w:t>
+      </w:r>
+      <w:r>
+        <w:t>aplica</w:t>
+      </w:r>
+      <w:r>
+        <w:t>r</w:t>
+      </w:r>
+      <w:r>
+        <w:t xml:space="preserve"> </w:t>
+      </w:r>
+      <w:r>
+        <w:t>el</w:t>
+      </w:r>
+      <w:r>
+        <w:t xml:space="preserve"> criterio estadístico estándar del </w:t>
+      </w:r>
+      <w:r>
+        <w:rPr>
+          <w:b/>
+          <w:bCs/>
+        </w:rPr>
+        <w:t>Rango Intercuartílico (IQR)</w:t>
+      </w:r>
+      <w:r>
+        <w:t xml:space="preserve"> sobre </w:t>
+      </w:r>
+      <w:r>
+        <w:rPr>
+          <w:rStyle w:val="HTML"/>
+        </w:rPr>
+        <w:t>cantidad</w:t>
+      </w:r>
+      <w:r>
+        <w:t xml:space="preserve"> y </w:t>
+      </w:r>
+      <w:r>
+        <w:rPr>
+          <w:rStyle w:val="HTML"/>
+        </w:rPr>
+        <w:t>precio_unitario</w:t>
+      </w:r>
+      <w:r>
+        <w:t>.</w:t>
+      </w:r>
+    </w:p>
+    <w:p/>
+    <w:p>
+      <w:pPr>
+        <w:rPr>
+          <w:rFonts w:eastAsiaTheme="minorEastAsia"/>
+        </w:rPr>
+      </w:pPr>
+      <m:oMathPara>
+        <m:oMath>
+          <m:r>
+            <m:rPr>
+              <m:sty m:val="p"/>
+            </m:rPr>
+            <w:rPr>
+              <w:rFonts w:ascii="Cambria Math" w:hAnsi="Cambria Math"/>
+            </w:rPr>
+            <m:t>IQ</m:t>
+          </m:r>
+          <m:r>
+            <m:rPr>
+              <m:sty m:val="p"/>
+            </m:rPr>
+            <w:rPr>
+              <w:rFonts w:ascii="Cambria Math" w:hAnsi="Cambria Math"/>
+            </w:rPr>
+            <m:t>R</m:t>
+          </m:r>
+          <m:r>
+            <w:rPr>
+              <w:rFonts w:ascii="Cambria Math" w:eastAsia="Cambria Math" w:hAnsi="Cambria Math" w:cs="Cambria Math"/>
+            </w:rPr>
+            <m:t>=</m:t>
+          </m:r>
+          <m:sSub>
+            <m:sSubPr>
+              <m:ctrlPr>
+                <w:rPr>
+                  <w:rFonts w:ascii="Cambria Math" w:eastAsia="Cambria Math" w:hAnsi="Cambria Math" w:cs="Cambria Math"/>
+                  <w:i/>
+                </w:rPr>
+              </m:ctrlPr>
+            </m:sSubPr>
+            <m:e>
+              <m:r>
+                <m:rPr>
+                  <m:sty m:val="p"/>
+                </m:rPr>
+                <w:rPr>
+                  <w:rFonts w:ascii="Cambria Math" w:hAnsi="Cambria Math"/>
+                </w:rPr>
+                <m:t>Q</m:t>
+              </m:r>
+            </m:e>
+            <m:sub>
+              <m:r>
+                <w:rPr>
+                  <w:rFonts w:ascii="Cambria Math" w:eastAsia="Cambria Math" w:hAnsi="Cambria Math" w:cs="Cambria Math"/>
+                </w:rPr>
+                <m:t>3</m:t>
+              </m:r>
+            </m:sub>
+          </m:sSub>
+          <m:r>
+            <m:rPr>
+              <m:sty m:val="p"/>
+            </m:rPr>
+            <w:rPr>
+              <w:rFonts w:ascii="Cambria Math" w:hAnsi="Cambria Math"/>
+            </w:rPr>
+            <m:t xml:space="preserve"> -</m:t>
+          </m:r>
+          <m:sSub>
+            <m:sSubPr>
+              <m:ctrlPr>
+                <w:rPr>
+                  <w:rFonts w:ascii="Cambria Math" w:hAnsi="Cambria Math"/>
+                </w:rPr>
+              </m:ctrlPr>
+            </m:sSubPr>
+            <m:e>
+              <m:r>
+                <m:rPr>
+                  <m:sty m:val="p"/>
+                </m:rPr>
+                <w:rPr>
+                  <w:rFonts w:ascii="Cambria Math" w:hAnsi="Cambria Math"/>
+                </w:rPr>
+                <m:t>Q</m:t>
+              </m:r>
+            </m:e>
+            <m:sub>
+              <m:r>
+                <w:rPr>
+                  <w:rFonts w:ascii="Cambria Math" w:hAnsi="Cambria Math"/>
+                </w:rPr>
+                <m:t>1</m:t>
+              </m:r>
+            </m:sub>
+          </m:sSub>
+        </m:oMath>
+      </m:oMathPara>
+    </w:p>
+    <w:p>
+      <w:pPr>
+        <w:rPr>
+          <w:rFonts w:eastAsiaTheme="minorEastAsia"/>
+        </w:rPr>
+      </w:pPr>
+    </w:p>
+    <w:p>
+      <w:pPr>
+        <w:rPr>
+          <w:rFonts w:eastAsiaTheme="minorEastAsia"/>
+        </w:rPr>
+      </w:pPr>
+      <m:oMathPara>
+        <m:oMath>
+          <m:r>
+            <w:rPr>
+              <w:rFonts w:ascii="Cambria Math" w:eastAsia="Cambria Math" w:hAnsi="Cambria Math" w:cs="Cambria Math"/>
+            </w:rPr>
+            <m:t>IQR Factor=</m:t>
+          </m:r>
+          <m:sSub>
+            <m:sSubPr>
+              <m:ctrlPr>
+                <w:rPr>
+                  <w:rFonts w:ascii="Cambria Math" w:eastAsia="Cambria Math" w:hAnsi="Cambria Math" w:cs="Cambria Math"/>
+                  <w:i/>
+                </w:rPr>
+              </m:ctrlPr>
+            </m:sSubPr>
+            <m:e>
+              <m:r>
+                <w:rPr>
+                  <w:rFonts w:ascii="Cambria Math" w:eastAsia="Cambria Math" w:hAnsi="Cambria Math" w:cs="Cambria Math"/>
+                </w:rPr>
+                <m:t>IQR</m:t>
+              </m:r>
+            </m:e>
+            <m:sub>
+              <m:r>
+                <w:rPr>
+                  <w:rFonts w:ascii="Cambria Math" w:eastAsia="Cambria Math" w:hAnsi="Cambria Math" w:cs="Cambria Math"/>
+                </w:rPr>
+                <m:t>f</m:t>
+              </m:r>
+            </m:sub>
+          </m:sSub>
+          <m:r>
+            <w:rPr>
+              <w:rFonts w:ascii="Cambria Math" w:eastAsia="Cambria Math" w:hAnsi="Cambria Math" w:cs="Cambria Math"/>
+            </w:rPr>
+            <m:t>=</m:t>
+          </m:r>
+          <m:r>
+            <w:rPr>
+              <w:rFonts w:ascii="Cambria Math" w:eastAsia="Cambria Math" w:hAnsi="Cambria Math" w:cs="Cambria Math"/>
+            </w:rPr>
+            <m:t>3</m:t>
+          </m:r>
+        </m:oMath>
+      </m:oMathPara>
+    </w:p>
+    <w:p>
+      <w:pPr>
+        <w:rPr>
+          <w:rFonts w:eastAsiaTheme="minorEastAsia"/>
+        </w:rPr>
+      </w:pPr>
+    </w:p>
+    <w:p>
+      <w:pPr>
+        <w:rPr>
+          <w:rFonts w:eastAsiaTheme="minorEastAsia"/>
+          <w:iCs/>
+        </w:rPr>
+      </w:pPr>
+      <m:oMathPara>
+        <m:oMath>
+          <m:r>
+            <m:rPr>
+              <m:sty m:val="p"/>
+            </m:rPr>
+            <w:rPr>
+              <w:rFonts w:ascii="Cambria Math" w:hAnsi="Cambria Math"/>
+            </w:rPr>
+            <m:t>Límite inferior</m:t>
+          </m:r>
+          <m:r>
+            <w:rPr>
+              <w:rFonts w:ascii="Cambria Math" w:eastAsia="Cambria Math" w:hAnsi="Cambria Math" w:cs="Cambria Math"/>
+            </w:rPr>
+            <m:t>=</m:t>
+          </m:r>
+          <m:sSub>
+            <m:sSubPr>
+              <m:ctrlPr>
+                <w:rPr>
+                  <w:rFonts w:ascii="Cambria Math" w:hAnsi="Cambria Math"/>
+                </w:rPr>
+              </m:ctrlPr>
+            </m:sSubPr>
+            <m:e>
+              <m:r>
+                <m:rPr>
+                  <m:sty m:val="p"/>
+                </m:rPr>
+                <w:rPr>
+                  <w:rFonts w:ascii="Cambria Math" w:hAnsi="Cambria Math"/>
+                </w:rPr>
+                <m:t>Q</m:t>
+              </m:r>
+            </m:e>
+            <m:sub>
+              <m:r>
+                <w:rPr>
+                  <w:rFonts w:ascii="Cambria Math" w:hAnsi="Cambria Math"/>
+                </w:rPr>
+                <m:t>1</m:t>
+              </m:r>
+            </m:sub>
+          </m:sSub>
+          <m:r>
+            <w:rPr>
+              <w:rFonts w:ascii="Cambria Math" w:hAnsi="Cambria Math"/>
+            </w:rPr>
+            <m:t xml:space="preserve"> -</m:t>
+          </m:r>
+          <m:sSub>
+            <m:sSubPr>
+              <m:ctrlPr>
+                <w:rPr>
+                  <w:rFonts w:ascii="Cambria Math" w:eastAsia="Cambria Math" w:hAnsi="Cambria Math" w:cs="Cambria Math"/>
+                  <w:i/>
+                </w:rPr>
+              </m:ctrlPr>
+            </m:sSubPr>
+            <m:e>
+              <m:r>
+                <w:rPr>
+                  <w:rFonts w:ascii="Cambria Math" w:eastAsia="Cambria Math" w:hAnsi="Cambria Math" w:cs="Cambria Math"/>
+                </w:rPr>
+                <m:t>IQR</m:t>
+              </m:r>
+            </m:e>
+            <m:sub>
+              <m:r>
+                <w:rPr>
+                  <w:rFonts w:ascii="Cambria Math" w:eastAsia="Cambria Math" w:hAnsi="Cambria Math" w:cs="Cambria Math"/>
+                </w:rPr>
+                <m:t>f</m:t>
+              </m:r>
+            </m:sub>
+          </m:sSub>
+          <m:r>
+            <w:rPr>
+              <w:rFonts w:ascii="Cambria Math" w:hAnsi="Cambria Math"/>
+            </w:rPr>
+            <m:t>×</m:t>
+          </m:r>
+          <m:r>
+            <m:rPr>
+              <m:sty m:val="p"/>
+            </m:rPr>
+            <w:rPr>
+              <w:rFonts w:ascii="Cambria Math" w:hAnsi="Cambria Math"/>
+            </w:rPr>
+            <m:t>IQR</m:t>
+          </m:r>
+        </m:oMath>
+      </m:oMathPara>
+    </w:p>
+    <w:p>
+      <w:pPr>
+        <w:rPr>
+          <w:rFonts w:eastAsiaTheme="minorEastAsia"/>
+        </w:rPr>
+      </w:pPr>
+    </w:p>
+    <w:p>
+      <w:pPr>
+        <w:rPr>
+          <w:rFonts w:eastAsiaTheme="minorEastAsia"/>
+        </w:rPr>
+      </w:pPr>
+      <m:oMathPara>
+        <m:oMath>
+          <m:r>
+            <m:rPr>
+              <m:sty m:val="p"/>
+            </m:rPr>
+            <w:rPr>
+              <w:rFonts w:ascii="Cambria Math" w:hAnsi="Cambria Math"/>
+            </w:rPr>
+            <m:t>Límite superior</m:t>
+          </m:r>
+          <m:r>
+            <w:rPr>
+              <w:rFonts w:ascii="Cambria Math" w:eastAsia="Cambria Math" w:hAnsi="Cambria Math" w:cs="Cambria Math"/>
+            </w:rPr>
+            <m:t>=</m:t>
+          </m:r>
+          <m:sSub>
+            <m:sSubPr>
+              <m:ctrlPr>
+                <w:rPr>
+                  <w:rFonts w:ascii="Cambria Math" w:eastAsia="Cambria Math" w:hAnsi="Cambria Math" w:cs="Cambria Math"/>
+                  <w:i/>
+                </w:rPr>
+              </m:ctrlPr>
+            </m:sSubPr>
+            <m:e>
+              <m:r>
+                <m:rPr>
+                  <m:sty m:val="p"/>
+                </m:rPr>
+                <w:rPr>
+                  <w:rFonts w:ascii="Cambria Math" w:hAnsi="Cambria Math"/>
+                </w:rPr>
+                <m:t>Q</m:t>
+              </m:r>
+            </m:e>
+            <m:sub>
+              <m:r>
+                <w:rPr>
+                  <w:rFonts w:ascii="Cambria Math" w:eastAsia="Cambria Math" w:hAnsi="Cambria Math" w:cs="Cambria Math"/>
+                </w:rPr>
+                <m:t>3</m:t>
+              </m:r>
+            </m:sub>
+          </m:sSub>
+        </m:oMath>
+      </m:oMathPara>
+    </w:p>
+    <w:p/>
+    <w:p>
+      <w:r>
+        <w:lastRenderedPageBreak/>
+        <w:t xml:space="preserve">Como la columna </w:t>
+      </w:r>
+      <w:r>
+        <w:rPr>
+          <w:rStyle w:val="HTML"/>
+        </w:rPr>
+        <w:t>t</w:t>
+      </w:r>
+      <w:r>
+        <w:rPr>
+          <w:rStyle w:val="HTML"/>
+        </w:rPr>
+        <w:t>otal</w:t>
+      </w:r>
+      <w:r>
+        <w:t xml:space="preserve"> es una </w:t>
+      </w:r>
+      <w:r>
+        <w:t>“</w:t>
+      </w:r>
+      <w:r>
+        <w:t>variable derivada</w:t>
+      </w:r>
+      <w:r>
+        <w:t>” no la voy a evaluar</w:t>
+      </w:r>
+      <w:r>
+        <w:t>. Si una venta legítima tiene una cantidad normal alta (ej. 9 unidades) y un precio normal alto (ej. 290), su total (2610) podría superar el Q</w:t>
+      </w:r>
+      <w:r>
+        <w:rPr>
+          <w:vertAlign w:val="subscript"/>
+        </w:rPr>
+        <w:t>3</w:t>
+      </w:r>
+      <w:r>
+        <w:t xml:space="preserve"> + 1</w:t>
+      </w:r>
+      <w:r>
+        <w:t>,</w:t>
+      </w:r>
+      <w:r>
+        <w:t xml:space="preserve">5 </w:t>
+      </w:r>
+      <w:r>
+        <w:t xml:space="preserve">x </w:t>
+      </w:r>
+      <w:r>
+        <w:t>IQR de la columna total y ser eliminado</w:t>
+      </w:r>
+      <w:r>
+        <w:t xml:space="preserve">, se considera un </w:t>
+      </w:r>
+      <w:r>
+        <w:rPr>
+          <w:i/>
+          <w:iCs/>
+        </w:rPr>
+        <w:t>falso positivo</w:t>
+      </w:r>
+      <w:r>
+        <w:t>. Evaluando únicamente las dos variables primarias independientes</w:t>
+      </w:r>
+      <w:r>
+        <w:t xml:space="preserve">, </w:t>
+      </w:r>
+      <w:r>
+        <w:rPr>
+          <w:rStyle w:val="HTML"/>
+        </w:rPr>
+        <w:t>cantidad</w:t>
+      </w:r>
+      <w:r>
+        <w:t xml:space="preserve"> y </w:t>
+      </w:r>
+      <w:r>
+        <w:rPr>
+          <w:rStyle w:val="HTML"/>
+        </w:rPr>
+        <w:t>precio_unitario</w:t>
+      </w:r>
+      <w:r>
+        <w:t xml:space="preserve">, detectamos con precisión </w:t>
+      </w:r>
+      <w:r>
+        <w:rPr>
+          <w:b/>
+          <w:bCs/>
+        </w:rPr>
+        <w:t>22 registros anómalos</w:t>
+      </w:r>
+      <w:r>
+        <w:t>.</w:t>
+      </w:r>
+    </w:p>
+    <w:p>
+      <w:pPr>
+        <w:pStyle w:val="Ttulo3"/>
+      </w:pPr>
+      <w:r>
+        <w:t>Clasificación y acción</w:t>
+      </w:r>
+    </w:p>
+    <w:p>
+      <w:r>
+        <w:t>Aprovechando los literales ya defini</w:t>
+      </w:r>
+      <w:r>
+        <w:t xml:space="preserve">dos: </w:t>
+      </w:r>
+      <w:r>
+        <w:rPr>
+          <w:rStyle w:val="HTML"/>
+        </w:rPr>
+        <w:t>outlier_cantidad</w:t>
+      </w:r>
+      <w:r>
+        <w:t xml:space="preserve">, </w:t>
+      </w:r>
+      <w:r>
+        <w:rPr>
+          <w:rStyle w:val="HTML"/>
+        </w:rPr>
+        <w:t>outlier_precio_unitario</w:t>
+      </w:r>
+      <w:r>
+        <w:t xml:space="preserve"> y </w:t>
+      </w:r>
+      <w:r>
+        <w:rPr>
+          <w:rStyle w:val="HTML"/>
+        </w:rPr>
+        <w:t>outlier_both</w:t>
+      </w:r>
+      <w:r>
+        <w:t xml:space="preserve">; </w:t>
+      </w:r>
+      <w:r>
+        <w:t>clasificamos las máscaras de forma mutuamente excluyente:</w:t>
+      </w:r>
+    </w:p>
+    <w:p/>
+    <w:p>
+      <w:pPr>
+        <w:numPr>
+          <w:ilvl w:val="0"/>
+          <w:numId w:val="53"/>
+        </w:numPr>
+        <w:tabs>
+          <w:tab w:val="clear" w:pos="720"/>
+        </w:tabs>
+      </w:pPr>
+      <w:r>
+        <w:rPr>
+          <w:b/>
+          <w:bCs/>
+        </w:rPr>
+        <w:t>bOutBothMask ('outlier_both')</w:t>
+      </w:r>
+    </w:p>
+    <w:p>
+      <w:pPr>
+        <w:ind w:left="720"/>
+      </w:pPr>
+      <w:r>
+        <w:t xml:space="preserve">Filas que son </w:t>
+      </w:r>
+      <w:r>
+        <w:rPr>
+          <w:i/>
+          <w:iCs/>
+        </w:rPr>
+        <w:t>outlier</w:t>
+      </w:r>
+      <w:r>
+        <w:t xml:space="preserve"> en cantidad </w:t>
+      </w:r>
+      <w:r>
+        <w:rPr>
+          <w:b/>
+          <w:bCs/>
+        </w:rPr>
+        <w:t>y</w:t>
+      </w:r>
+      <w:r>
+        <w:t xml:space="preserve"> en precio_unitario simultáneamente.</w:t>
+      </w:r>
+    </w:p>
+    <w:p>
+      <w:pPr>
+        <w:numPr>
+          <w:ilvl w:val="0"/>
+          <w:numId w:val="53"/>
+        </w:numPr>
+        <w:tabs>
+          <w:tab w:val="clear" w:pos="720"/>
+        </w:tabs>
+      </w:pPr>
+      <w:r>
+        <w:rPr>
+          <w:b/>
+          <w:bCs/>
+        </w:rPr>
+        <w:t>bOutQtyMask ('outlier_cantidad')</w:t>
+      </w:r>
+    </w:p>
+    <w:p>
+      <w:pPr>
+        <w:ind w:left="720"/>
+      </w:pPr>
+      <w:r>
+        <w:t xml:space="preserve">Filas que son </w:t>
+      </w:r>
+      <w:r>
+        <w:rPr>
+          <w:i/>
+          <w:iCs/>
+        </w:rPr>
+        <w:t>outlier</w:t>
+      </w:r>
+      <w:r>
+        <w:t xml:space="preserve"> exclusivamente en cantidad.</w:t>
+      </w:r>
+    </w:p>
+    <w:p>
+      <w:pPr>
+        <w:numPr>
+          <w:ilvl w:val="0"/>
+          <w:numId w:val="53"/>
+        </w:numPr>
+        <w:tabs>
+          <w:tab w:val="clear" w:pos="720"/>
+        </w:tabs>
+      </w:pPr>
+      <w:r>
+        <w:rPr>
+          <w:b/>
+          <w:bCs/>
+        </w:rPr>
+        <w:t>bOutPriceMask ('outlier_precio_unitario')</w:t>
+      </w:r>
+    </w:p>
+    <w:p>
+      <w:pPr>
+        <w:ind w:left="720"/>
+      </w:pPr>
+      <w:r>
+        <w:t xml:space="preserve">Filas que son </w:t>
+      </w:r>
+      <w:r>
+        <w:rPr>
+          <w:i/>
+          <w:iCs/>
+        </w:rPr>
+        <w:t>outlier</w:t>
+      </w:r>
+      <w:r>
+        <w:t xml:space="preserve"> exclusivamente en precio_unitario.</w:t>
+      </w:r>
+    </w:p>
+    <w:p>
+      <w:pPr>
+        <w:rPr>
+          <w:b/>
+          <w:bCs/>
+        </w:rPr>
+      </w:pPr>
+    </w:p>
+    <w:p>
+      <w:r>
+        <w:t xml:space="preserve">Al </w:t>
+      </w:r>
+      <w:r>
+        <w:t xml:space="preserve">considerarse </w:t>
+      </w:r>
+      <w:r>
+        <w:t xml:space="preserve">errores que distorsionarían gravemente la media y las gráficas de negocio, </w:t>
+      </w:r>
+      <w:r>
+        <w:t>quedan</w:t>
+      </w:r>
+      <w:r>
+        <w:t xml:space="preserve"> registra</w:t>
+      </w:r>
+      <w:r>
+        <w:t>dos en el dataset de incidencias</w:t>
+      </w:r>
+      <w:r>
+        <w:t xml:space="preserve"> </w:t>
+      </w:r>
+      <w:r>
+        <w:t>y excluidos del conjunto de datos limpio</w:t>
+      </w:r>
+      <w:r>
+        <w:t>.</w:t>
+      </w:r>
+    </w:p>
+    <w:p/>
+    <w:p>
+      <w:pPr>
+        <w:spacing w:after="60"/>
+        <w:contextualSpacing w:val="0"/>
+      </w:pPr>
+      <w:r>
+        <w:t>Ejecutamos entonces la celda:</w:t>
+      </w:r>
+    </w:p>
+    <w:p>
+      <w:pPr>
+        <w:pStyle w:val="Prrafocdigo"/>
+        <w:ind w:firstLine="284"/>
+      </w:pPr>
+    </w:p>
+    <w:p>
+      <w:pPr>
+        <w:pStyle w:val="Prrafocdigo"/>
+        <w:ind w:firstLine="284"/>
+      </w:pPr>
+      <w:r>
+        <w:t># DATA CLEANING, 4. INVALID NUMERICS AND TOTALS CORRECTION</w:t>
+      </w:r>
+    </w:p>
+    <w:p>
+      <w:pPr>
+        <w:pStyle w:val="Prrafocdigo"/>
+        <w:ind w:firstLine="284"/>
+      </w:pPr>
+      <w:r>
+        <w:t># ========================================================</w:t>
+      </w:r>
+    </w:p>
+    <w:p>
+      <w:pPr>
+        <w:pStyle w:val="Prrafocdigo"/>
+      </w:pPr>
+    </w:p>
+    <w:p/>
+    <w:p>
+      <w:pPr>
+        <w:spacing w:after="60"/>
+        <w:contextualSpacing w:val="0"/>
+      </w:pPr>
+      <w:r>
+        <w:t>Para finalmente tener el conjunto de datos limpio, con el resultado:</w:t>
+      </w:r>
+    </w:p>
+    <w:p>
+      <w:r>
+        <w:drawing>
+          <wp:inline distT="0" distB="0" distL="0" distR="0" wp14:anchorId="21FD7C14" wp14:editId="2CFA7E70">
+            <wp:extent cx="5759450" cy="2291715"/>
+            <wp:effectExtent l="0" t="0" r="0" b="0"/>
+            <wp:docPr id="59" name="Imagen 59"/>
+            <wp:cNvGraphicFramePr>
+              <a:graphicFrameLocks xmlns:a="http://schemas.openxmlformats.org/drawingml/2006/main" noChangeAspect="1"/>
+            </wp:cNvGraphicFramePr>
+            <a:graphic xmlns:a="http://schemas.openxmlformats.org/drawingml/2006/main">
+              <a:graphicData uri="http://schemas.openxmlformats.org/drawingml/2006/picture">
+                <pic:pic xmlns:pic="http://schemas.openxmlformats.org/drawingml/2006/picture">
+                  <pic:nvPicPr>
+                    <pic:cNvPr id="1" name=""/>
+                    <pic:cNvPicPr/>
+                  </pic:nvPicPr>
+                  <pic:blipFill>
+                    <a:blip r:embed="rId38"/>
+                    <a:stretch>
+                      <a:fillRect/>
+                    </a:stretch>
+                  </pic:blipFill>
+                  <pic:spPr>
+                    <a:xfrm>
+                      <a:off x="0" y="0"/>
+                      <a:ext cx="5759450" cy="2291715"/>
+                    </a:xfrm>
+                    <a:prstGeom prst="rect">
+                      <a:avLst/>
+                    </a:prstGeom>
+                  </pic:spPr>
+                </pic:pic>
+              </a:graphicData>
+            </a:graphic>
+          </wp:inline>
+        </w:drawing>
+      </w:r>
+    </w:p>
+    <w:p>
+      <w:pPr>
+        <w:rPr>
+          <w:b/>
+          <w:bCs/>
+        </w:rPr>
+      </w:pPr>
+    </w:p>
+    <w:p>
+      <w:r>
+        <w:rPr>
+          <w:b/>
+          <w:bCs/>
+        </w:rPr>
+        <w:t xml:space="preserve">22 </w:t>
+      </w:r>
+      <w:r>
+        <w:rPr>
+          <w:b/>
+          <w:bCs/>
+          <w:i/>
+          <w:iCs/>
+        </w:rPr>
+        <w:t>outliers</w:t>
+      </w:r>
+      <w:r>
+        <w:rPr>
+          <w:b/>
+          <w:bCs/>
+        </w:rPr>
+        <w:t xml:space="preserve"> </w:t>
+      </w:r>
+      <w:r>
+        <w:t>eliminados</w:t>
+      </w:r>
+      <w:r>
+        <w:t xml:space="preserve">: </w:t>
+      </w:r>
+      <w:r>
+        <w:rPr>
+          <w:i/>
+          <w:iCs/>
+        </w:rPr>
+        <w:t>6 en ambos campos</w:t>
+      </w:r>
+      <w:r>
+        <w:t xml:space="preserve">, </w:t>
+      </w:r>
+      <w:r>
+        <w:rPr>
+          <w:i/>
+          <w:iCs/>
+        </w:rPr>
+        <w:t xml:space="preserve">8 en </w:t>
+      </w:r>
+      <w:r>
+        <w:rPr>
+          <w:rStyle w:val="HTML"/>
+        </w:rPr>
+        <w:t>cantidad</w:t>
+      </w:r>
+      <w:r>
+        <w:t xml:space="preserve"> y 8 en </w:t>
+      </w:r>
+      <w:r>
+        <w:rPr>
+          <w:rStyle w:val="HTML"/>
+        </w:rPr>
+        <w:t>precio_unitario</w:t>
+      </w:r>
+      <w:r>
+        <w:t>.</w:t>
+      </w:r>
+    </w:p>
+    <w:p>
+      <w:r>
+        <w:t xml:space="preserve">Las 3 ventas legítimas con precios de hasta </w:t>
+      </w:r>
+      <w:r>
+        <w:rPr>
+          <w:b/>
+          <w:bCs/>
+        </w:rPr>
+        <w:t>247.86</w:t>
+      </w:r>
+      <w:r>
+        <w:t xml:space="preserve"> se han conservado correctamente gracias al </w:t>
+      </w:r>
+      <w:r>
+        <w:t xml:space="preserve">3 del </w:t>
+      </w:r>
+      <w:r>
+        <w:t xml:space="preserve">factor </w:t>
+      </w:r>
+      <w:r>
+        <w:t>IQR</w:t>
+      </w:r>
+      <w:r>
+        <w:t>.</w:t>
+      </w:r>
+    </w:p>
+    <w:p>
+      <w:r>
+        <w:t>El conjunto de datos final</w:t>
+      </w:r>
+      <w:r>
+        <w:t xml:space="preserve"> pasa de </w:t>
+      </w:r>
+      <w:r>
+        <w:rPr>
+          <w:b/>
+          <w:bCs/>
+        </w:rPr>
+        <w:t>255 a 233 filas</w:t>
+      </w:r>
+      <w:r>
+        <w:t xml:space="preserve"> completamente limpias.</w:t>
+      </w:r>
     </w:p>
     <w:p>
       <w:pPr>
@@ -25126,9 +27073,194 @@
             <w:sz w:val="18"/>
             <w:szCs w:val="18"/>
           </w:rPr>
-          <w:t>[Ir al índice]</w:t>
+          <w:t xml:space="preserve">[Ir </w:t>
+        </w:r>
+        <w:r>
+          <w:rPr>
+            <w:rStyle w:val="Hipervnculo2"/>
+            <w:b w:val="0"/>
+            <w:bCs w:val="0"/>
+            <w:i/>
+            <w:iCs w:val="0"/>
+            <w:sz w:val="18"/>
+            <w:szCs w:val="18"/>
+          </w:rPr>
+          <w:t>a</w:t>
+        </w:r>
+        <w:r>
+          <w:rPr>
+            <w:rStyle w:val="Hipervnculo2"/>
+            <w:b w:val="0"/>
+            <w:bCs w:val="0"/>
+            <w:i/>
+            <w:iCs w:val="0"/>
+            <w:sz w:val="18"/>
+            <w:szCs w:val="18"/>
+          </w:rPr>
+          <w:t>l índice]</w:t>
         </w:r>
       </w:hyperlink>
+    </w:p>
+    <w:p>
+      <w:r>
+        <w:t>Como no puede ser de otra forma, a</w:t>
+      </w:r>
+      <w:r>
+        <w:t>ntes de generar el archivo ventas_limpias.csv, verificamos mediante comprobaciones programáticas que en dfCln se cumplen simultáneamente las 5 invariantes de calidad:</w:t>
+      </w:r>
+    </w:p>
+    <w:p>
+      <w:pPr>
+        <w:numPr>
+          <w:ilvl w:val="0"/>
+          <w:numId w:val="54"/>
+        </w:numPr>
+      </w:pPr>
+      <w:r>
+        <w:t>0 valores nulos en cualquier columna.</w:t>
+      </w:r>
+    </w:p>
+    <w:p>
+      <w:pPr>
+        <w:numPr>
+          <w:ilvl w:val="0"/>
+          <w:numId w:val="54"/>
+        </w:numPr>
+      </w:pPr>
+      <w:r>
+        <w:t>0 filas duplicadas en las columnas clave.</w:t>
+      </w:r>
+    </w:p>
+    <w:p>
+      <w:pPr>
+        <w:numPr>
+          <w:ilvl w:val="0"/>
+          <w:numId w:val="54"/>
+        </w:numPr>
+      </w:pPr>
+      <w:r>
+        <w:t>0 valores menores o iguales a cero en columnas numéricas.</w:t>
+      </w:r>
+    </w:p>
+    <w:p>
+      <w:pPr>
+        <w:numPr>
+          <w:ilvl w:val="0"/>
+          <w:numId w:val="54"/>
+        </w:numPr>
+      </w:pPr>
+      <w:r>
+        <w:t>0 discrepancias aritméticas en total = round(cantidad * precio_unitario, 2).</w:t>
+      </w:r>
+    </w:p>
+    <w:p>
+      <w:pPr>
+        <w:numPr>
+          <w:ilvl w:val="0"/>
+          <w:numId w:val="54"/>
+        </w:numPr>
+      </w:pPr>
+      <w:r>
+        <w:lastRenderedPageBreak/>
+        <w:t>0 fechas fuera del rango [2026-09-19, 2026-10-18].</w:t>
+      </w:r>
+    </w:p>
+    <w:p>
+      <w:r>
+        <w:t>Si alguna fallase, se lanza una excepción inmediata impidiendo exportar un archivo corrupto.</w:t>
+      </w:r>
+    </w:p>
+    <w:p/>
+    <w:p>
+      <w:pPr>
+        <w:spacing w:after="60"/>
+        <w:contextualSpacing w:val="0"/>
+      </w:pPr>
+      <w:r>
+        <w:t>Ejecutamos la celda:</w:t>
+      </w:r>
+    </w:p>
+    <w:p>
+      <w:pPr>
+        <w:pStyle w:val="Prrafocdigo"/>
+        <w:ind w:firstLine="284"/>
+      </w:pPr>
+    </w:p>
+    <w:p>
+      <w:pPr>
+        <w:pStyle w:val="Prrafocdigo"/>
+        <w:ind w:firstLine="284"/>
+      </w:pPr>
+      <w:r>
+        <w:t># DATA CLEANING, 7. FINAL VALIDATION AND EXPORT (to CSV file)</w:t>
+      </w:r>
+    </w:p>
+    <w:p>
+      <w:pPr>
+        <w:pStyle w:val="Prrafocdigo"/>
+        <w:ind w:firstLine="284"/>
+      </w:pPr>
+      <w:r>
+        <w:t># ===========================================================</w:t>
+      </w:r>
+    </w:p>
+    <w:p>
+      <w:pPr>
+        <w:pStyle w:val="Prrafocdigo"/>
+        <w:ind w:firstLine="284"/>
+      </w:pPr>
+    </w:p>
+    <w:p/>
+    <w:p>
+      <w:pPr>
+        <w:spacing w:after="60"/>
+        <w:contextualSpacing w:val="0"/>
+      </w:pPr>
+      <w:r>
+        <w:t>Y finalmente tenemos</w:t>
+      </w:r>
+      <w:r>
+        <w:t>:</w:t>
+      </w:r>
+    </w:p>
+    <w:p>
+      <w:r>
+        <w:drawing>
+          <wp:inline distT="0" distB="0" distL="0" distR="0" wp14:anchorId="759EC1E7" wp14:editId="4E146125">
+            <wp:extent cx="5759450" cy="2816860"/>
+            <wp:effectExtent l="0" t="0" r="0" b="2540"/>
+            <wp:docPr id="60" name="Imagen 60"/>
+            <wp:cNvGraphicFramePr>
+              <a:graphicFrameLocks xmlns:a="http://schemas.openxmlformats.org/drawingml/2006/main" noChangeAspect="1"/>
+            </wp:cNvGraphicFramePr>
+            <a:graphic xmlns:a="http://schemas.openxmlformats.org/drawingml/2006/main">
+              <a:graphicData uri="http://schemas.openxmlformats.org/drawingml/2006/picture">
+                <pic:pic xmlns:pic="http://schemas.openxmlformats.org/drawingml/2006/picture">
+                  <pic:nvPicPr>
+                    <pic:cNvPr id="1" name=""/>
+                    <pic:cNvPicPr/>
+                  </pic:nvPicPr>
+                  <pic:blipFill>
+                    <a:blip r:embed="rId39"/>
+                    <a:stretch>
+                      <a:fillRect/>
+                    </a:stretch>
+                  </pic:blipFill>
+                  <pic:spPr>
+                    <a:xfrm>
+                      <a:off x="0" y="0"/>
+                      <a:ext cx="5759450" cy="2816860"/>
+                    </a:xfrm>
+                    <a:prstGeom prst="rect">
+                      <a:avLst/>
+                    </a:prstGeom>
+                  </pic:spPr>
+                </pic:pic>
+              </a:graphicData>
+            </a:graphic>
+          </wp:inline>
+        </w:drawing>
+      </w:r>
     </w:p>
     <w:p/>
     <w:p>
@@ -25331,7 +27463,6 @@
         </w:numPr>
       </w:pPr>
       <w:r>
-        <w:lastRenderedPageBreak/>
         <w:t>'step': Fase del flujo (ej. '2_nulls', '3_duplicates', '4_totals_signs', '5_dates', '6_outliers').</w:t>
       </w:r>
     </w:p>
@@ -25343,6 +27474,7 @@
         </w:numPr>
       </w:pPr>
       <w:r>
+        <w:lastRenderedPageBreak/>
         <w:t>'issue_type': Tipo específico de problema (ej. 'null_critical', 'null_cantidad', 'null_precio_unitario', 'null_total').</w:t>
       </w:r>
     </w:p>
@@ -25424,8 +27556,8 @@
     </w:p>
     <w:p/>
     <w:sectPr>
-      <w:headerReference w:type="default" r:id="rId37"/>
-      <w:footerReference w:type="default" r:id="rId38"/>
+      <w:headerReference w:type="default" r:id="rId40"/>
+      <w:footerReference w:type="default" r:id="rId41"/>
       <w:pgSz w:w="11906" w:h="16838" w:code="9"/>
       <w:pgMar w:top="1134" w:right="1276" w:bottom="1134" w:left="1560" w:header="851" w:footer="0" w:gutter="0"/>
       <w:cols w:space="720"/>
@@ -27758,6 +29890,244 @@
     </w:lvl>
   </w:abstractNum>
   <w:abstractNum w:abstractNumId="21" w15:restartNumberingAfterBreak="0">
+    <w:nsid w:val="2DB47E80"/>
+    <w:multiLevelType w:val="multilevel"/>
+    <w:tmpl w:val="77DEEB04"/>
+    <w:lvl w:ilvl="0">
+      <w:start w:val="1"/>
+      <w:numFmt w:val="decimal"/>
+      <w:lvlText w:val="%1."/>
+      <w:lvlJc w:val="left"/>
+      <w:pPr>
+        <w:tabs>
+          <w:tab w:val="num" w:pos="720"/>
+        </w:tabs>
+        <w:ind w:left="720" w:hanging="360"/>
+      </w:pPr>
+    </w:lvl>
+    <w:lvl w:ilvl="1">
+      <w:start w:val="1"/>
+      <w:numFmt w:val="bullet"/>
+      <w:lvlText w:val="o"/>
+      <w:lvlJc w:val="left"/>
+      <w:pPr>
+        <w:tabs>
+          <w:tab w:val="num" w:pos="1440"/>
+        </w:tabs>
+        <w:ind w:left="1440" w:hanging="360"/>
+      </w:pPr>
+      <w:rPr>
+        <w:rFonts w:ascii="Courier New" w:hAnsi="Courier New" w:hint="default"/>
+        <w:sz w:val="20"/>
+      </w:rPr>
+    </w:lvl>
+    <w:lvl w:ilvl="2" w:tentative="1">
+      <w:start w:val="1"/>
+      <w:numFmt w:val="decimal"/>
+      <w:lvlText w:val="%3."/>
+      <w:lvlJc w:val="left"/>
+      <w:pPr>
+        <w:tabs>
+          <w:tab w:val="num" w:pos="2160"/>
+        </w:tabs>
+        <w:ind w:left="2160" w:hanging="360"/>
+      </w:pPr>
+    </w:lvl>
+    <w:lvl w:ilvl="3" w:tentative="1">
+      <w:start w:val="1"/>
+      <w:numFmt w:val="decimal"/>
+      <w:lvlText w:val="%4."/>
+      <w:lvlJc w:val="left"/>
+      <w:pPr>
+        <w:tabs>
+          <w:tab w:val="num" w:pos="2880"/>
+        </w:tabs>
+        <w:ind w:left="2880" w:hanging="360"/>
+      </w:pPr>
+    </w:lvl>
+    <w:lvl w:ilvl="4" w:tentative="1">
+      <w:start w:val="1"/>
+      <w:numFmt w:val="decimal"/>
+      <w:lvlText w:val="%5."/>
+      <w:lvlJc w:val="left"/>
+      <w:pPr>
+        <w:tabs>
+          <w:tab w:val="num" w:pos="3600"/>
+        </w:tabs>
+        <w:ind w:left="3600" w:hanging="360"/>
+      </w:pPr>
+    </w:lvl>
+    <w:lvl w:ilvl="5" w:tentative="1">
+      <w:start w:val="1"/>
+      <w:numFmt w:val="decimal"/>
+      <w:lvlText w:val="%6."/>
+      <w:lvlJc w:val="left"/>
+      <w:pPr>
+        <w:tabs>
+          <w:tab w:val="num" w:pos="4320"/>
+        </w:tabs>
+        <w:ind w:left="4320" w:hanging="360"/>
+      </w:pPr>
+    </w:lvl>
+    <w:lvl w:ilvl="6" w:tentative="1">
+      <w:start w:val="1"/>
+      <w:numFmt w:val="decimal"/>
+      <w:lvlText w:val="%7."/>
+      <w:lvlJc w:val="left"/>
+      <w:pPr>
+        <w:tabs>
+          <w:tab w:val="num" w:pos="5040"/>
+        </w:tabs>
+        <w:ind w:left="5040" w:hanging="360"/>
+      </w:pPr>
+    </w:lvl>
+    <w:lvl w:ilvl="7" w:tentative="1">
+      <w:start w:val="1"/>
+      <w:numFmt w:val="decimal"/>
+      <w:lvlText w:val="%8."/>
+      <w:lvlJc w:val="left"/>
+      <w:pPr>
+        <w:tabs>
+          <w:tab w:val="num" w:pos="5760"/>
+        </w:tabs>
+        <w:ind w:left="5760" w:hanging="360"/>
+      </w:pPr>
+    </w:lvl>
+    <w:lvl w:ilvl="8" w:tentative="1">
+      <w:start w:val="1"/>
+      <w:numFmt w:val="decimal"/>
+      <w:lvlText w:val="%9."/>
+      <w:lvlJc w:val="left"/>
+      <w:pPr>
+        <w:tabs>
+          <w:tab w:val="num" w:pos="6480"/>
+        </w:tabs>
+        <w:ind w:left="6480" w:hanging="360"/>
+      </w:pPr>
+    </w:lvl>
+  </w:abstractNum>
+  <w:abstractNum w:abstractNumId="22" w15:restartNumberingAfterBreak="0">
+    <w:nsid w:val="2E426076"/>
+    <w:multiLevelType w:val="multilevel"/>
+    <w:tmpl w:val="D9123288"/>
+    <w:lvl w:ilvl="0">
+      <w:start w:val="1"/>
+      <w:numFmt w:val="decimal"/>
+      <w:lvlText w:val="%1."/>
+      <w:lvlJc w:val="left"/>
+      <w:pPr>
+        <w:tabs>
+          <w:tab w:val="num" w:pos="720"/>
+        </w:tabs>
+        <w:ind w:left="720" w:hanging="360"/>
+      </w:pPr>
+    </w:lvl>
+    <w:lvl w:ilvl="1">
+      <w:start w:val="1"/>
+      <w:numFmt w:val="bullet"/>
+      <w:lvlText w:val="o"/>
+      <w:lvlJc w:val="left"/>
+      <w:pPr>
+        <w:tabs>
+          <w:tab w:val="num" w:pos="1440"/>
+        </w:tabs>
+        <w:ind w:left="1440" w:hanging="360"/>
+      </w:pPr>
+      <w:rPr>
+        <w:rFonts w:ascii="Courier New" w:hAnsi="Courier New" w:hint="default"/>
+        <w:sz w:val="20"/>
+      </w:rPr>
+    </w:lvl>
+    <w:lvl w:ilvl="2">
+      <w:start w:val="1"/>
+      <w:numFmt w:val="bullet"/>
+      <w:lvlText w:val=""/>
+      <w:lvlJc w:val="left"/>
+      <w:pPr>
+        <w:tabs>
+          <w:tab w:val="num" w:pos="2160"/>
+        </w:tabs>
+        <w:ind w:left="2160" w:hanging="360"/>
+      </w:pPr>
+      <w:rPr>
+        <w:rFonts w:ascii="Wingdings" w:hAnsi="Wingdings" w:hint="default"/>
+        <w:sz w:val="20"/>
+      </w:rPr>
+    </w:lvl>
+    <w:lvl w:ilvl="3" w:tentative="1">
+      <w:start w:val="1"/>
+      <w:numFmt w:val="decimal"/>
+      <w:lvlText w:val="%4."/>
+      <w:lvlJc w:val="left"/>
+      <w:pPr>
+        <w:tabs>
+          <w:tab w:val="num" w:pos="2880"/>
+        </w:tabs>
+        <w:ind w:left="2880" w:hanging="360"/>
+      </w:pPr>
+    </w:lvl>
+    <w:lvl w:ilvl="4" w:tentative="1">
+      <w:start w:val="1"/>
+      <w:numFmt w:val="decimal"/>
+      <w:lvlText w:val="%5."/>
+      <w:lvlJc w:val="left"/>
+      <w:pPr>
+        <w:tabs>
+          <w:tab w:val="num" w:pos="3600"/>
+        </w:tabs>
+        <w:ind w:left="3600" w:hanging="360"/>
+      </w:pPr>
+    </w:lvl>
+    <w:lvl w:ilvl="5" w:tentative="1">
+      <w:start w:val="1"/>
+      <w:numFmt w:val="decimal"/>
+      <w:lvlText w:val="%6."/>
+      <w:lvlJc w:val="left"/>
+      <w:pPr>
+        <w:tabs>
+          <w:tab w:val="num" w:pos="4320"/>
+        </w:tabs>
+        <w:ind w:left="4320" w:hanging="360"/>
+      </w:pPr>
+    </w:lvl>
+    <w:lvl w:ilvl="6" w:tentative="1">
+      <w:start w:val="1"/>
+      <w:numFmt w:val="decimal"/>
+      <w:lvlText w:val="%7."/>
+      <w:lvlJc w:val="left"/>
+      <w:pPr>
+        <w:tabs>
+          <w:tab w:val="num" w:pos="5040"/>
+        </w:tabs>
+        <w:ind w:left="5040" w:hanging="360"/>
+      </w:pPr>
+    </w:lvl>
+    <w:lvl w:ilvl="7" w:tentative="1">
+      <w:start w:val="1"/>
+      <w:numFmt w:val="decimal"/>
+      <w:lvlText w:val="%8."/>
+      <w:lvlJc w:val="left"/>
+      <w:pPr>
+        <w:tabs>
+          <w:tab w:val="num" w:pos="5760"/>
+        </w:tabs>
+        <w:ind w:left="5760" w:hanging="360"/>
+      </w:pPr>
+    </w:lvl>
+    <w:lvl w:ilvl="8" w:tentative="1">
+      <w:start w:val="1"/>
+      <w:numFmt w:val="decimal"/>
+      <w:lvlText w:val="%9."/>
+      <w:lvlJc w:val="left"/>
+      <w:pPr>
+        <w:tabs>
+          <w:tab w:val="num" w:pos="6480"/>
+        </w:tabs>
+        <w:ind w:left="6480" w:hanging="360"/>
+      </w:pPr>
+    </w:lvl>
+  </w:abstractNum>
+  <w:abstractNum w:abstractNumId="23" w15:restartNumberingAfterBreak="0">
     <w:nsid w:val="2F103702"/>
     <w:multiLevelType w:val="multilevel"/>
     <w:tmpl w:val="20B05278"/>
@@ -27873,128 +30243,7 @@
       </w:pPr>
     </w:lvl>
   </w:abstractNum>
-  <w:abstractNum w:abstractNumId="22" w15:restartNumberingAfterBreak="0">
-    <w:nsid w:val="3093362B"/>
-    <w:multiLevelType w:val="multilevel"/>
-    <w:tmpl w:val="B328736C"/>
-    <w:lvl w:ilvl="0">
-      <w:start w:val="1"/>
-      <w:numFmt w:val="decimal"/>
-      <w:lvlText w:val="%1."/>
-      <w:lvlJc w:val="left"/>
-      <w:pPr>
-        <w:tabs>
-          <w:tab w:val="num" w:pos="720"/>
-        </w:tabs>
-        <w:ind w:left="720" w:hanging="360"/>
-      </w:pPr>
-    </w:lvl>
-    <w:lvl w:ilvl="1">
-      <w:start w:val="1"/>
-      <w:numFmt w:val="bullet"/>
-      <w:lvlText w:val="o"/>
-      <w:lvlJc w:val="left"/>
-      <w:pPr>
-        <w:tabs>
-          <w:tab w:val="num" w:pos="1440"/>
-        </w:tabs>
-        <w:ind w:left="1440" w:hanging="360"/>
-      </w:pPr>
-      <w:rPr>
-        <w:rFonts w:ascii="Courier New" w:hAnsi="Courier New" w:hint="default"/>
-        <w:sz w:val="20"/>
-      </w:rPr>
-    </w:lvl>
-    <w:lvl w:ilvl="2">
-      <w:start w:val="1"/>
-      <w:numFmt w:val="bullet"/>
-      <w:lvlText w:val=""/>
-      <w:lvlJc w:val="left"/>
-      <w:pPr>
-        <w:tabs>
-          <w:tab w:val="num" w:pos="2160"/>
-        </w:tabs>
-        <w:ind w:left="2160" w:hanging="360"/>
-      </w:pPr>
-      <w:rPr>
-        <w:rFonts w:ascii="Wingdings" w:hAnsi="Wingdings" w:hint="default"/>
-        <w:sz w:val="20"/>
-      </w:rPr>
-    </w:lvl>
-    <w:lvl w:ilvl="3" w:tentative="1">
-      <w:start w:val="1"/>
-      <w:numFmt w:val="decimal"/>
-      <w:lvlText w:val="%4."/>
-      <w:lvlJc w:val="left"/>
-      <w:pPr>
-        <w:tabs>
-          <w:tab w:val="num" w:pos="2880"/>
-        </w:tabs>
-        <w:ind w:left="2880" w:hanging="360"/>
-      </w:pPr>
-    </w:lvl>
-    <w:lvl w:ilvl="4" w:tentative="1">
-      <w:start w:val="1"/>
-      <w:numFmt w:val="decimal"/>
-      <w:lvlText w:val="%5."/>
-      <w:lvlJc w:val="left"/>
-      <w:pPr>
-        <w:tabs>
-          <w:tab w:val="num" w:pos="3600"/>
-        </w:tabs>
-        <w:ind w:left="3600" w:hanging="360"/>
-      </w:pPr>
-    </w:lvl>
-    <w:lvl w:ilvl="5" w:tentative="1">
-      <w:start w:val="1"/>
-      <w:numFmt w:val="decimal"/>
-      <w:lvlText w:val="%6."/>
-      <w:lvlJc w:val="left"/>
-      <w:pPr>
-        <w:tabs>
-          <w:tab w:val="num" w:pos="4320"/>
-        </w:tabs>
-        <w:ind w:left="4320" w:hanging="360"/>
-      </w:pPr>
-    </w:lvl>
-    <w:lvl w:ilvl="6" w:tentative="1">
-      <w:start w:val="1"/>
-      <w:numFmt w:val="decimal"/>
-      <w:lvlText w:val="%7."/>
-      <w:lvlJc w:val="left"/>
-      <w:pPr>
-        <w:tabs>
-          <w:tab w:val="num" w:pos="5040"/>
-        </w:tabs>
-        <w:ind w:left="5040" w:hanging="360"/>
-      </w:pPr>
-    </w:lvl>
-    <w:lvl w:ilvl="7" w:tentative="1">
-      <w:start w:val="1"/>
-      <w:numFmt w:val="decimal"/>
-      <w:lvlText w:val="%8."/>
-      <w:lvlJc w:val="left"/>
-      <w:pPr>
-        <w:tabs>
-          <w:tab w:val="num" w:pos="5760"/>
-        </w:tabs>
-        <w:ind w:left="5760" w:hanging="360"/>
-      </w:pPr>
-    </w:lvl>
-    <w:lvl w:ilvl="8" w:tentative="1">
-      <w:start w:val="1"/>
-      <w:numFmt w:val="decimal"/>
-      <w:lvlText w:val="%9."/>
-      <w:lvlJc w:val="left"/>
-      <w:pPr>
-        <w:tabs>
-          <w:tab w:val="num" w:pos="6480"/>
-        </w:tabs>
-        <w:ind w:left="6480" w:hanging="360"/>
-      </w:pPr>
-    </w:lvl>
-  </w:abstractNum>
-  <w:abstractNum w:abstractNumId="23" w15:restartNumberingAfterBreak="0">
+  <w:abstractNum w:abstractNumId="24" w15:restartNumberingAfterBreak="0">
     <w:nsid w:val="30F726D3"/>
     <w:multiLevelType w:val="multilevel"/>
     <w:tmpl w:val="3A2C0856"/>
@@ -28140,147 +30389,6 @@
       <w:rPr>
         <w:rFonts w:ascii="Wingdings" w:hAnsi="Wingdings" w:hint="default"/>
         <w:sz w:val="20"/>
-      </w:rPr>
-    </w:lvl>
-  </w:abstractNum>
-  <w:abstractNum w:abstractNumId="24" w15:restartNumberingAfterBreak="0">
-    <w:nsid w:val="371B4EBB"/>
-    <w:multiLevelType w:val="multilevel"/>
-    <w:tmpl w:val="199A7A68"/>
-    <w:lvl w:ilvl="0">
-      <w:start w:val="1"/>
-      <w:numFmt w:val="decimal"/>
-      <w:lvlText w:val="%1."/>
-      <w:lvlJc w:val="left"/>
-      <w:pPr>
-        <w:tabs>
-          <w:tab w:val="num" w:pos="720"/>
-        </w:tabs>
-        <w:ind w:left="720" w:hanging="360"/>
-      </w:pPr>
-      <w:rPr>
-        <w:rFonts w:hint="default"/>
-      </w:rPr>
-    </w:lvl>
-    <w:lvl w:ilvl="1">
-      <w:start w:val="1"/>
-      <w:numFmt w:val="lowerLetter"/>
-      <w:lvlText w:val="%2"/>
-      <w:lvlJc w:val="right"/>
-      <w:pPr>
-        <w:ind w:left="357" w:firstLine="550"/>
-      </w:pPr>
-      <w:rPr>
-        <w:rFonts w:hint="default"/>
-        <w:i w:val="0"/>
-        <w:iCs/>
-        <w:color w:val="auto"/>
-      </w:rPr>
-    </w:lvl>
-    <w:lvl w:ilvl="2">
-      <w:start w:val="1"/>
-      <w:numFmt w:val="bullet"/>
-      <w:lvlText w:val=""/>
-      <w:lvlJc w:val="left"/>
-      <w:pPr>
-        <w:tabs>
-          <w:tab w:val="num" w:pos="2160"/>
-        </w:tabs>
-        <w:ind w:left="2160" w:hanging="360"/>
-      </w:pPr>
-      <w:rPr>
-        <w:rFonts w:ascii="Wingdings" w:hAnsi="Wingdings" w:hint="default"/>
-        <w:sz w:val="20"/>
-      </w:rPr>
-    </w:lvl>
-    <w:lvl w:ilvl="3">
-      <w:start w:val="1"/>
-      <w:numFmt w:val="decimal"/>
-      <w:lvlText w:val="%4."/>
-      <w:lvlJc w:val="left"/>
-      <w:pPr>
-        <w:tabs>
-          <w:tab w:val="num" w:pos="2880"/>
-        </w:tabs>
-        <w:ind w:left="2880" w:hanging="360"/>
-      </w:pPr>
-      <w:rPr>
-        <w:rFonts w:hint="default"/>
-      </w:rPr>
-    </w:lvl>
-    <w:lvl w:ilvl="4">
-      <w:start w:val="1"/>
-      <w:numFmt w:val="decimal"/>
-      <w:lvlText w:val="%5."/>
-      <w:lvlJc w:val="left"/>
-      <w:pPr>
-        <w:tabs>
-          <w:tab w:val="num" w:pos="3600"/>
-        </w:tabs>
-        <w:ind w:left="3600" w:hanging="360"/>
-      </w:pPr>
-      <w:rPr>
-        <w:rFonts w:hint="default"/>
-      </w:rPr>
-    </w:lvl>
-    <w:lvl w:ilvl="5">
-      <w:start w:val="1"/>
-      <w:numFmt w:val="decimal"/>
-      <w:lvlText w:val="%6."/>
-      <w:lvlJc w:val="left"/>
-      <w:pPr>
-        <w:tabs>
-          <w:tab w:val="num" w:pos="4320"/>
-        </w:tabs>
-        <w:ind w:left="4320" w:hanging="360"/>
-      </w:pPr>
-      <w:rPr>
-        <w:rFonts w:hint="default"/>
-      </w:rPr>
-    </w:lvl>
-    <w:lvl w:ilvl="6">
-      <w:start w:val="1"/>
-      <w:numFmt w:val="decimal"/>
-      <w:lvlText w:val="%7."/>
-      <w:lvlJc w:val="left"/>
-      <w:pPr>
-        <w:tabs>
-          <w:tab w:val="num" w:pos="5040"/>
-        </w:tabs>
-        <w:ind w:left="5040" w:hanging="360"/>
-      </w:pPr>
-      <w:rPr>
-        <w:rFonts w:hint="default"/>
-      </w:rPr>
-    </w:lvl>
-    <w:lvl w:ilvl="7">
-      <w:start w:val="1"/>
-      <w:numFmt w:val="decimal"/>
-      <w:lvlText w:val="%8."/>
-      <w:lvlJc w:val="left"/>
-      <w:pPr>
-        <w:tabs>
-          <w:tab w:val="num" w:pos="5760"/>
-        </w:tabs>
-        <w:ind w:left="5760" w:hanging="360"/>
-      </w:pPr>
-      <w:rPr>
-        <w:rFonts w:hint="default"/>
-      </w:rPr>
-    </w:lvl>
-    <w:lvl w:ilvl="8">
-      <w:start w:val="1"/>
-      <w:numFmt w:val="decimal"/>
-      <w:lvlText w:val="%9."/>
-      <w:lvlJc w:val="left"/>
-      <w:pPr>
-        <w:tabs>
-          <w:tab w:val="num" w:pos="6480"/>
-        </w:tabs>
-        <w:ind w:left="6480" w:hanging="360"/>
-      </w:pPr>
-      <w:rPr>
-        <w:rFonts w:hint="default"/>
       </w:rPr>
     </w:lvl>
   </w:abstractNum>
@@ -29161,13 +31269,13 @@
     </w:lvl>
   </w:abstractNum>
   <w:abstractNum w:abstractNumId="32" w15:restartNumberingAfterBreak="0">
-    <w:nsid w:val="4E05603F"/>
+    <w:nsid w:val="4B262883"/>
     <w:multiLevelType w:val="multilevel"/>
-    <w:tmpl w:val="199A7A68"/>
+    <w:tmpl w:val="B266A898"/>
     <w:lvl w:ilvl="0">
       <w:start w:val="1"/>
-      <w:numFmt w:val="decimal"/>
-      <w:lvlText w:val="%1."/>
+      <w:numFmt w:val="bullet"/>
+      <w:lvlText w:val=""/>
       <w:lvlJc w:val="left"/>
       <w:pPr>
         <w:tabs>
@@ -29176,25 +31284,27 @@
         <w:ind w:left="720" w:hanging="360"/>
       </w:pPr>
       <w:rPr>
-        <w:rFonts w:hint="default"/>
+        <w:rFonts w:ascii="Symbol" w:hAnsi="Symbol" w:hint="default"/>
+        <w:sz w:val="20"/>
       </w:rPr>
     </w:lvl>
-    <w:lvl w:ilvl="1">
+    <w:lvl w:ilvl="1" w:tentative="1">
       <w:start w:val="1"/>
-      <w:numFmt w:val="lowerLetter"/>
-      <w:lvlText w:val="%2"/>
-      <w:lvlJc w:val="right"/>
-      <w:pPr>
-        <w:ind w:left="357" w:firstLine="890"/>
-      </w:pPr>
-      <w:rPr>
-        <w:rFonts w:hint="default"/>
-        <w:i w:val="0"/>
-        <w:iCs/>
-        <w:color w:val="auto"/>
+      <w:numFmt w:val="bullet"/>
+      <w:lvlText w:val="o"/>
+      <w:lvlJc w:val="left"/>
+      <w:pPr>
+        <w:tabs>
+          <w:tab w:val="num" w:pos="1440"/>
+        </w:tabs>
+        <w:ind w:left="1440" w:hanging="360"/>
+      </w:pPr>
+      <w:rPr>
+        <w:rFonts w:ascii="Courier New" w:hAnsi="Courier New" w:hint="default"/>
+        <w:sz w:val="20"/>
       </w:rPr>
     </w:lvl>
-    <w:lvl w:ilvl="2">
+    <w:lvl w:ilvl="2" w:tentative="1">
       <w:start w:val="1"/>
       <w:numFmt w:val="bullet"/>
       <w:lvlText w:val=""/>
@@ -29210,10 +31320,10 @@
         <w:sz w:val="20"/>
       </w:rPr>
     </w:lvl>
-    <w:lvl w:ilvl="3">
+    <w:lvl w:ilvl="3" w:tentative="1">
       <w:start w:val="1"/>
-      <w:numFmt w:val="decimal"/>
-      <w:lvlText w:val="%4."/>
+      <w:numFmt w:val="bullet"/>
+      <w:lvlText w:val=""/>
       <w:lvlJc w:val="left"/>
       <w:pPr>
         <w:tabs>
@@ -29222,13 +31332,14 @@
         <w:ind w:left="2880" w:hanging="360"/>
       </w:pPr>
       <w:rPr>
-        <w:rFonts w:hint="default"/>
+        <w:rFonts w:ascii="Wingdings" w:hAnsi="Wingdings" w:hint="default"/>
+        <w:sz w:val="20"/>
       </w:rPr>
     </w:lvl>
-    <w:lvl w:ilvl="4">
+    <w:lvl w:ilvl="4" w:tentative="1">
       <w:start w:val="1"/>
-      <w:numFmt w:val="decimal"/>
-      <w:lvlText w:val="%5."/>
+      <w:numFmt w:val="bullet"/>
+      <w:lvlText w:val=""/>
       <w:lvlJc w:val="left"/>
       <w:pPr>
         <w:tabs>
@@ -29237,13 +31348,14 @@
         <w:ind w:left="3600" w:hanging="360"/>
       </w:pPr>
       <w:rPr>
-        <w:rFonts w:hint="default"/>
+        <w:rFonts w:ascii="Wingdings" w:hAnsi="Wingdings" w:hint="default"/>
+        <w:sz w:val="20"/>
       </w:rPr>
     </w:lvl>
-    <w:lvl w:ilvl="5">
+    <w:lvl w:ilvl="5" w:tentative="1">
       <w:start w:val="1"/>
-      <w:numFmt w:val="decimal"/>
-      <w:lvlText w:val="%6."/>
+      <w:numFmt w:val="bullet"/>
+      <w:lvlText w:val=""/>
       <w:lvlJc w:val="left"/>
       <w:pPr>
         <w:tabs>
@@ -29252,13 +31364,14 @@
         <w:ind w:left="4320" w:hanging="360"/>
       </w:pPr>
       <w:rPr>
-        <w:rFonts w:hint="default"/>
+        <w:rFonts w:ascii="Wingdings" w:hAnsi="Wingdings" w:hint="default"/>
+        <w:sz w:val="20"/>
       </w:rPr>
     </w:lvl>
-    <w:lvl w:ilvl="6">
+    <w:lvl w:ilvl="6" w:tentative="1">
       <w:start w:val="1"/>
-      <w:numFmt w:val="decimal"/>
-      <w:lvlText w:val="%7."/>
+      <w:numFmt w:val="bullet"/>
+      <w:lvlText w:val=""/>
       <w:lvlJc w:val="left"/>
       <w:pPr>
         <w:tabs>
@@ -29267,13 +31380,14 @@
         <w:ind w:left="5040" w:hanging="360"/>
       </w:pPr>
       <w:rPr>
-        <w:rFonts w:hint="default"/>
+        <w:rFonts w:ascii="Wingdings" w:hAnsi="Wingdings" w:hint="default"/>
+        <w:sz w:val="20"/>
       </w:rPr>
     </w:lvl>
-    <w:lvl w:ilvl="7">
+    <w:lvl w:ilvl="7" w:tentative="1">
       <w:start w:val="1"/>
-      <w:numFmt w:val="decimal"/>
-      <w:lvlText w:val="%8."/>
+      <w:numFmt w:val="bullet"/>
+      <w:lvlText w:val=""/>
       <w:lvlJc w:val="left"/>
       <w:pPr>
         <w:tabs>
@@ -29282,13 +31396,14 @@
         <w:ind w:left="5760" w:hanging="360"/>
       </w:pPr>
       <w:rPr>
-        <w:rFonts w:hint="default"/>
+        <w:rFonts w:ascii="Wingdings" w:hAnsi="Wingdings" w:hint="default"/>
+        <w:sz w:val="20"/>
       </w:rPr>
     </w:lvl>
-    <w:lvl w:ilvl="8">
+    <w:lvl w:ilvl="8" w:tentative="1">
       <w:start w:val="1"/>
-      <w:numFmt w:val="decimal"/>
-      <w:lvlText w:val="%9."/>
+      <w:numFmt w:val="bullet"/>
+      <w:lvlText w:val=""/>
       <w:lvlJc w:val="left"/>
       <w:pPr>
         <w:tabs>
@@ -29297,7 +31412,8 @@
         <w:ind w:left="6480" w:hanging="360"/>
       </w:pPr>
       <w:rPr>
-        <w:rFonts w:hint="default"/>
+        <w:rFonts w:ascii="Wingdings" w:hAnsi="Wingdings" w:hint="default"/>
+        <w:sz w:val="20"/>
       </w:rPr>
     </w:lvl>
   </w:abstractNum>
@@ -29925,6 +32041,123 @@
     </w:lvl>
   </w:abstractNum>
   <w:abstractNum w:abstractNumId="38" w15:restartNumberingAfterBreak="0">
+    <w:nsid w:val="55933E93"/>
+    <w:multiLevelType w:val="hybridMultilevel"/>
+    <w:tmpl w:val="889AF8AE"/>
+    <w:lvl w:ilvl="0" w:tplc="D68C622E">
+      <w:start w:val="1"/>
+      <w:numFmt w:val="decimal"/>
+      <w:lvlText w:val="%1."/>
+      <w:lvlJc w:val="left"/>
+      <w:pPr>
+        <w:tabs>
+          <w:tab w:val="num" w:pos="720"/>
+        </w:tabs>
+        <w:ind w:left="720" w:hanging="360"/>
+      </w:pPr>
+    </w:lvl>
+    <w:lvl w:ilvl="1" w:tplc="E39ED3CE">
+      <w:start w:val="1"/>
+      <w:numFmt w:val="bullet"/>
+      <w:lvlText w:val="o"/>
+      <w:lvlJc w:val="left"/>
+      <w:pPr>
+        <w:tabs>
+          <w:tab w:val="num" w:pos="1440"/>
+        </w:tabs>
+        <w:ind w:left="1440" w:hanging="360"/>
+      </w:pPr>
+      <w:rPr>
+        <w:rFonts w:ascii="Courier New" w:hAnsi="Courier New" w:hint="default"/>
+        <w:sz w:val="20"/>
+      </w:rPr>
+    </w:lvl>
+    <w:lvl w:ilvl="2" w:tplc="04849E46">
+      <w:start w:val="1"/>
+      <w:numFmt w:val="decimal"/>
+      <w:lvlText w:val="%3."/>
+      <w:lvlJc w:val="left"/>
+      <w:pPr>
+        <w:tabs>
+          <w:tab w:val="num" w:pos="2160"/>
+        </w:tabs>
+        <w:ind w:left="2160" w:hanging="360"/>
+      </w:pPr>
+    </w:lvl>
+    <w:lvl w:ilvl="3" w:tplc="6F92C3CE" w:tentative="1">
+      <w:start w:val="1"/>
+      <w:numFmt w:val="decimal"/>
+      <w:lvlText w:val="%4."/>
+      <w:lvlJc w:val="left"/>
+      <w:pPr>
+        <w:tabs>
+          <w:tab w:val="num" w:pos="2880"/>
+        </w:tabs>
+        <w:ind w:left="2880" w:hanging="360"/>
+      </w:pPr>
+    </w:lvl>
+    <w:lvl w:ilvl="4" w:tplc="3C6EA88C" w:tentative="1">
+      <w:start w:val="1"/>
+      <w:numFmt w:val="decimal"/>
+      <w:lvlText w:val="%5."/>
+      <w:lvlJc w:val="left"/>
+      <w:pPr>
+        <w:tabs>
+          <w:tab w:val="num" w:pos="3600"/>
+        </w:tabs>
+        <w:ind w:left="3600" w:hanging="360"/>
+      </w:pPr>
+    </w:lvl>
+    <w:lvl w:ilvl="5" w:tplc="A0B4A150" w:tentative="1">
+      <w:start w:val="1"/>
+      <w:numFmt w:val="decimal"/>
+      <w:lvlText w:val="%6."/>
+      <w:lvlJc w:val="left"/>
+      <w:pPr>
+        <w:tabs>
+          <w:tab w:val="num" w:pos="4320"/>
+        </w:tabs>
+        <w:ind w:left="4320" w:hanging="360"/>
+      </w:pPr>
+    </w:lvl>
+    <w:lvl w:ilvl="6" w:tplc="E270960E" w:tentative="1">
+      <w:start w:val="1"/>
+      <w:numFmt w:val="decimal"/>
+      <w:lvlText w:val="%7."/>
+      <w:lvlJc w:val="left"/>
+      <w:pPr>
+        <w:tabs>
+          <w:tab w:val="num" w:pos="5040"/>
+        </w:tabs>
+        <w:ind w:left="5040" w:hanging="360"/>
+      </w:pPr>
+    </w:lvl>
+    <w:lvl w:ilvl="7" w:tplc="24A64068" w:tentative="1">
+      <w:start w:val="1"/>
+      <w:numFmt w:val="decimal"/>
+      <w:lvlText w:val="%8."/>
+      <w:lvlJc w:val="left"/>
+      <w:pPr>
+        <w:tabs>
+          <w:tab w:val="num" w:pos="5760"/>
+        </w:tabs>
+        <w:ind w:left="5760" w:hanging="360"/>
+      </w:pPr>
+    </w:lvl>
+    <w:lvl w:ilvl="8" w:tplc="26C261CA" w:tentative="1">
+      <w:start w:val="1"/>
+      <w:numFmt w:val="decimal"/>
+      <w:lvlText w:val="%9."/>
+      <w:lvlJc w:val="left"/>
+      <w:pPr>
+        <w:tabs>
+          <w:tab w:val="num" w:pos="6480"/>
+        </w:tabs>
+        <w:ind w:left="6480" w:hanging="360"/>
+      </w:pPr>
+    </w:lvl>
+  </w:abstractNum>
+  <w:abstractNum w:abstractNumId="39" w15:restartNumberingAfterBreak="0">
     <w:nsid w:val="56122D90"/>
     <w:multiLevelType w:val="hybridMultilevel"/>
     <w:tmpl w:val="9AB23E32"/>
@@ -30013,7 +32246,7 @@
       </w:pPr>
     </w:lvl>
   </w:abstractNum>
-  <w:abstractNum w:abstractNumId="39" w15:restartNumberingAfterBreak="0">
+  <w:abstractNum w:abstractNumId="40" w15:restartNumberingAfterBreak="0">
     <w:nsid w:val="584C29FF"/>
     <w:multiLevelType w:val="multilevel"/>
     <w:tmpl w:val="97E6D56C"/>
@@ -30162,7 +32395,7 @@
       </w:rPr>
     </w:lvl>
   </w:abstractNum>
-  <w:abstractNum w:abstractNumId="40" w15:restartNumberingAfterBreak="0">
+  <w:abstractNum w:abstractNumId="41" w15:restartNumberingAfterBreak="0">
     <w:nsid w:val="62D67779"/>
     <w:multiLevelType w:val="multilevel"/>
     <w:tmpl w:val="5162B1B8"/>
@@ -30311,7 +32544,7 @@
       </w:rPr>
     </w:lvl>
   </w:abstractNum>
-  <w:abstractNum w:abstractNumId="41" w15:restartNumberingAfterBreak="0">
+  <w:abstractNum w:abstractNumId="42" w15:restartNumberingAfterBreak="0">
     <w:nsid w:val="65006D5E"/>
     <w:multiLevelType w:val="multilevel"/>
     <w:tmpl w:val="199A7A68"/>
@@ -30452,7 +32685,7 @@
       </w:rPr>
     </w:lvl>
   </w:abstractNum>
-  <w:abstractNum w:abstractNumId="42" w15:restartNumberingAfterBreak="0">
+  <w:abstractNum w:abstractNumId="43" w15:restartNumberingAfterBreak="0">
     <w:nsid w:val="659C7073"/>
     <w:multiLevelType w:val="multilevel"/>
     <w:tmpl w:val="5DAE72A8"/>
@@ -30601,7 +32834,7 @@
       </w:rPr>
     </w:lvl>
   </w:abstractNum>
-  <w:abstractNum w:abstractNumId="43" w15:restartNumberingAfterBreak="0">
+  <w:abstractNum w:abstractNumId="44" w15:restartNumberingAfterBreak="0">
     <w:nsid w:val="68AE1ADA"/>
     <w:multiLevelType w:val="multilevel"/>
     <w:tmpl w:val="0B283F38"/>
@@ -30720,7 +32953,7 @@
       </w:pPr>
     </w:lvl>
   </w:abstractNum>
-  <w:abstractNum w:abstractNumId="44" w15:restartNumberingAfterBreak="0">
+  <w:abstractNum w:abstractNumId="45" w15:restartNumberingAfterBreak="0">
     <w:nsid w:val="6EB27544"/>
     <w:multiLevelType w:val="multilevel"/>
     <w:tmpl w:val="07E8A230"/>
@@ -30869,7 +33102,7 @@
       </w:rPr>
     </w:lvl>
   </w:abstractNum>
-  <w:abstractNum w:abstractNumId="45" w15:restartNumberingAfterBreak="0">
+  <w:abstractNum w:abstractNumId="46" w15:restartNumberingAfterBreak="0">
     <w:nsid w:val="6F8505D9"/>
     <w:multiLevelType w:val="multilevel"/>
     <w:tmpl w:val="B8D2E28E"/>
@@ -31006,7 +33239,7 @@
       </w:rPr>
     </w:lvl>
   </w:abstractNum>
-  <w:abstractNum w:abstractNumId="46" w15:restartNumberingAfterBreak="0">
+  <w:abstractNum w:abstractNumId="47" w15:restartNumberingAfterBreak="0">
     <w:nsid w:val="71546E52"/>
     <w:multiLevelType w:val="multilevel"/>
     <w:tmpl w:val="1D98AB5A"/>
@@ -31155,7 +33388,7 @@
       </w:rPr>
     </w:lvl>
   </w:abstractNum>
-  <w:abstractNum w:abstractNumId="47" w15:restartNumberingAfterBreak="0">
+  <w:abstractNum w:abstractNumId="48" w15:restartNumberingAfterBreak="0">
     <w:nsid w:val="71883991"/>
     <w:multiLevelType w:val="multilevel"/>
     <w:tmpl w:val="64F6B196"/>
@@ -31304,7 +33537,7 @@
       </w:rPr>
     </w:lvl>
   </w:abstractNum>
-  <w:abstractNum w:abstractNumId="48" w15:restartNumberingAfterBreak="0">
+  <w:abstractNum w:abstractNumId="49" w15:restartNumberingAfterBreak="0">
     <w:nsid w:val="74966C00"/>
     <w:multiLevelType w:val="multilevel"/>
     <w:tmpl w:val="0B621172"/>
@@ -31453,7 +33686,127 @@
       </w:rPr>
     </w:lvl>
   </w:abstractNum>
-  <w:abstractNum w:abstractNumId="49" w15:restartNumberingAfterBreak="0">
+  <w:abstractNum w:abstractNumId="50" w15:restartNumberingAfterBreak="0">
+    <w:nsid w:val="79AA4D87"/>
+    <w:multiLevelType w:val="multilevel"/>
+    <w:tmpl w:val="24BC84AE"/>
+    <w:lvl w:ilvl="0">
+      <w:start w:val="1"/>
+      <w:numFmt w:val="bullet"/>
+      <w:lvlText w:val=""/>
+      <w:lvlJc w:val="left"/>
+      <w:pPr>
+        <w:tabs>
+          <w:tab w:val="num" w:pos="1080"/>
+        </w:tabs>
+        <w:ind w:left="1080" w:hanging="360"/>
+      </w:pPr>
+      <w:rPr>
+        <w:rFonts w:ascii="Symbol" w:hAnsi="Symbol" w:hint="default"/>
+      </w:rPr>
+    </w:lvl>
+    <w:lvl w:ilvl="1">
+      <w:start w:val="1"/>
+      <w:numFmt w:val="bullet"/>
+      <w:lvlText w:val="o"/>
+      <w:lvlJc w:val="left"/>
+      <w:pPr>
+        <w:tabs>
+          <w:tab w:val="num" w:pos="1800"/>
+        </w:tabs>
+        <w:ind w:left="1800" w:hanging="360"/>
+      </w:pPr>
+      <w:rPr>
+        <w:rFonts w:ascii="Courier New" w:hAnsi="Courier New" w:hint="default"/>
+        <w:sz w:val="20"/>
+      </w:rPr>
+    </w:lvl>
+    <w:lvl w:ilvl="2" w:tentative="1">
+      <w:start w:val="1"/>
+      <w:numFmt w:val="decimal"/>
+      <w:lvlText w:val="%3."/>
+      <w:lvlJc w:val="left"/>
+      <w:pPr>
+        <w:tabs>
+          <w:tab w:val="num" w:pos="2520"/>
+        </w:tabs>
+        <w:ind w:left="2520" w:hanging="360"/>
+      </w:pPr>
+    </w:lvl>
+    <w:lvl w:ilvl="3" w:tentative="1">
+      <w:start w:val="1"/>
+      <w:numFmt w:val="decimal"/>
+      <w:lvlText w:val="%4."/>
+      <w:lvlJc w:val="left"/>
+      <w:pPr>
+        <w:tabs>
+          <w:tab w:val="num" w:pos="3240"/>
+        </w:tabs>
+        <w:ind w:left="3240" w:hanging="360"/>
+      </w:pPr>
+    </w:lvl>
+    <w:lvl w:ilvl="4" w:tentative="1">
+      <w:start w:val="1"/>
+      <w:numFmt w:val="decimal"/>
+      <w:lvlText w:val="%5."/>
+      <w:lvlJc w:val="left"/>
+      <w:pPr>
+        <w:tabs>
+          <w:tab w:val="num" w:pos="3960"/>
+        </w:tabs>
+        <w:ind w:left="3960" w:hanging="360"/>
+      </w:pPr>
+    </w:lvl>
+    <w:lvl w:ilvl="5" w:tentative="1">
+      <w:start w:val="1"/>
+      <w:numFmt w:val="decimal"/>
+      <w:lvlText w:val="%6."/>
+      <w:lvlJc w:val="left"/>
+      <w:pPr>
+        <w:tabs>
+          <w:tab w:val="num" w:pos="4680"/>
+        </w:tabs>
+        <w:ind w:left="4680" w:hanging="360"/>
+      </w:pPr>
+    </w:lvl>
+    <w:lvl w:ilvl="6" w:tentative="1">
+      <w:start w:val="1"/>
+      <w:numFmt w:val="decimal"/>
+      <w:lvlText w:val="%7."/>
+      <w:lvlJc w:val="left"/>
+      <w:pPr>
+        <w:tabs>
+          <w:tab w:val="num" w:pos="5400"/>
+        </w:tabs>
+        <w:ind w:left="5400" w:hanging="360"/>
+      </w:pPr>
+    </w:lvl>
+    <w:lvl w:ilvl="7" w:tentative="1">
+      <w:start w:val="1"/>
+      <w:numFmt w:val="decimal"/>
+      <w:lvlText w:val="%8."/>
+      <w:lvlJc w:val="left"/>
+      <w:pPr>
+        <w:tabs>
+          <w:tab w:val="num" w:pos="6120"/>
+        </w:tabs>
+        <w:ind w:left="6120" w:hanging="360"/>
+      </w:pPr>
+    </w:lvl>
+    <w:lvl w:ilvl="8" w:tentative="1">
+      <w:start w:val="1"/>
+      <w:numFmt w:val="decimal"/>
+      <w:lvlText w:val="%9."/>
+      <w:lvlJc w:val="left"/>
+      <w:pPr>
+        <w:tabs>
+          <w:tab w:val="num" w:pos="6840"/>
+        </w:tabs>
+        <w:ind w:left="6840" w:hanging="360"/>
+      </w:pPr>
+    </w:lvl>
+  </w:abstractNum>
+  <w:abstractNum w:abstractNumId="51" w15:restartNumberingAfterBreak="0">
     <w:nsid w:val="79B15BFE"/>
     <w:multiLevelType w:val="hybridMultilevel"/>
     <w:tmpl w:val="C186CE84"/>
@@ -31539,7 +33892,7 @@
       </w:pPr>
     </w:lvl>
   </w:abstractNum>
-  <w:abstractNum w:abstractNumId="50" w15:restartNumberingAfterBreak="0">
+  <w:abstractNum w:abstractNumId="52" w15:restartNumberingAfterBreak="0">
     <w:nsid w:val="79B570F3"/>
     <w:multiLevelType w:val="hybridMultilevel"/>
     <w:tmpl w:val="750CE91A"/>
@@ -31639,7 +33992,7 @@
       </w:pPr>
     </w:lvl>
   </w:abstractNum>
-  <w:abstractNum w:abstractNumId="51" w15:restartNumberingAfterBreak="0">
+  <w:abstractNum w:abstractNumId="53" w15:restartNumberingAfterBreak="0">
     <w:nsid w:val="7D9345D0"/>
     <w:multiLevelType w:val="multilevel"/>
     <w:tmpl w:val="E0EC7082"/>
@@ -31819,7 +34172,7 @@
     <w:abstractNumId w:val="0"/>
   </w:num>
   <w:num w:numId="11" w16cid:durableId="459570761">
-    <w:abstractNumId w:val="46"/>
+    <w:abstractNumId w:val="47"/>
   </w:num>
   <w:num w:numId="12" w16cid:durableId="523373398">
     <w:abstractNumId w:val="10"/>
@@ -31828,7 +34181,7 @@
     <w:abstractNumId w:val="12"/>
   </w:num>
   <w:num w:numId="14" w16cid:durableId="1315061317">
-    <w:abstractNumId w:val="48"/>
+    <w:abstractNumId w:val="49"/>
   </w:num>
   <w:num w:numId="15" w16cid:durableId="651952846">
     <w:abstractNumId w:val="14"/>
@@ -31837,22 +34190,22 @@
     <w:abstractNumId w:val="36"/>
   </w:num>
   <w:num w:numId="17" w16cid:durableId="2010671291">
-    <w:abstractNumId w:val="42"/>
+    <w:abstractNumId w:val="43"/>
   </w:num>
   <w:num w:numId="18" w16cid:durableId="654992139">
     <w:abstractNumId w:val="16"/>
   </w:num>
   <w:num w:numId="19" w16cid:durableId="1466971332">
-    <w:abstractNumId w:val="44"/>
+    <w:abstractNumId w:val="45"/>
   </w:num>
   <w:num w:numId="20" w16cid:durableId="939414097">
-    <w:abstractNumId w:val="47"/>
+    <w:abstractNumId w:val="48"/>
   </w:num>
   <w:num w:numId="21" w16cid:durableId="551238007">
     <w:abstractNumId w:val="26"/>
   </w:num>
   <w:num w:numId="22" w16cid:durableId="670376937">
-    <w:abstractNumId w:val="39"/>
+    <w:abstractNumId w:val="40"/>
   </w:num>
   <w:num w:numId="23" w16cid:durableId="562645758">
     <w:abstractNumId w:val="31"/>
@@ -31861,25 +34214,25 @@
     <w:abstractNumId w:val="30"/>
   </w:num>
   <w:num w:numId="25" w16cid:durableId="1163088678">
-    <w:abstractNumId w:val="40"/>
+    <w:abstractNumId w:val="41"/>
   </w:num>
   <w:num w:numId="26" w16cid:durableId="81488157">
-    <w:abstractNumId w:val="23"/>
+    <w:abstractNumId w:val="24"/>
   </w:num>
   <w:num w:numId="27" w16cid:durableId="1300384025">
-    <w:abstractNumId w:val="51"/>
+    <w:abstractNumId w:val="53"/>
   </w:num>
   <w:num w:numId="28" w16cid:durableId="256718262">
     <w:abstractNumId w:val="17"/>
   </w:num>
   <w:num w:numId="29" w16cid:durableId="204563994">
-    <w:abstractNumId w:val="21"/>
+    <w:abstractNumId w:val="23"/>
   </w:num>
   <w:num w:numId="30" w16cid:durableId="933366559">
     <w:abstractNumId w:val="29"/>
   </w:num>
   <w:num w:numId="31" w16cid:durableId="1833721120">
-    <w:abstractNumId w:val="38"/>
+    <w:abstractNumId w:val="39"/>
   </w:num>
   <w:num w:numId="32" w16cid:durableId="537933389">
     <w:abstractNumId w:val="27"/>
@@ -31891,13 +34244,13 @@
     <w:abstractNumId w:val="37"/>
   </w:num>
   <w:num w:numId="35" w16cid:durableId="1891072915">
-    <w:abstractNumId w:val="49"/>
+    <w:abstractNumId w:val="51"/>
   </w:num>
   <w:num w:numId="36" w16cid:durableId="990984623">
     <w:abstractNumId w:val="19"/>
   </w:num>
   <w:num w:numId="37" w16cid:durableId="2042584119">
-    <w:abstractNumId w:val="43"/>
+    <w:abstractNumId w:val="44"/>
   </w:num>
   <w:num w:numId="38" w16cid:durableId="434399189">
     <w:abstractNumId w:val="35"/>
@@ -31912,7 +34265,7 @@
     <w:abstractNumId w:val="11"/>
   </w:num>
   <w:num w:numId="42" w16cid:durableId="1550338594">
-    <w:abstractNumId w:val="50"/>
+    <w:abstractNumId w:val="52"/>
   </w:num>
   <w:num w:numId="43" w16cid:durableId="91292138">
     <w:abstractNumId w:val="34"/>
@@ -31924,16 +34277,13 @@
     <w:abstractNumId w:val="15"/>
   </w:num>
   <w:num w:numId="46" w16cid:durableId="352271556">
-    <w:abstractNumId w:val="45"/>
+    <w:abstractNumId w:val="46"/>
   </w:num>
   <w:num w:numId="47" w16cid:durableId="578104300">
     <w:abstractNumId w:val="20"/>
   </w:num>
-  <w:num w:numId="48" w16cid:durableId="389040326">
-    <w:abstractNumId w:val="41"/>
-  </w:num>
-  <w:num w:numId="49" w16cid:durableId="737214976">
-    <w:abstractNumId w:val="41"/>
+  <w:num w:numId="48" w16cid:durableId="1370646076">
+    <w:abstractNumId w:val="42"/>
     <w:lvlOverride w:ilvl="0">
       <w:lvl w:ilvl="0">
         <w:start w:val="1"/>
@@ -31958,7 +34308,7 @@
         <w:lvlText w:val="%2"/>
         <w:lvlJc w:val="right"/>
         <w:pPr>
-          <w:ind w:left="357" w:firstLine="890"/>
+          <w:ind w:left="357" w:firstLine="550"/>
         </w:pPr>
         <w:rPr>
           <w:rFonts w:hint="default"/>
@@ -32089,333 +34439,25 @@
       </w:lvl>
     </w:lvlOverride>
   </w:num>
-  <w:num w:numId="50" w16cid:durableId="763569601">
-    <w:abstractNumId w:val="41"/>
-    <w:lvlOverride w:ilvl="0">
-      <w:lvl w:ilvl="0">
-        <w:start w:val="1"/>
-        <w:numFmt w:val="decimal"/>
-        <w:lvlText w:val="%1."/>
-        <w:lvlJc w:val="left"/>
-        <w:pPr>
-          <w:tabs>
-            <w:tab w:val="num" w:pos="720"/>
-          </w:tabs>
-          <w:ind w:left="720" w:hanging="360"/>
-        </w:pPr>
-        <w:rPr>
-          <w:rFonts w:hint="default"/>
-        </w:rPr>
-      </w:lvl>
-    </w:lvlOverride>
-    <w:lvlOverride w:ilvl="1">
-      <w:lvl w:ilvl="1">
-        <w:start w:val="1"/>
-        <w:numFmt w:val="lowerLetter"/>
-        <w:lvlText w:val="%2"/>
-        <w:lvlJc w:val="right"/>
-        <w:pPr>
-          <w:ind w:left="357" w:firstLine="720"/>
-        </w:pPr>
-        <w:rPr>
-          <w:rFonts w:hint="default"/>
-          <w:i w:val="0"/>
-          <w:iCs/>
-          <w:color w:val="auto"/>
-        </w:rPr>
-      </w:lvl>
-    </w:lvlOverride>
-    <w:lvlOverride w:ilvl="2">
-      <w:lvl w:ilvl="2">
-        <w:start w:val="1"/>
-        <w:numFmt w:val="bullet"/>
-        <w:lvlText w:val=""/>
-        <w:lvlJc w:val="left"/>
-        <w:pPr>
-          <w:tabs>
-            <w:tab w:val="num" w:pos="2160"/>
-          </w:tabs>
-          <w:ind w:left="2160" w:hanging="360"/>
-        </w:pPr>
-        <w:rPr>
-          <w:rFonts w:ascii="Wingdings" w:hAnsi="Wingdings" w:hint="default"/>
-          <w:sz w:val="20"/>
-        </w:rPr>
-      </w:lvl>
-    </w:lvlOverride>
-    <w:lvlOverride w:ilvl="3">
-      <w:lvl w:ilvl="3">
-        <w:start w:val="1"/>
-        <w:numFmt w:val="decimal"/>
-        <w:lvlText w:val="%4."/>
-        <w:lvlJc w:val="left"/>
-        <w:pPr>
-          <w:tabs>
-            <w:tab w:val="num" w:pos="2880"/>
-          </w:tabs>
-          <w:ind w:left="2880" w:hanging="360"/>
-        </w:pPr>
-        <w:rPr>
-          <w:rFonts w:hint="default"/>
-        </w:rPr>
-      </w:lvl>
-    </w:lvlOverride>
-    <w:lvlOverride w:ilvl="4">
-      <w:lvl w:ilvl="4">
-        <w:start w:val="1"/>
-        <w:numFmt w:val="decimal"/>
-        <w:lvlText w:val="%5."/>
-        <w:lvlJc w:val="left"/>
-        <w:pPr>
-          <w:tabs>
-            <w:tab w:val="num" w:pos="3600"/>
-          </w:tabs>
-          <w:ind w:left="3600" w:hanging="360"/>
-        </w:pPr>
-        <w:rPr>
-          <w:rFonts w:hint="default"/>
-        </w:rPr>
-      </w:lvl>
-    </w:lvlOverride>
-    <w:lvlOverride w:ilvl="5">
-      <w:lvl w:ilvl="5">
-        <w:start w:val="1"/>
-        <w:numFmt w:val="decimal"/>
-        <w:lvlText w:val="%6."/>
-        <w:lvlJc w:val="left"/>
-        <w:pPr>
-          <w:tabs>
-            <w:tab w:val="num" w:pos="4320"/>
-          </w:tabs>
-          <w:ind w:left="4320" w:hanging="360"/>
-        </w:pPr>
-        <w:rPr>
-          <w:rFonts w:hint="default"/>
-        </w:rPr>
-      </w:lvl>
-    </w:lvlOverride>
-    <w:lvlOverride w:ilvl="6">
-      <w:lvl w:ilvl="6">
-        <w:start w:val="1"/>
-        <w:numFmt w:val="decimal"/>
-        <w:lvlText w:val="%7."/>
-        <w:lvlJc w:val="left"/>
-        <w:pPr>
-          <w:tabs>
-            <w:tab w:val="num" w:pos="5040"/>
-          </w:tabs>
-          <w:ind w:left="5040" w:hanging="360"/>
-        </w:pPr>
-        <w:rPr>
-          <w:rFonts w:hint="default"/>
-        </w:rPr>
-      </w:lvl>
-    </w:lvlOverride>
-    <w:lvlOverride w:ilvl="7">
-      <w:lvl w:ilvl="7">
-        <w:start w:val="1"/>
-        <w:numFmt w:val="decimal"/>
-        <w:lvlText w:val="%8."/>
-        <w:lvlJc w:val="left"/>
-        <w:pPr>
-          <w:tabs>
-            <w:tab w:val="num" w:pos="5760"/>
-          </w:tabs>
-          <w:ind w:left="5760" w:hanging="360"/>
-        </w:pPr>
-        <w:rPr>
-          <w:rFonts w:hint="default"/>
-        </w:rPr>
-      </w:lvl>
-    </w:lvlOverride>
-    <w:lvlOverride w:ilvl="8">
-      <w:lvl w:ilvl="8">
-        <w:start w:val="1"/>
-        <w:numFmt w:val="decimal"/>
-        <w:lvlText w:val="%9."/>
-        <w:lvlJc w:val="left"/>
-        <w:pPr>
-          <w:tabs>
-            <w:tab w:val="num" w:pos="6480"/>
-          </w:tabs>
-          <w:ind w:left="6480" w:hanging="360"/>
-        </w:pPr>
-        <w:rPr>
-          <w:rFonts w:hint="default"/>
-        </w:rPr>
-      </w:lvl>
-    </w:lvlOverride>
+  <w:num w:numId="49" w16cid:durableId="784160094">
+    <w:abstractNumId w:val="25"/>
   </w:num>
-  <w:num w:numId="51" w16cid:durableId="1370646076">
-    <w:abstractNumId w:val="41"/>
-    <w:lvlOverride w:ilvl="0">
-      <w:lvl w:ilvl="0">
-        <w:start w:val="1"/>
-        <w:numFmt w:val="decimal"/>
-        <w:lvlText w:val="%1."/>
-        <w:lvlJc w:val="left"/>
-        <w:pPr>
-          <w:tabs>
-            <w:tab w:val="num" w:pos="720"/>
-          </w:tabs>
-          <w:ind w:left="720" w:hanging="360"/>
-        </w:pPr>
-        <w:rPr>
-          <w:rFonts w:hint="default"/>
-        </w:rPr>
-      </w:lvl>
-    </w:lvlOverride>
-    <w:lvlOverride w:ilvl="1">
-      <w:lvl w:ilvl="1">
-        <w:start w:val="1"/>
-        <w:numFmt w:val="lowerLetter"/>
-        <w:lvlText w:val="%2"/>
-        <w:lvlJc w:val="right"/>
-        <w:pPr>
-          <w:ind w:left="357" w:firstLine="550"/>
-        </w:pPr>
-        <w:rPr>
-          <w:rFonts w:hint="default"/>
-          <w:i w:val="0"/>
-          <w:iCs/>
-          <w:color w:val="auto"/>
-        </w:rPr>
-      </w:lvl>
-    </w:lvlOverride>
-    <w:lvlOverride w:ilvl="2">
-      <w:lvl w:ilvl="2">
-        <w:start w:val="1"/>
-        <w:numFmt w:val="bullet"/>
-        <w:lvlText w:val=""/>
-        <w:lvlJc w:val="left"/>
-        <w:pPr>
-          <w:tabs>
-            <w:tab w:val="num" w:pos="2160"/>
-          </w:tabs>
-          <w:ind w:left="2160" w:hanging="360"/>
-        </w:pPr>
-        <w:rPr>
-          <w:rFonts w:ascii="Wingdings" w:hAnsi="Wingdings" w:hint="default"/>
-          <w:sz w:val="20"/>
-        </w:rPr>
-      </w:lvl>
-    </w:lvlOverride>
-    <w:lvlOverride w:ilvl="3">
-      <w:lvl w:ilvl="3">
-        <w:start w:val="1"/>
-        <w:numFmt w:val="decimal"/>
-        <w:lvlText w:val="%4."/>
-        <w:lvlJc w:val="left"/>
-        <w:pPr>
-          <w:tabs>
-            <w:tab w:val="num" w:pos="2880"/>
-          </w:tabs>
-          <w:ind w:left="2880" w:hanging="360"/>
-        </w:pPr>
-        <w:rPr>
-          <w:rFonts w:hint="default"/>
-        </w:rPr>
-      </w:lvl>
-    </w:lvlOverride>
-    <w:lvlOverride w:ilvl="4">
-      <w:lvl w:ilvl="4">
-        <w:start w:val="1"/>
-        <w:numFmt w:val="decimal"/>
-        <w:lvlText w:val="%5."/>
-        <w:lvlJc w:val="left"/>
-        <w:pPr>
-          <w:tabs>
-            <w:tab w:val="num" w:pos="3600"/>
-          </w:tabs>
-          <w:ind w:left="3600" w:hanging="360"/>
-        </w:pPr>
-        <w:rPr>
-          <w:rFonts w:hint="default"/>
-        </w:rPr>
-      </w:lvl>
-    </w:lvlOverride>
-    <w:lvlOverride w:ilvl="5">
-      <w:lvl w:ilvl="5">
-        <w:start w:val="1"/>
-        <w:numFmt w:val="decimal"/>
-        <w:lvlText w:val="%6."/>
-        <w:lvlJc w:val="left"/>
-        <w:pPr>
-          <w:tabs>
-            <w:tab w:val="num" w:pos="4320"/>
-          </w:tabs>
-          <w:ind w:left="4320" w:hanging="360"/>
-        </w:pPr>
-        <w:rPr>
-          <w:rFonts w:hint="default"/>
-        </w:rPr>
-      </w:lvl>
-    </w:lvlOverride>
-    <w:lvlOverride w:ilvl="6">
-      <w:lvl w:ilvl="6">
-        <w:start w:val="1"/>
-        <w:numFmt w:val="decimal"/>
-        <w:lvlText w:val="%7."/>
-        <w:lvlJc w:val="left"/>
-        <w:pPr>
-          <w:tabs>
-            <w:tab w:val="num" w:pos="5040"/>
-          </w:tabs>
-          <w:ind w:left="5040" w:hanging="360"/>
-        </w:pPr>
-        <w:rPr>
-          <w:rFonts w:hint="default"/>
-        </w:rPr>
-      </w:lvl>
-    </w:lvlOverride>
-    <w:lvlOverride w:ilvl="7">
-      <w:lvl w:ilvl="7">
-        <w:start w:val="1"/>
-        <w:numFmt w:val="decimal"/>
-        <w:lvlText w:val="%8."/>
-        <w:lvlJc w:val="left"/>
-        <w:pPr>
-          <w:tabs>
-            <w:tab w:val="num" w:pos="5760"/>
-          </w:tabs>
-          <w:ind w:left="5760" w:hanging="360"/>
-        </w:pPr>
-        <w:rPr>
-          <w:rFonts w:hint="default"/>
-        </w:rPr>
-      </w:lvl>
-    </w:lvlOverride>
-    <w:lvlOverride w:ilvl="8">
-      <w:lvl w:ilvl="8">
-        <w:start w:val="1"/>
-        <w:numFmt w:val="decimal"/>
-        <w:lvlText w:val="%9."/>
-        <w:lvlJc w:val="left"/>
-        <w:pPr>
-          <w:tabs>
-            <w:tab w:val="num" w:pos="6480"/>
-          </w:tabs>
-          <w:ind w:left="6480" w:hanging="360"/>
-        </w:pPr>
-        <w:rPr>
-          <w:rFonts w:hint="default"/>
-        </w:rPr>
-      </w:lvl>
-    </w:lvlOverride>
+  <w:num w:numId="50" w16cid:durableId="1536851790">
+    <w:abstractNumId w:val="21"/>
   </w:num>
-  <w:num w:numId="52" w16cid:durableId="761070430">
+  <w:num w:numId="51" w16cid:durableId="2015836096">
+    <w:abstractNumId w:val="50"/>
+  </w:num>
+  <w:num w:numId="52" w16cid:durableId="2095734419">
+    <w:abstractNumId w:val="22"/>
+  </w:num>
+  <w:num w:numId="53" w16cid:durableId="41683737">
+    <w:abstractNumId w:val="38"/>
+  </w:num>
+  <w:num w:numId="54" w16cid:durableId="580523777">
     <w:abstractNumId w:val="32"/>
   </w:num>
-  <w:num w:numId="53" w16cid:durableId="1164125379">
-    <w:abstractNumId w:val="22"/>
-  </w:num>
-  <w:num w:numId="54" w16cid:durableId="392192884">
-    <w:abstractNumId w:val="24"/>
-  </w:num>
-  <w:num w:numId="55" w16cid:durableId="784160094">
-    <w:abstractNumId w:val="25"/>
-  </w:num>
-  <w:numIdMacAtCleanup w:val="48"/>
+  <w:numIdMacAtCleanup w:val="53"/>
 </w:numbering>
 </file>
 
@@ -32818,7 +34860,7 @@
   <w:style w:type="paragraph" w:default="1" w:styleId="Normal">
     <w:name w:val="Normal"/>
     <w:qFormat/>
-    <w:rsid w:val="00C83A45"/>
+    <w:rsid w:val="007E4194"/>
     <w:pPr>
       <w:spacing w:after="0" w:line="0" w:lineRule="atLeast"/>
       <w:contextualSpacing/>

</xml_diff>